<commit_message>
Update to use all pair-key data
Updated to save pair_key data and use correct room temp settings in sensors and climate
</commit_message>
<xml_diff>
--- a/Documentation/SmartTemp TCP Protocol V2.docx
+++ b/Documentation/SmartTemp TCP Protocol V2.docx
@@ -17,7 +17,6 @@
           <w14:ligatures w14:val="none"/>
         </w:rPr>
       </w:pPr>
-      <w:proofErr w:type="spellStart"/>
       <w:r>
         <w:rPr>
           <w:rFonts w:ascii="Times New Roman" w:eastAsia="Times New Roman" w:hAnsi="Times New Roman" w:cs="Times New Roman"/>
@@ -29,9 +28,8 @@
           <w:lang w:eastAsia="en-GB"/>
           <w14:ligatures w14:val="none"/>
         </w:rPr>
-        <w:t>SmartTemp</w:t>
-      </w:r>
-      <w:proofErr w:type="spellEnd"/>
+        <w:t>SmartTemp TCP Protocol</w:t>
+      </w:r>
       <w:r>
         <w:rPr>
           <w:rFonts w:ascii="Times New Roman" w:eastAsia="Times New Roman" w:hAnsi="Times New Roman" w:cs="Times New Roman"/>
@@ -43,7 +41,7 @@
           <w:lang w:eastAsia="en-GB"/>
           <w14:ligatures w14:val="none"/>
         </w:rPr>
-        <w:t xml:space="preserve"> TCP Protocol</w:t>
+        <w:t xml:space="preserve"> </w:t>
       </w:r>
       <w:r>
         <w:rPr>
@@ -56,7 +54,7 @@
           <w:lang w:eastAsia="en-GB"/>
           <w14:ligatures w14:val="none"/>
         </w:rPr>
-        <w:t xml:space="preserve"> </w:t>
+        <w:t>(Reverse</w:t>
       </w:r>
       <w:r>
         <w:rPr>
@@ -69,19 +67,6 @@
           <w:lang w:eastAsia="en-GB"/>
           <w14:ligatures w14:val="none"/>
         </w:rPr>
-        <w:t>(Reverse</w:t>
-      </w:r>
-      <w:r>
-        <w:rPr>
-          <w:rFonts w:ascii="Times New Roman" w:eastAsia="Times New Roman" w:hAnsi="Times New Roman" w:cs="Times New Roman"/>
-          <w:b/>
-          <w:bCs/>
-          <w:kern w:val="36"/>
-          <w:sz w:val="44"/>
-          <w:szCs w:val="44"/>
-          <w:lang w:eastAsia="en-GB"/>
-          <w14:ligatures w14:val="none"/>
-        </w:rPr>
         <w:noBreakHyphen/>
         <w:t>Engineered)</w:t>
       </w:r>
@@ -390,19 +375,9 @@
           <w:noProof/>
           <w:kern w:val="0"/>
           <w:lang w:eastAsia="en-GB"/>
-          <w14:ligatures w14:val="none"/>
-        </w:rPr>
-      </w:r>
-      <w:r>
-        <w:rPr>
-          <w:rFonts w:ascii="Times New Roman" w:eastAsia="Times New Roman" w:hAnsi="Times New Roman" w:cs="Times New Roman"/>
-          <w:noProof/>
-          <w:kern w:val="0"/>
-          <w:lang w:eastAsia="en-GB"/>
-          <w14:ligatures w14:val="none"/>
-        </w:rPr>
-        <w:pict w14:anchorId="582278FD">
-          <v:rect id="_x0000_i1025" alt="" style="width:451.3pt;height:.05pt;mso-width-percent:0;mso-height-percent:0;mso-width-percent:0;mso-height-percent:0" o:hralign="center" o:hrstd="t" o:hr="t" fillcolor="#a0a0a0" stroked="f"/>
+        </w:rPr>
+        <w:pict w14:anchorId="5FB3CBD3">
+          <v:rect id="_x0000_i1044" alt="" style="width:451.3pt;height:.05pt;mso-width-percent:0;mso-height-percent:0;mso-width-percent:0;mso-height-percent:0" o:hralign="center" o:hrstd="t" o:hr="t" fillcolor="#a0a0a0" stroked="f"/>
         </w:pict>
       </w:r>
     </w:p>
@@ -445,25 +420,14 @@
           <w14:ligatures w14:val="none"/>
         </w:rPr>
       </w:pPr>
-      <w:proofErr w:type="spellStart"/>
-      <w:r>
-        <w:rPr>
-          <w:rFonts w:ascii="Times New Roman" w:eastAsia="Times New Roman" w:hAnsi="Times New Roman" w:cs="Times New Roman"/>
-          <w:kern w:val="0"/>
-          <w:lang w:eastAsia="en-GB"/>
-          <w14:ligatures w14:val="none"/>
-        </w:rPr>
-        <w:t>SmartTemp</w:t>
-      </w:r>
-      <w:proofErr w:type="spellEnd"/>
-      <w:r>
-        <w:rPr>
-          <w:rFonts w:ascii="Times New Roman" w:eastAsia="Times New Roman" w:hAnsi="Times New Roman" w:cs="Times New Roman"/>
-          <w:kern w:val="0"/>
-          <w:lang w:eastAsia="en-GB"/>
-          <w14:ligatures w14:val="none"/>
-        </w:rPr>
-        <w:t xml:space="preserve"> controllers communicate with a cloud service using a </w:t>
+      <w:r>
+        <w:rPr>
+          <w:rFonts w:ascii="Times New Roman" w:eastAsia="Times New Roman" w:hAnsi="Times New Roman" w:cs="Times New Roman"/>
+          <w:kern w:val="0"/>
+          <w:lang w:eastAsia="en-GB"/>
+          <w14:ligatures w14:val="none"/>
+        </w:rPr>
+        <w:t xml:space="preserve">SmartTemp controllers communicate with a cloud service using a </w:t>
       </w:r>
       <w:r>
         <w:rPr>
@@ -665,19 +629,9 @@
           <w:noProof/>
           <w:kern w:val="0"/>
           <w:lang w:eastAsia="en-GB"/>
-          <w14:ligatures w14:val="none"/>
-        </w:rPr>
-      </w:r>
-      <w:r>
-        <w:rPr>
-          <w:rFonts w:ascii="Times New Roman" w:eastAsia="Times New Roman" w:hAnsi="Times New Roman" w:cs="Times New Roman"/>
-          <w:noProof/>
-          <w:kern w:val="0"/>
-          <w:lang w:eastAsia="en-GB"/>
-          <w14:ligatures w14:val="none"/>
-        </w:rPr>
-        <w:pict w14:anchorId="3D886424">
-          <v:rect id="_x0000_i1026" alt="" style="width:451.3pt;height:.05pt;mso-width-percent:0;mso-height-percent:0;mso-width-percent:0;mso-height-percent:0" o:hralign="center" o:hrstd="t" o:hr="t" fillcolor="#a0a0a0" stroked="f"/>
+        </w:rPr>
+        <w:pict w14:anchorId="35EDA584">
+          <v:rect id="_x0000_i1043" alt="" style="width:451.3pt;height:.05pt;mso-width-percent:0;mso-height-percent:0;mso-width-percent:0;mso-height-percent:0" o:hralign="center" o:hrstd="t" o:hr="t" fillcolor="#a0a0a0" stroked="f"/>
         </w:pict>
       </w:r>
     </w:p>
@@ -886,19 +840,9 @@
           <w:noProof/>
           <w:kern w:val="0"/>
           <w:lang w:eastAsia="en-GB"/>
-          <w14:ligatures w14:val="none"/>
-        </w:rPr>
-      </w:r>
-      <w:r>
-        <w:rPr>
-          <w:rFonts w:ascii="Times New Roman" w:eastAsia="Times New Roman" w:hAnsi="Times New Roman" w:cs="Times New Roman"/>
-          <w:noProof/>
-          <w:kern w:val="0"/>
-          <w:lang w:eastAsia="en-GB"/>
-          <w14:ligatures w14:val="none"/>
-        </w:rPr>
-        <w:pict w14:anchorId="347697F0">
-          <v:rect id="_x0000_i1027" alt="" style="width:451.3pt;height:.05pt;mso-width-percent:0;mso-height-percent:0;mso-width-percent:0;mso-height-percent:0" o:hralign="center" o:hrstd="t" o:hr="t" fillcolor="#a0a0a0" stroked="f"/>
+        </w:rPr>
+        <w:pict w14:anchorId="0300697C">
+          <v:rect id="_x0000_i1042" alt="" style="width:451.3pt;height:.05pt;mso-width-percent:0;mso-height-percent:0;mso-width-percent:0;mso-height-percent:0" o:hralign="center" o:hrstd="t" o:hr="t" fillcolor="#a0a0a0" stroked="f"/>
         </w:pict>
       </w:r>
     </w:p>
@@ -1269,19 +1213,9 @@
           <w:noProof/>
           <w:kern w:val="0"/>
           <w:lang w:eastAsia="en-GB"/>
-          <w14:ligatures w14:val="none"/>
-        </w:rPr>
-      </w:r>
-      <w:r>
-        <w:rPr>
-          <w:rFonts w:ascii="Times New Roman" w:eastAsia="Times New Roman" w:hAnsi="Times New Roman" w:cs="Times New Roman"/>
-          <w:noProof/>
-          <w:kern w:val="0"/>
-          <w:lang w:eastAsia="en-GB"/>
-          <w14:ligatures w14:val="none"/>
-        </w:rPr>
-        <w:pict w14:anchorId="44AFAA61">
-          <v:rect id="_x0000_i1028" alt="" style="width:451.3pt;height:.05pt;mso-width-percent:0;mso-height-percent:0;mso-width-percent:0;mso-height-percent:0" o:hralign="center" o:hrstd="t" o:hr="t" fillcolor="#a0a0a0" stroked="f"/>
+        </w:rPr>
+        <w:pict w14:anchorId="5162476E">
+          <v:rect id="_x0000_i1041" alt="" style="width:451.3pt;height:.05pt;mso-width-percent:0;mso-height-percent:0;mso-width-percent:0;mso-height-percent:0" o:hralign="center" o:hrstd="t" o:hr="t" fillcolor="#a0a0a0" stroked="f"/>
         </w:pict>
       </w:r>
     </w:p>
@@ -1566,19 +1500,9 @@
           <w:noProof/>
           <w:kern w:val="0"/>
           <w:lang w:eastAsia="en-GB"/>
-          <w14:ligatures w14:val="none"/>
-        </w:rPr>
-      </w:r>
-      <w:r>
-        <w:rPr>
-          <w:rFonts w:ascii="Times New Roman" w:eastAsia="Times New Roman" w:hAnsi="Times New Roman" w:cs="Times New Roman"/>
-          <w:noProof/>
-          <w:kern w:val="0"/>
-          <w:lang w:eastAsia="en-GB"/>
-          <w14:ligatures w14:val="none"/>
-        </w:rPr>
-        <w:pict w14:anchorId="22281D10">
-          <v:rect id="_x0000_i1029" alt="" style="width:451.3pt;height:.05pt;mso-width-percent:0;mso-height-percent:0;mso-width-percent:0;mso-height-percent:0" o:hralign="center" o:hrstd="t" o:hr="t" fillcolor="#a0a0a0" stroked="f"/>
+        </w:rPr>
+        <w:pict w14:anchorId="030A439B">
+          <v:rect id="_x0000_i1040" alt="" style="width:451.3pt;height:.05pt;mso-width-percent:0;mso-height-percent:0;mso-width-percent:0;mso-height-percent:0" o:hralign="center" o:hrstd="t" o:hr="t" fillcolor="#a0a0a0" stroked="f"/>
         </w:pict>
       </w:r>
     </w:p>
@@ -1813,19 +1737,9 @@
           <w:noProof/>
           <w:kern w:val="0"/>
           <w:lang w:eastAsia="en-GB"/>
-          <w14:ligatures w14:val="none"/>
-        </w:rPr>
-      </w:r>
-      <w:r>
-        <w:rPr>
-          <w:rFonts w:ascii="Times New Roman" w:eastAsia="Times New Roman" w:hAnsi="Times New Roman" w:cs="Times New Roman"/>
-          <w:noProof/>
-          <w:kern w:val="0"/>
-          <w:lang w:eastAsia="en-GB"/>
-          <w14:ligatures w14:val="none"/>
-        </w:rPr>
-        <w:pict w14:anchorId="77EFAFC6">
-          <v:rect id="_x0000_i1030" alt="" style="width:451.3pt;height:.05pt;mso-width-percent:0;mso-height-percent:0;mso-width-percent:0;mso-height-percent:0" o:hralign="center" o:hrstd="t" o:hr="t" fillcolor="#a0a0a0" stroked="f"/>
+        </w:rPr>
+        <w:pict w14:anchorId="12841CE4">
+          <v:rect id="_x0000_i1039" alt="" style="width:451.3pt;height:.05pt;mso-width-percent:0;mso-height-percent:0;mso-width-percent:0;mso-height-percent:0" o:hralign="center" o:hrstd="t" o:hr="t" fillcolor="#a0a0a0" stroked="f"/>
         </w:pict>
       </w:r>
     </w:p>
@@ -2083,7 +1997,6 @@
                 <w14:ligatures w14:val="none"/>
               </w:rPr>
             </w:pPr>
-            <w:proofErr w:type="spellStart"/>
             <w:r>
               <w:rPr>
                 <w:rFonts w:ascii="Times New Roman" w:eastAsia="Times New Roman" w:hAnsi="Times New Roman" w:cs="Times New Roman"/>
@@ -2093,7 +2006,6 @@
               </w:rPr>
               <w:t>MsgID</w:t>
             </w:r>
-            <w:proofErr w:type="spellEnd"/>
           </w:p>
         </w:tc>
         <w:tc>
@@ -2354,7 +2266,6 @@
                 <w14:ligatures w14:val="none"/>
               </w:rPr>
             </w:pPr>
-            <w:proofErr w:type="spellStart"/>
             <w:r>
               <w:rPr>
                 <w:rFonts w:ascii="Times New Roman" w:eastAsia="Times New Roman" w:hAnsi="Times New Roman" w:cs="Times New Roman"/>
@@ -2364,7 +2275,6 @@
               </w:rPr>
               <w:t>equip_mode</w:t>
             </w:r>
-            <w:proofErr w:type="spellEnd"/>
           </w:p>
         </w:tc>
         <w:tc>
@@ -2438,19 +2348,9 @@
           <w:noProof/>
           <w:kern w:val="0"/>
           <w:lang w:eastAsia="en-GB"/>
-          <w14:ligatures w14:val="none"/>
-        </w:rPr>
-      </w:r>
-      <w:r>
-        <w:rPr>
-          <w:rFonts w:ascii="Times New Roman" w:eastAsia="Times New Roman" w:hAnsi="Times New Roman" w:cs="Times New Roman"/>
-          <w:noProof/>
-          <w:kern w:val="0"/>
-          <w:lang w:eastAsia="en-GB"/>
-          <w14:ligatures w14:val="none"/>
-        </w:rPr>
-        <w:pict w14:anchorId="41372B47">
-          <v:rect id="_x0000_i1031" alt="" style="width:451.3pt;height:.05pt;mso-width-percent:0;mso-height-percent:0;mso-width-percent:0;mso-height-percent:0" o:hralign="center" o:hrstd="t" o:hr="t" fillcolor="#a0a0a0" stroked="f"/>
+        </w:rPr>
+        <w:pict w14:anchorId="1DB949F0">
+          <v:rect id="_x0000_i1038" alt="" style="width:451.3pt;height:.05pt;mso-width-percent:0;mso-height-percent:0;mso-width-percent:0;mso-height-percent:0" o:hralign="center" o:hrstd="t" o:hr="t" fillcolor="#a0a0a0" stroked="f"/>
         </w:pict>
       </w:r>
     </w:p>
@@ -2480,35 +2380,7 @@
           <w:lang w:eastAsia="en-GB"/>
           <w14:ligatures w14:val="none"/>
         </w:rPr>
-        <w:t>6. Operating Modes (</w:t>
-      </w:r>
-      <w:proofErr w:type="spellStart"/>
-      <w:r>
-        <w:rPr>
-          <w:rFonts w:ascii="Times New Roman" w:eastAsia="Times New Roman" w:hAnsi="Times New Roman" w:cs="Times New Roman"/>
-          <w:b/>
-          <w:bCs/>
-          <w:kern w:val="0"/>
-          <w:sz w:val="36"/>
-          <w:szCs w:val="36"/>
-          <w:lang w:eastAsia="en-GB"/>
-          <w14:ligatures w14:val="none"/>
-        </w:rPr>
-        <w:t>equip_mode</w:t>
-      </w:r>
-      <w:proofErr w:type="spellEnd"/>
-      <w:r>
-        <w:rPr>
-          <w:rFonts w:ascii="Times New Roman" w:eastAsia="Times New Roman" w:hAnsi="Times New Roman" w:cs="Times New Roman"/>
-          <w:b/>
-          <w:bCs/>
-          <w:kern w:val="0"/>
-          <w:sz w:val="36"/>
-          <w:szCs w:val="36"/>
-          <w:lang w:eastAsia="en-GB"/>
-          <w14:ligatures w14:val="none"/>
-        </w:rPr>
-        <w:t>)</w:t>
+        <w:t>6. Operating Modes (equip_mode)</w:t>
       </w:r>
     </w:p>
     <w:tbl>
@@ -2869,19 +2741,9 @@
           <w:noProof/>
           <w:kern w:val="0"/>
           <w:lang w:eastAsia="en-GB"/>
-          <w14:ligatures w14:val="none"/>
-        </w:rPr>
-      </w:r>
-      <w:r>
-        <w:rPr>
-          <w:rFonts w:ascii="Times New Roman" w:eastAsia="Times New Roman" w:hAnsi="Times New Roman" w:cs="Times New Roman"/>
-          <w:noProof/>
-          <w:kern w:val="0"/>
-          <w:lang w:eastAsia="en-GB"/>
-          <w14:ligatures w14:val="none"/>
-        </w:rPr>
-        <w:pict w14:anchorId="7C840F4B">
-          <v:rect id="_x0000_i1032" alt="" style="width:451.3pt;height:.05pt;mso-width-percent:0;mso-height-percent:0;mso-width-percent:0;mso-height-percent:0" o:hralign="center" o:hrstd="t" o:hr="t" fillcolor="#a0a0a0" stroked="f"/>
+        </w:rPr>
+        <w:pict w14:anchorId="79816052">
+          <v:rect id="_x0000_i1037" alt="" style="width:451.3pt;height:.05pt;mso-width-percent:0;mso-height-percent:0;mso-width-percent:0;mso-height-percent:0" o:hralign="center" o:hrstd="t" o:hr="t" fillcolor="#a0a0a0" stroked="f"/>
         </w:pict>
       </w:r>
     </w:p>
@@ -3098,44 +2960,7 @@
           <w:lang w:eastAsia="en-GB"/>
           <w14:ligatures w14:val="none"/>
         </w:rPr>
-        <w:t xml:space="preserve">  "</w:t>
-      </w:r>
-      <w:proofErr w:type="spellStart"/>
-      <w:proofErr w:type="gramStart"/>
-      <w:r>
-        <w:rPr>
-          <w:rFonts w:ascii="Courier New" w:eastAsia="Times New Roman" w:hAnsi="Courier New" w:cs="Courier New"/>
-          <w:kern w:val="0"/>
-          <w:sz w:val="20"/>
-          <w:szCs w:val="20"/>
-          <w:lang w:eastAsia="en-GB"/>
-          <w14:ligatures w14:val="none"/>
-        </w:rPr>
-        <w:t>equip</w:t>
-      </w:r>
-      <w:proofErr w:type="gramEnd"/>
-      <w:r>
-        <w:rPr>
-          <w:rFonts w:ascii="Courier New" w:eastAsia="Times New Roman" w:hAnsi="Courier New" w:cs="Courier New"/>
-          <w:kern w:val="0"/>
-          <w:sz w:val="20"/>
-          <w:szCs w:val="20"/>
-          <w:lang w:eastAsia="en-GB"/>
-          <w14:ligatures w14:val="none"/>
-        </w:rPr>
-        <w:t>_mode</w:t>
-      </w:r>
-      <w:proofErr w:type="spellEnd"/>
-      <w:r>
-        <w:rPr>
-          <w:rFonts w:ascii="Courier New" w:eastAsia="Times New Roman" w:hAnsi="Courier New" w:cs="Courier New"/>
-          <w:kern w:val="0"/>
-          <w:sz w:val="20"/>
-          <w:szCs w:val="20"/>
-          <w:lang w:eastAsia="en-GB"/>
-          <w14:ligatures w14:val="none"/>
-        </w:rPr>
-        <w:t>": 4,</w:t>
+        <w:t xml:space="preserve">  "equip_mode": 4,</w:t>
       </w:r>
     </w:p>
     <w:p>
@@ -3176,31 +3001,7 @@
           <w:lang w:eastAsia="en-GB"/>
           <w14:ligatures w14:val="none"/>
         </w:rPr>
-        <w:t xml:space="preserve">  "</w:t>
-      </w:r>
-      <w:proofErr w:type="spellStart"/>
-      <w:r>
-        <w:rPr>
-          <w:rFonts w:ascii="Courier New" w:eastAsia="Times New Roman" w:hAnsi="Courier New" w:cs="Courier New"/>
-          <w:kern w:val="0"/>
-          <w:sz w:val="20"/>
-          <w:szCs w:val="20"/>
-          <w:lang w:eastAsia="en-GB"/>
-          <w14:ligatures w14:val="none"/>
-        </w:rPr>
-        <w:t>MsgID</w:t>
-      </w:r>
-      <w:proofErr w:type="spellEnd"/>
-      <w:r>
-        <w:rPr>
-          <w:rFonts w:ascii="Courier New" w:eastAsia="Times New Roman" w:hAnsi="Courier New" w:cs="Courier New"/>
-          <w:kern w:val="0"/>
-          <w:sz w:val="20"/>
-          <w:szCs w:val="20"/>
-          <w:lang w:eastAsia="en-GB"/>
-          <w14:ligatures w14:val="none"/>
-        </w:rPr>
-        <w:t>": "20251227164121",</w:t>
+        <w:t xml:space="preserve">  "MsgID": "20251227164121",</w:t>
       </w:r>
     </w:p>
     <w:p>
@@ -3395,44 +3196,7 @@
           <w:lang w:eastAsia="en-GB"/>
           <w14:ligatures w14:val="none"/>
         </w:rPr>
-        <w:t xml:space="preserve">  "</w:t>
-      </w:r>
-      <w:proofErr w:type="spellStart"/>
-      <w:proofErr w:type="gramStart"/>
-      <w:r>
-        <w:rPr>
-          <w:rFonts w:ascii="Courier New" w:eastAsia="Times New Roman" w:hAnsi="Courier New" w:cs="Courier New"/>
-          <w:kern w:val="0"/>
-          <w:sz w:val="20"/>
-          <w:szCs w:val="20"/>
-          <w:lang w:eastAsia="en-GB"/>
-          <w14:ligatures w14:val="none"/>
-        </w:rPr>
-        <w:t>equip</w:t>
-      </w:r>
-      <w:proofErr w:type="gramEnd"/>
-      <w:r>
-        <w:rPr>
-          <w:rFonts w:ascii="Courier New" w:eastAsia="Times New Roman" w:hAnsi="Courier New" w:cs="Courier New"/>
-          <w:kern w:val="0"/>
-          <w:sz w:val="20"/>
-          <w:szCs w:val="20"/>
-          <w:lang w:eastAsia="en-GB"/>
-          <w14:ligatures w14:val="none"/>
-        </w:rPr>
-        <w:t>_mode</w:t>
-      </w:r>
-      <w:proofErr w:type="spellEnd"/>
-      <w:r>
-        <w:rPr>
-          <w:rFonts w:ascii="Courier New" w:eastAsia="Times New Roman" w:hAnsi="Courier New" w:cs="Courier New"/>
-          <w:kern w:val="0"/>
-          <w:sz w:val="20"/>
-          <w:szCs w:val="20"/>
-          <w:lang w:eastAsia="en-GB"/>
-          <w14:ligatures w14:val="none"/>
-        </w:rPr>
-        <w:t>": 4,</w:t>
+        <w:t xml:space="preserve">  "equip_mode": 4,</w:t>
       </w:r>
     </w:p>
     <w:p>
@@ -3701,25 +3465,14 @@
           <w14:ligatures w14:val="none"/>
         </w:rPr>
       </w:pPr>
-      <w:proofErr w:type="spellStart"/>
-      <w:r>
-        <w:rPr>
-          <w:rFonts w:ascii="Times New Roman" w:eastAsia="Times New Roman" w:hAnsi="Times New Roman" w:cs="Times New Roman"/>
-          <w:kern w:val="0"/>
-          <w:lang w:eastAsia="en-GB"/>
-          <w14:ligatures w14:val="none"/>
-        </w:rPr>
-        <w:t>MsgID</w:t>
-      </w:r>
-      <w:proofErr w:type="spellEnd"/>
-      <w:r>
-        <w:rPr>
-          <w:rFonts w:ascii="Times New Roman" w:eastAsia="Times New Roman" w:hAnsi="Times New Roman" w:cs="Times New Roman"/>
-          <w:kern w:val="0"/>
-          <w:lang w:eastAsia="en-GB"/>
-          <w14:ligatures w14:val="none"/>
-        </w:rPr>
-        <w:t xml:space="preserve"> only appears in the first message</w:t>
+      <w:r>
+        <w:rPr>
+          <w:rFonts w:ascii="Times New Roman" w:eastAsia="Times New Roman" w:hAnsi="Times New Roman" w:cs="Times New Roman"/>
+          <w:kern w:val="0"/>
+          <w:lang w:eastAsia="en-GB"/>
+          <w14:ligatures w14:val="none"/>
+        </w:rPr>
+        <w:t>MsgID only appears in the first message</w:t>
       </w:r>
     </w:p>
     <w:p>
@@ -3737,19 +3490,9 @@
           <w:noProof/>
           <w:kern w:val="0"/>
           <w:lang w:eastAsia="en-GB"/>
-          <w14:ligatures w14:val="none"/>
-        </w:rPr>
-      </w:r>
-      <w:r>
-        <w:rPr>
-          <w:rFonts w:ascii="Times New Roman" w:eastAsia="Times New Roman" w:hAnsi="Times New Roman" w:cs="Times New Roman"/>
-          <w:noProof/>
-          <w:kern w:val="0"/>
-          <w:lang w:eastAsia="en-GB"/>
-          <w14:ligatures w14:val="none"/>
-        </w:rPr>
-        <w:pict w14:anchorId="714B9B8A">
-          <v:rect id="_x0000_i1033" alt="" style="width:451.3pt;height:.05pt;mso-width-percent:0;mso-height-percent:0;mso-width-percent:0;mso-height-percent:0" o:hralign="center" o:hrstd="t" o:hr="t" fillcolor="#a0a0a0" stroked="f"/>
+        </w:rPr>
+        <w:pict w14:anchorId="326DFAA8">
+          <v:rect id="_x0000_i1036" alt="" style="width:451.3pt;height:.05pt;mso-width-percent:0;mso-height-percent:0;mso-width-percent:0;mso-height-percent:0" o:hralign="center" o:hrstd="t" o:hr="t" fillcolor="#a0a0a0" stroked="f"/>
         </w:pict>
       </w:r>
     </w:p>
@@ -3911,31 +3654,7 @@
           <w:lang w:eastAsia="en-GB"/>
           <w14:ligatures w14:val="none"/>
         </w:rPr>
-        <w:t xml:space="preserve">  "</w:t>
-      </w:r>
-      <w:proofErr w:type="spellStart"/>
-      <w:r>
-        <w:rPr>
-          <w:rFonts w:ascii="Courier New" w:eastAsia="Times New Roman" w:hAnsi="Courier New" w:cs="Courier New"/>
-          <w:kern w:val="0"/>
-          <w:sz w:val="20"/>
-          <w:szCs w:val="20"/>
-          <w:lang w:eastAsia="en-GB"/>
-          <w14:ligatures w14:val="none"/>
-        </w:rPr>
-        <w:t>onoff</w:t>
-      </w:r>
-      <w:proofErr w:type="spellEnd"/>
-      <w:r>
-        <w:rPr>
-          <w:rFonts w:ascii="Courier New" w:eastAsia="Times New Roman" w:hAnsi="Courier New" w:cs="Courier New"/>
-          <w:kern w:val="0"/>
-          <w:sz w:val="20"/>
-          <w:szCs w:val="20"/>
-          <w:lang w:eastAsia="en-GB"/>
-          <w14:ligatures w14:val="none"/>
-        </w:rPr>
-        <w:t>": 1,</w:t>
+        <w:t xml:space="preserve">  "onoff": 1,</w:t>
       </w:r>
     </w:p>
     <w:p>
@@ -3976,31 +3695,7 @@
           <w:lang w:eastAsia="en-GB"/>
           <w14:ligatures w14:val="none"/>
         </w:rPr>
-        <w:t xml:space="preserve">  "</w:t>
-      </w:r>
-      <w:proofErr w:type="spellStart"/>
-      <w:r>
-        <w:rPr>
-          <w:rFonts w:ascii="Courier New" w:eastAsia="Times New Roman" w:hAnsi="Courier New" w:cs="Courier New"/>
-          <w:kern w:val="0"/>
-          <w:sz w:val="20"/>
-          <w:szCs w:val="20"/>
-          <w:lang w:eastAsia="en-GB"/>
-          <w14:ligatures w14:val="none"/>
-        </w:rPr>
-        <w:t>heatset</w:t>
-      </w:r>
-      <w:proofErr w:type="spellEnd"/>
-      <w:r>
-        <w:rPr>
-          <w:rFonts w:ascii="Courier New" w:eastAsia="Times New Roman" w:hAnsi="Courier New" w:cs="Courier New"/>
-          <w:kern w:val="0"/>
-          <w:sz w:val="20"/>
-          <w:szCs w:val="20"/>
-          <w:lang w:eastAsia="en-GB"/>
-          <w14:ligatures w14:val="none"/>
-        </w:rPr>
-        <w:t>": 190,</w:t>
+        <w:t xml:space="preserve">  "heatset": 190,</w:t>
       </w:r>
     </w:p>
     <w:p>
@@ -4041,31 +3736,7 @@
           <w:lang w:eastAsia="en-GB"/>
           <w14:ligatures w14:val="none"/>
         </w:rPr>
-        <w:t xml:space="preserve">  "</w:t>
-      </w:r>
-      <w:proofErr w:type="spellStart"/>
-      <w:r>
-        <w:rPr>
-          <w:rFonts w:ascii="Courier New" w:eastAsia="Times New Roman" w:hAnsi="Courier New" w:cs="Courier New"/>
-          <w:kern w:val="0"/>
-          <w:sz w:val="20"/>
-          <w:szCs w:val="20"/>
-          <w:lang w:eastAsia="en-GB"/>
-          <w14:ligatures w14:val="none"/>
-        </w:rPr>
-        <w:t>coolset</w:t>
-      </w:r>
-      <w:proofErr w:type="spellEnd"/>
-      <w:r>
-        <w:rPr>
-          <w:rFonts w:ascii="Courier New" w:eastAsia="Times New Roman" w:hAnsi="Courier New" w:cs="Courier New"/>
-          <w:kern w:val="0"/>
-          <w:sz w:val="20"/>
-          <w:szCs w:val="20"/>
-          <w:lang w:eastAsia="en-GB"/>
-          <w14:ligatures w14:val="none"/>
-        </w:rPr>
-        <w:t>": 215,</w:t>
+        <w:t xml:space="preserve">  "coolset": 215,</w:t>
       </w:r>
     </w:p>
     <w:p>
@@ -4106,31 +3777,7 @@
           <w:lang w:eastAsia="en-GB"/>
           <w14:ligatures w14:val="none"/>
         </w:rPr>
-        <w:t xml:space="preserve">  "</w:t>
-      </w:r>
-      <w:proofErr w:type="spellStart"/>
-      <w:r>
-        <w:rPr>
-          <w:rFonts w:ascii="Courier New" w:eastAsia="Times New Roman" w:hAnsi="Courier New" w:cs="Courier New"/>
-          <w:kern w:val="0"/>
-          <w:sz w:val="20"/>
-          <w:szCs w:val="20"/>
-          <w:lang w:eastAsia="en-GB"/>
-          <w14:ligatures w14:val="none"/>
-        </w:rPr>
-        <w:t>progen</w:t>
-      </w:r>
-      <w:proofErr w:type="spellEnd"/>
-      <w:r>
-        <w:rPr>
-          <w:rFonts w:ascii="Courier New" w:eastAsia="Times New Roman" w:hAnsi="Courier New" w:cs="Courier New"/>
-          <w:kern w:val="0"/>
-          <w:sz w:val="20"/>
-          <w:szCs w:val="20"/>
-          <w:lang w:eastAsia="en-GB"/>
-          <w14:ligatures w14:val="none"/>
-        </w:rPr>
-        <w:t>": 0,</w:t>
+        <w:t xml:space="preserve">  "progen": 0,</w:t>
       </w:r>
     </w:p>
     <w:p>
@@ -4171,31 +3818,7 @@
           <w:lang w:eastAsia="en-GB"/>
           <w14:ligatures w14:val="none"/>
         </w:rPr>
-        <w:t xml:space="preserve">  "</w:t>
-      </w:r>
-      <w:proofErr w:type="spellStart"/>
-      <w:r>
-        <w:rPr>
-          <w:rFonts w:ascii="Courier New" w:eastAsia="Times New Roman" w:hAnsi="Courier New" w:cs="Courier New"/>
-          <w:kern w:val="0"/>
-          <w:sz w:val="20"/>
-          <w:szCs w:val="20"/>
-          <w:lang w:eastAsia="en-GB"/>
-          <w14:ligatures w14:val="none"/>
-        </w:rPr>
-        <w:t>ovrdtime</w:t>
-      </w:r>
-      <w:proofErr w:type="spellEnd"/>
-      <w:r>
-        <w:rPr>
-          <w:rFonts w:ascii="Courier New" w:eastAsia="Times New Roman" w:hAnsi="Courier New" w:cs="Courier New"/>
-          <w:kern w:val="0"/>
-          <w:sz w:val="20"/>
-          <w:szCs w:val="20"/>
-          <w:lang w:eastAsia="en-GB"/>
-          <w14:ligatures w14:val="none"/>
-        </w:rPr>
-        <w:t>": 0,</w:t>
+        <w:t xml:space="preserve">  "ovrdtime": 0,</w:t>
       </w:r>
     </w:p>
     <w:p>
@@ -4236,31 +3859,7 @@
           <w:lang w:eastAsia="en-GB"/>
           <w14:ligatures w14:val="none"/>
         </w:rPr>
-        <w:t xml:space="preserve">  "</w:t>
-      </w:r>
-      <w:proofErr w:type="spellStart"/>
-      <w:r>
-        <w:rPr>
-          <w:rFonts w:ascii="Courier New" w:eastAsia="Times New Roman" w:hAnsi="Courier New" w:cs="Courier New"/>
-          <w:kern w:val="0"/>
-          <w:sz w:val="20"/>
-          <w:szCs w:val="20"/>
-          <w:lang w:eastAsia="en-GB"/>
-          <w14:ligatures w14:val="none"/>
-        </w:rPr>
-        <w:t>autoofftime</w:t>
-      </w:r>
-      <w:proofErr w:type="spellEnd"/>
-      <w:r>
-        <w:rPr>
-          <w:rFonts w:ascii="Courier New" w:eastAsia="Times New Roman" w:hAnsi="Courier New" w:cs="Courier New"/>
-          <w:kern w:val="0"/>
-          <w:sz w:val="20"/>
-          <w:szCs w:val="20"/>
-          <w:lang w:eastAsia="en-GB"/>
-          <w14:ligatures w14:val="none"/>
-        </w:rPr>
-        <w:t>": -1</w:t>
+        <w:t xml:space="preserve">  "autoofftime": -1</w:t>
       </w:r>
     </w:p>
     <w:p>
@@ -4472,7 +4071,6 @@
                 <w14:ligatures w14:val="none"/>
               </w:rPr>
             </w:pPr>
-            <w:proofErr w:type="spellStart"/>
             <w:r>
               <w:rPr>
                 <w:rFonts w:ascii="Times New Roman" w:eastAsia="Times New Roman" w:hAnsi="Times New Roman" w:cs="Times New Roman"/>
@@ -4482,7 +4080,6 @@
               </w:rPr>
               <w:t>onoff</w:t>
             </w:r>
-            <w:proofErr w:type="spellEnd"/>
           </w:p>
         </w:tc>
         <w:tc>
@@ -4560,7 +4157,6 @@
                 <w14:ligatures w14:val="none"/>
               </w:rPr>
             </w:pPr>
-            <w:proofErr w:type="spellStart"/>
             <w:r>
               <w:rPr>
                 <w:rFonts w:ascii="Times New Roman" w:eastAsia="Times New Roman" w:hAnsi="Times New Roman" w:cs="Times New Roman"/>
@@ -4570,7 +4166,6 @@
               </w:rPr>
               <w:t>heatset</w:t>
             </w:r>
-            <w:proofErr w:type="spellEnd"/>
           </w:p>
         </w:tc>
         <w:tc>
@@ -4648,7 +4243,6 @@
                 <w14:ligatures w14:val="none"/>
               </w:rPr>
             </w:pPr>
-            <w:proofErr w:type="spellStart"/>
             <w:r>
               <w:rPr>
                 <w:rFonts w:ascii="Times New Roman" w:eastAsia="Times New Roman" w:hAnsi="Times New Roman" w:cs="Times New Roman"/>
@@ -4658,7 +4252,6 @@
               </w:rPr>
               <w:t>coolset</w:t>
             </w:r>
-            <w:proofErr w:type="spellEnd"/>
           </w:p>
         </w:tc>
         <w:tc>
@@ -4736,7 +4329,6 @@
                 <w14:ligatures w14:val="none"/>
               </w:rPr>
             </w:pPr>
-            <w:proofErr w:type="spellStart"/>
             <w:r>
               <w:rPr>
                 <w:rFonts w:ascii="Times New Roman" w:eastAsia="Times New Roman" w:hAnsi="Times New Roman" w:cs="Times New Roman"/>
@@ -4746,7 +4338,6 @@
               </w:rPr>
               <w:t>progen</w:t>
             </w:r>
-            <w:proofErr w:type="spellEnd"/>
           </w:p>
         </w:tc>
         <w:tc>
@@ -4824,7 +4415,6 @@
                 <w14:ligatures w14:val="none"/>
               </w:rPr>
             </w:pPr>
-            <w:proofErr w:type="spellStart"/>
             <w:r>
               <w:rPr>
                 <w:rFonts w:ascii="Times New Roman" w:eastAsia="Times New Roman" w:hAnsi="Times New Roman" w:cs="Times New Roman"/>
@@ -4834,7 +4424,6 @@
               </w:rPr>
               <w:t>ovrdtime</w:t>
             </w:r>
-            <w:proofErr w:type="spellEnd"/>
           </w:p>
         </w:tc>
         <w:tc>
@@ -4912,7 +4501,6 @@
                 <w14:ligatures w14:val="none"/>
               </w:rPr>
             </w:pPr>
-            <w:proofErr w:type="spellStart"/>
             <w:r>
               <w:rPr>
                 <w:rFonts w:ascii="Times New Roman" w:eastAsia="Times New Roman" w:hAnsi="Times New Roman" w:cs="Times New Roman"/>
@@ -4922,7 +4510,6 @@
               </w:rPr>
               <w:t>autoofftime</w:t>
             </w:r>
-            <w:proofErr w:type="spellEnd"/>
           </w:p>
         </w:tc>
         <w:tc>
@@ -5006,19 +4593,9 @@
           <w:noProof/>
           <w:kern w:val="0"/>
           <w:lang w:eastAsia="en-GB"/>
-          <w14:ligatures w14:val="none"/>
-        </w:rPr>
-      </w:r>
-      <w:r>
-        <w:rPr>
-          <w:rFonts w:ascii="Times New Roman" w:eastAsia="Times New Roman" w:hAnsi="Times New Roman" w:cs="Times New Roman"/>
-          <w:noProof/>
-          <w:kern w:val="0"/>
-          <w:lang w:eastAsia="en-GB"/>
-          <w14:ligatures w14:val="none"/>
-        </w:rPr>
-        <w:pict w14:anchorId="7C9B0187">
-          <v:rect id="_x0000_i1034" alt="" style="width:451.3pt;height:.05pt;mso-width-percent:0;mso-height-percent:0;mso-width-percent:0;mso-height-percent:0" o:hralign="center" o:hrstd="t" o:hr="t" fillcolor="#a0a0a0" stroked="f"/>
+        </w:rPr>
+        <w:pict w14:anchorId="594C7ABA">
+          <v:rect id="_x0000_i1035" alt="" style="width:451.3pt;height:.05pt;mso-width-percent:0;mso-height-percent:0;mso-width-percent:0;mso-height-percent:0" o:hralign="center" o:hrstd="t" o:hr="t" fillcolor="#a0a0a0" stroked="f"/>
         </w:pict>
       </w:r>
     </w:p>
@@ -5157,7 +4734,6 @@
                 <w14:ligatures w14:val="none"/>
               </w:rPr>
             </w:pPr>
-            <w:proofErr w:type="spellStart"/>
             <w:r>
               <w:rPr>
                 <w:rFonts w:ascii="Times New Roman" w:eastAsia="Times New Roman" w:hAnsi="Times New Roman" w:cs="Times New Roman"/>
@@ -5167,7 +4743,6 @@
               </w:rPr>
               <w:t>dis_sys_temp</w:t>
             </w:r>
-            <w:proofErr w:type="spellEnd"/>
           </w:p>
         </w:tc>
         <w:tc>
@@ -5218,7 +4793,6 @@
                 <w14:ligatures w14:val="none"/>
               </w:rPr>
             </w:pPr>
-            <w:proofErr w:type="spellStart"/>
             <w:r>
               <w:rPr>
                 <w:rFonts w:ascii="Times New Roman" w:eastAsia="Times New Roman" w:hAnsi="Times New Roman" w:cs="Times New Roman"/>
@@ -5228,7 +4802,6 @@
               </w:rPr>
               <w:t>dis_room_temp</w:t>
             </w:r>
-            <w:proofErr w:type="spellEnd"/>
           </w:p>
         </w:tc>
         <w:tc>
@@ -5279,7 +4852,6 @@
                 <w14:ligatures w14:val="none"/>
               </w:rPr>
             </w:pPr>
-            <w:proofErr w:type="spellStart"/>
             <w:r>
               <w:rPr>
                 <w:rFonts w:ascii="Times New Roman" w:eastAsia="Times New Roman" w:hAnsi="Times New Roman" w:cs="Times New Roman"/>
@@ -5289,7 +4861,6 @@
               </w:rPr>
               <w:t>dis_room_humi</w:t>
             </w:r>
-            <w:proofErr w:type="spellEnd"/>
           </w:p>
         </w:tc>
         <w:tc>
@@ -5340,7 +4911,6 @@
                 <w14:ligatures w14:val="none"/>
               </w:rPr>
             </w:pPr>
-            <w:proofErr w:type="spellStart"/>
             <w:r>
               <w:rPr>
                 <w:rFonts w:ascii="Times New Roman" w:eastAsia="Times New Roman" w:hAnsi="Times New Roman" w:cs="Times New Roman"/>
@@ -5350,7 +4920,6 @@
               </w:rPr>
               <w:t>fan_status</w:t>
             </w:r>
-            <w:proofErr w:type="spellEnd"/>
           </w:p>
         </w:tc>
         <w:tc>
@@ -5401,7 +4970,6 @@
                 <w14:ligatures w14:val="none"/>
               </w:rPr>
             </w:pPr>
-            <w:proofErr w:type="spellStart"/>
             <w:r>
               <w:rPr>
                 <w:rFonts w:ascii="Times New Roman" w:eastAsia="Times New Roman" w:hAnsi="Times New Roman" w:cs="Times New Roman"/>
@@ -5411,7 +4979,6 @@
               </w:rPr>
               <w:t>heat_status</w:t>
             </w:r>
-            <w:proofErr w:type="spellEnd"/>
           </w:p>
         </w:tc>
         <w:tc>
@@ -5462,7 +5029,6 @@
                 <w14:ligatures w14:val="none"/>
               </w:rPr>
             </w:pPr>
-            <w:proofErr w:type="spellStart"/>
             <w:r>
               <w:rPr>
                 <w:rFonts w:ascii="Times New Roman" w:eastAsia="Times New Roman" w:hAnsi="Times New Roman" w:cs="Times New Roman"/>
@@ -5472,7 +5038,6 @@
               </w:rPr>
               <w:t>cool_status</w:t>
             </w:r>
-            <w:proofErr w:type="spellEnd"/>
           </w:p>
         </w:tc>
         <w:tc>
@@ -5519,19 +5084,9 @@
           <w:noProof/>
           <w:kern w:val="0"/>
           <w:lang w:eastAsia="en-GB"/>
-          <w14:ligatures w14:val="none"/>
-        </w:rPr>
-      </w:r>
-      <w:r>
-        <w:rPr>
-          <w:rFonts w:ascii="Times New Roman" w:eastAsia="Times New Roman" w:hAnsi="Times New Roman" w:cs="Times New Roman"/>
-          <w:noProof/>
-          <w:kern w:val="0"/>
-          <w:lang w:eastAsia="en-GB"/>
-          <w14:ligatures w14:val="none"/>
-        </w:rPr>
-        <w:pict w14:anchorId="619696BF">
-          <v:rect id="_x0000_i1035" alt="" style="width:451.3pt;height:.05pt;mso-width-percent:0;mso-height-percent:0;mso-width-percent:0;mso-height-percent:0" o:hralign="center" o:hrstd="t" o:hr="t" fillcolor="#a0a0a0" stroked="f"/>
+        </w:rPr>
+        <w:pict w14:anchorId="690D9CA2">
+          <v:rect id="_x0000_i1034" alt="" style="width:451.3pt;height:.05pt;mso-width-percent:0;mso-height-percent:0;mso-width-percent:0;mso-height-percent:0" o:hralign="center" o:hrstd="t" o:hr="t" fillcolor="#a0a0a0" stroked="f"/>
         </w:pict>
       </w:r>
     </w:p>
@@ -5664,31 +5219,7 @@
           <w:lang w:eastAsia="en-GB"/>
           <w14:ligatures w14:val="none"/>
         </w:rPr>
-        <w:t>{"</w:t>
-      </w:r>
-      <w:proofErr w:type="spellStart"/>
-      <w:r>
-        <w:rPr>
-          <w:rFonts w:ascii="Courier New" w:eastAsia="Times New Roman" w:hAnsi="Courier New" w:cs="Courier New"/>
-          <w:kern w:val="0"/>
-          <w:sz w:val="20"/>
-          <w:szCs w:val="20"/>
-          <w:lang w:eastAsia="en-GB"/>
-          <w14:ligatures w14:val="none"/>
-        </w:rPr>
-        <w:t>result":"ok</w:t>
-      </w:r>
-      <w:proofErr w:type="spellEnd"/>
-      <w:r>
-        <w:rPr>
-          <w:rFonts w:ascii="Courier New" w:eastAsia="Times New Roman" w:hAnsi="Courier New" w:cs="Courier New"/>
-          <w:kern w:val="0"/>
-          <w:sz w:val="20"/>
-          <w:szCs w:val="20"/>
-          <w:lang w:eastAsia="en-GB"/>
-          <w14:ligatures w14:val="none"/>
-        </w:rPr>
-        <w:t>"}</w:t>
+        <w:t>{"result":"ok"}</w:t>
       </w:r>
     </w:p>
     <w:p>
@@ -5726,19 +5257,9 @@
           <w:noProof/>
           <w:kern w:val="0"/>
           <w:lang w:eastAsia="en-GB"/>
-          <w14:ligatures w14:val="none"/>
-        </w:rPr>
-      </w:r>
-      <w:r>
-        <w:rPr>
-          <w:rFonts w:ascii="Times New Roman" w:eastAsia="Times New Roman" w:hAnsi="Times New Roman" w:cs="Times New Roman"/>
-          <w:noProof/>
-          <w:kern w:val="0"/>
-          <w:lang w:eastAsia="en-GB"/>
-          <w14:ligatures w14:val="none"/>
-        </w:rPr>
-        <w:pict w14:anchorId="6921FD38">
-          <v:rect id="_x0000_i1036" alt="" style="width:451.3pt;height:.05pt;mso-width-percent:0;mso-height-percent:0;mso-width-percent:0;mso-height-percent:0" o:hralign="center" o:hrstd="t" o:hr="t" fillcolor="#a0a0a0" stroked="f"/>
+        </w:rPr>
+        <w:pict w14:anchorId="133D0ACA">
+          <v:rect id="_x0000_i1033" alt="" style="width:451.3pt;height:.05pt;mso-width-percent:0;mso-height-percent:0;mso-width-percent:0;mso-height-percent:0" o:hralign="center" o:hrstd="t" o:hr="t" fillcolor="#a0a0a0" stroked="f"/>
         </w:pict>
       </w:r>
     </w:p>
@@ -5934,31 +5455,7 @@
           <w:lang w:eastAsia="en-GB"/>
           <w14:ligatures w14:val="none"/>
         </w:rPr>
-        <w:t xml:space="preserve">  "</w:t>
-      </w:r>
-      <w:proofErr w:type="spellStart"/>
-      <w:r>
-        <w:rPr>
-          <w:rFonts w:ascii="Courier New" w:eastAsia="Times New Roman" w:hAnsi="Courier New" w:cs="Courier New"/>
-          <w:kern w:val="0"/>
-          <w:sz w:val="20"/>
-          <w:szCs w:val="20"/>
-          <w:lang w:eastAsia="en-GB"/>
-          <w14:ligatures w14:val="none"/>
-        </w:rPr>
-        <w:t>cmd</w:t>
-      </w:r>
-      <w:proofErr w:type="spellEnd"/>
-      <w:r>
-        <w:rPr>
-          <w:rFonts w:ascii="Courier New" w:eastAsia="Times New Roman" w:hAnsi="Courier New" w:cs="Courier New"/>
-          <w:kern w:val="0"/>
-          <w:sz w:val="20"/>
-          <w:szCs w:val="20"/>
-          <w:lang w:eastAsia="en-GB"/>
-          <w14:ligatures w14:val="none"/>
-        </w:rPr>
-        <w:t>": "weather"</w:t>
+        <w:t xml:space="preserve">  "cmd": "weather"</w:t>
       </w:r>
     </w:p>
     <w:p>
@@ -6096,19 +5593,9 @@
           <w:noProof/>
           <w:kern w:val="0"/>
           <w:lang w:eastAsia="en-GB"/>
-          <w14:ligatures w14:val="none"/>
-        </w:rPr>
-      </w:r>
-      <w:r>
-        <w:rPr>
-          <w:rFonts w:ascii="Times New Roman" w:eastAsia="Times New Roman" w:hAnsi="Times New Roman" w:cs="Times New Roman"/>
-          <w:noProof/>
-          <w:kern w:val="0"/>
-          <w:lang w:eastAsia="en-GB"/>
-          <w14:ligatures w14:val="none"/>
-        </w:rPr>
-        <w:pict w14:anchorId="57FC3365">
-          <v:rect id="_x0000_i1037" alt="" style="width:451.3pt;height:.05pt;mso-width-percent:0;mso-height-percent:0;mso-width-percent:0;mso-height-percent:0" o:hralign="center" o:hrstd="t" o:hr="t" fillcolor="#a0a0a0" stroked="f"/>
+        </w:rPr>
+        <w:pict w14:anchorId="078506FC">
+          <v:rect id="_x0000_i1032" alt="" style="width:451.3pt;height:.05pt;mso-width-percent:0;mso-height-percent:0;mso-width-percent:0;mso-height-percent:0" o:hralign="center" o:hrstd="t" o:hr="t" fillcolor="#a0a0a0" stroked="f"/>
         </w:pict>
       </w:r>
     </w:p>
@@ -6397,19 +5884,9 @@
           <w:noProof/>
           <w:kern w:val="0"/>
           <w:lang w:eastAsia="en-GB"/>
-          <w14:ligatures w14:val="none"/>
-        </w:rPr>
-      </w:r>
-      <w:r>
-        <w:rPr>
-          <w:rFonts w:ascii="Times New Roman" w:eastAsia="Times New Roman" w:hAnsi="Times New Roman" w:cs="Times New Roman"/>
-          <w:noProof/>
-          <w:kern w:val="0"/>
-          <w:lang w:eastAsia="en-GB"/>
-          <w14:ligatures w14:val="none"/>
-        </w:rPr>
-        <w:pict w14:anchorId="014C92AC">
-          <v:rect id="_x0000_i1038" alt="" style="width:451.3pt;height:.05pt;mso-width-percent:0;mso-height-percent:0;mso-width-percent:0;mso-height-percent:0" o:hralign="center" o:hrstd="t" o:hr="t" fillcolor="#a0a0a0" stroked="f"/>
+        </w:rPr>
+        <w:pict w14:anchorId="22AC118A">
+          <v:rect id="_x0000_i1031" alt="" style="width:451.3pt;height:.05pt;mso-width-percent:0;mso-height-percent:0;mso-width-percent:0;mso-height-percent:0" o:hralign="center" o:hrstd="t" o:hr="t" fillcolor="#a0a0a0" stroked="f"/>
         </w:pict>
       </w:r>
     </w:p>
@@ -6553,19 +6030,9 @@
           <w:noProof/>
           <w:kern w:val="0"/>
           <w:lang w:eastAsia="en-GB"/>
-          <w14:ligatures w14:val="none"/>
-        </w:rPr>
-      </w:r>
-      <w:r>
-        <w:rPr>
-          <w:rFonts w:ascii="Times New Roman" w:eastAsia="Times New Roman" w:hAnsi="Times New Roman" w:cs="Times New Roman"/>
-          <w:noProof/>
-          <w:kern w:val="0"/>
-          <w:lang w:eastAsia="en-GB"/>
-          <w14:ligatures w14:val="none"/>
-        </w:rPr>
-        <w:pict w14:anchorId="71A36FF4">
-          <v:rect id="_x0000_i1039" alt="" style="width:451.3pt;height:.05pt;mso-width-percent:0;mso-height-percent:0;mso-width-percent:0;mso-height-percent:0" o:hralign="center" o:hrstd="t" o:hr="t" fillcolor="#a0a0a0" stroked="f"/>
+        </w:rPr>
+        <w:pict w14:anchorId="13751818">
+          <v:rect id="_x0000_i1030" alt="" style="width:451.3pt;height:.05pt;mso-width-percent:0;mso-height-percent:0;mso-width-percent:0;mso-height-percent:0" o:hralign="center" o:hrstd="t" o:hr="t" fillcolor="#a0a0a0" stroked="f"/>
         </w:pict>
       </w:r>
     </w:p>
@@ -6747,19 +6214,9 @@
           <w:noProof/>
           <w:kern w:val="0"/>
           <w:lang w:eastAsia="en-GB"/>
-          <w14:ligatures w14:val="none"/>
-        </w:rPr>
-      </w:r>
-      <w:r>
-        <w:rPr>
-          <w:rFonts w:ascii="Times New Roman" w:eastAsia="Times New Roman" w:hAnsi="Times New Roman" w:cs="Times New Roman"/>
-          <w:noProof/>
-          <w:kern w:val="0"/>
-          <w:lang w:eastAsia="en-GB"/>
-          <w14:ligatures w14:val="none"/>
-        </w:rPr>
-        <w:pict w14:anchorId="260AC892">
-          <v:rect id="_x0000_i1040" alt="" style="width:451.3pt;height:.05pt;mso-width-percent:0;mso-height-percent:0;mso-width-percent:0;mso-height-percent:0" o:hralign="center" o:hrstd="t" o:hr="t" fillcolor="#a0a0a0" stroked="f"/>
+        </w:rPr>
+        <w:pict w14:anchorId="08F80BDA">
+          <v:rect id="_x0000_i1029" alt="" style="width:451.3pt;height:.05pt;mso-width-percent:0;mso-height-percent:0;mso-width-percent:0;mso-height-percent:0" o:hralign="center" o:hrstd="t" o:hr="t" fillcolor="#a0a0a0" stroked="f"/>
         </w:pict>
       </w:r>
     </w:p>
@@ -6820,19 +6277,9 @@
           <w:noProof/>
           <w:kern w:val="0"/>
           <w:lang w:eastAsia="en-GB"/>
-          <w14:ligatures w14:val="none"/>
-        </w:rPr>
-      </w:r>
-      <w:r>
-        <w:rPr>
-          <w:rFonts w:ascii="Times New Roman" w:eastAsia="Times New Roman" w:hAnsi="Times New Roman" w:cs="Times New Roman"/>
-          <w:noProof/>
-          <w:kern w:val="0"/>
-          <w:lang w:eastAsia="en-GB"/>
-          <w14:ligatures w14:val="none"/>
-        </w:rPr>
-        <w:pict w14:anchorId="06BD61AF">
-          <v:rect id="_x0000_i1041" alt="" style="width:451.3pt;height:.05pt;mso-width-percent:0;mso-height-percent:0;mso-width-percent:0;mso-height-percent:0" o:hralign="center" o:hrstd="t" o:hr="t" fillcolor="#a0a0a0" stroked="f"/>
+        </w:rPr>
+        <w:pict w14:anchorId="72AC304A">
+          <v:rect id="_x0000_i1028" alt="" style="width:451.3pt;height:.05pt;mso-width-percent:0;mso-height-percent:0;mso-width-percent:0;mso-height-percent:0" o:hralign="center" o:hrstd="t" o:hr="t" fillcolor="#a0a0a0" stroked="f"/>
         </w:pict>
       </w:r>
     </w:p>
@@ -6961,25 +6408,14 @@
           <w14:ligatures w14:val="none"/>
         </w:rPr>
       </w:pPr>
-      <w:proofErr w:type="spellStart"/>
-      <w:r>
-        <w:rPr>
-          <w:rFonts w:ascii="Times New Roman" w:eastAsia="Times New Roman" w:hAnsi="Times New Roman" w:cs="Times New Roman"/>
-          <w:kern w:val="0"/>
-          <w:lang w:eastAsia="en-GB"/>
-          <w14:ligatures w14:val="none"/>
-        </w:rPr>
-        <w:t>zone_no</w:t>
-      </w:r>
-      <w:proofErr w:type="spellEnd"/>
-      <w:r>
-        <w:rPr>
-          <w:rFonts w:ascii="Times New Roman" w:eastAsia="Times New Roman" w:hAnsi="Times New Roman" w:cs="Times New Roman"/>
-          <w:kern w:val="0"/>
-          <w:lang w:eastAsia="en-GB"/>
-          <w14:ligatures w14:val="none"/>
-        </w:rPr>
-        <w:t xml:space="preserve"> = 2</w:t>
+      <w:r>
+        <w:rPr>
+          <w:rFonts w:ascii="Times New Roman" w:eastAsia="Times New Roman" w:hAnsi="Times New Roman" w:cs="Times New Roman"/>
+          <w:kern w:val="0"/>
+          <w:lang w:eastAsia="en-GB"/>
+          <w14:ligatures w14:val="none"/>
+        </w:rPr>
+        <w:t>zone_no = 2</w:t>
       </w:r>
     </w:p>
     <w:p>
@@ -7044,25 +6480,14 @@
           <w14:ligatures w14:val="none"/>
         </w:rPr>
       </w:pPr>
-      <w:proofErr w:type="spellStart"/>
-      <w:r>
-        <w:rPr>
-          <w:rFonts w:ascii="Times New Roman" w:eastAsia="Times New Roman" w:hAnsi="Times New Roman" w:cs="Times New Roman"/>
-          <w:kern w:val="0"/>
-          <w:lang w:eastAsia="en-GB"/>
-          <w14:ligatures w14:val="none"/>
-        </w:rPr>
-        <w:t>dis_zone_temp</w:t>
-      </w:r>
-      <w:proofErr w:type="spellEnd"/>
-      <w:r>
-        <w:rPr>
-          <w:rFonts w:ascii="Times New Roman" w:eastAsia="Times New Roman" w:hAnsi="Times New Roman" w:cs="Times New Roman"/>
-          <w:kern w:val="0"/>
-          <w:lang w:eastAsia="en-GB"/>
-          <w14:ligatures w14:val="none"/>
-        </w:rPr>
-        <w:t xml:space="preserve"> array length = number of zones</w:t>
+      <w:r>
+        <w:rPr>
+          <w:rFonts w:ascii="Times New Roman" w:eastAsia="Times New Roman" w:hAnsi="Times New Roman" w:cs="Times New Roman"/>
+          <w:kern w:val="0"/>
+          <w:lang w:eastAsia="en-GB"/>
+          <w14:ligatures w14:val="none"/>
+        </w:rPr>
+        <w:t>dis_zone_temp array length = number of zones</w:t>
       </w:r>
     </w:p>
     <w:p>
@@ -7125,25 +6550,14 @@
           <w14:ligatures w14:val="none"/>
         </w:rPr>
       </w:pPr>
-      <w:proofErr w:type="spellStart"/>
-      <w:r>
-        <w:rPr>
-          <w:rFonts w:ascii="Times New Roman" w:eastAsia="Times New Roman" w:hAnsi="Times New Roman" w:cs="Times New Roman"/>
-          <w:kern w:val="0"/>
-          <w:lang w:eastAsia="en-GB"/>
-          <w14:ligatures w14:val="none"/>
-        </w:rPr>
-        <w:t>zone_type</w:t>
-      </w:r>
-      <w:proofErr w:type="spellEnd"/>
-      <w:r>
-        <w:rPr>
-          <w:rFonts w:ascii="Times New Roman" w:eastAsia="Times New Roman" w:hAnsi="Times New Roman" w:cs="Times New Roman"/>
-          <w:kern w:val="0"/>
-          <w:lang w:eastAsia="en-GB"/>
-          <w14:ligatures w14:val="none"/>
-        </w:rPr>
-        <w:t xml:space="preserve"> = 2 (multi-zone controller)</w:t>
+      <w:r>
+        <w:rPr>
+          <w:rFonts w:ascii="Times New Roman" w:eastAsia="Times New Roman" w:hAnsi="Times New Roman" w:cs="Times New Roman"/>
+          <w:kern w:val="0"/>
+          <w:lang w:eastAsia="en-GB"/>
+          <w14:ligatures w14:val="none"/>
+        </w:rPr>
+        <w:t>zone_type = 2 (multi-zone controller)</w:t>
       </w:r>
     </w:p>
     <w:p>
@@ -7184,45 +6598,14 @@
           <w14:ligatures w14:val="none"/>
         </w:rPr>
       </w:pPr>
-      <w:proofErr w:type="spellStart"/>
-      <w:r>
-        <w:rPr>
-          <w:rFonts w:ascii="Times New Roman" w:eastAsia="Times New Roman" w:hAnsi="Times New Roman" w:cs="Times New Roman"/>
-          <w:kern w:val="0"/>
-          <w:lang w:eastAsia="en-GB"/>
-          <w14:ligatures w14:val="none"/>
-        </w:rPr>
-        <w:t>dis_room_temp</w:t>
-      </w:r>
-      <w:proofErr w:type="spellEnd"/>
-      <w:r>
-        <w:rPr>
-          <w:rFonts w:ascii="Times New Roman" w:eastAsia="Times New Roman" w:hAnsi="Times New Roman" w:cs="Times New Roman"/>
-          <w:kern w:val="0"/>
-          <w:lang w:eastAsia="en-GB"/>
-          <w14:ligatures w14:val="none"/>
-        </w:rPr>
-        <w:t xml:space="preserve"> and </w:t>
-      </w:r>
-      <w:proofErr w:type="spellStart"/>
-      <w:r>
-        <w:rPr>
-          <w:rFonts w:ascii="Times New Roman" w:eastAsia="Times New Roman" w:hAnsi="Times New Roman" w:cs="Times New Roman"/>
-          <w:kern w:val="0"/>
-          <w:lang w:eastAsia="en-GB"/>
-          <w14:ligatures w14:val="none"/>
-        </w:rPr>
-        <w:t>dis_room_humi</w:t>
-      </w:r>
-      <w:proofErr w:type="spellEnd"/>
-      <w:r>
-        <w:rPr>
-          <w:rFonts w:ascii="Times New Roman" w:eastAsia="Times New Roman" w:hAnsi="Times New Roman" w:cs="Times New Roman"/>
-          <w:kern w:val="0"/>
-          <w:lang w:eastAsia="en-GB"/>
-          <w14:ligatures w14:val="none"/>
-        </w:rPr>
-        <w:t xml:space="preserve"> arrays indexed by sensor</w:t>
+      <w:r>
+        <w:rPr>
+          <w:rFonts w:ascii="Times New Roman" w:eastAsia="Times New Roman" w:hAnsi="Times New Roman" w:cs="Times New Roman"/>
+          <w:kern w:val="0"/>
+          <w:lang w:eastAsia="en-GB"/>
+          <w14:ligatures w14:val="none"/>
+        </w:rPr>
+        <w:t>dis_room_temp and dis_room_humi arrays indexed by sensor</w:t>
       </w:r>
     </w:p>
     <w:p>
@@ -7326,19 +6709,9 @@
           <w:noProof/>
           <w:kern w:val="0"/>
           <w:lang w:eastAsia="en-GB"/>
-          <w14:ligatures w14:val="none"/>
-        </w:rPr>
-      </w:r>
-      <w:r>
-        <w:rPr>
-          <w:rFonts w:ascii="Times New Roman" w:eastAsia="Times New Roman" w:hAnsi="Times New Roman" w:cs="Times New Roman"/>
-          <w:noProof/>
-          <w:kern w:val="0"/>
-          <w:lang w:eastAsia="en-GB"/>
-          <w14:ligatures w14:val="none"/>
-        </w:rPr>
-        <w:pict w14:anchorId="2A59257B">
-          <v:rect id="_x0000_i1042" alt="" style="width:451.3pt;height:.05pt;mso-width-percent:0;mso-height-percent:0;mso-width-percent:0;mso-height-percent:0" o:hralign="center" o:hrstd="t" o:hr="t" fillcolor="#a0a0a0" stroked="f"/>
+        </w:rPr>
+        <w:pict w14:anchorId="58DF565C">
+          <v:rect id="_x0000_i1027" alt="" style="width:451.3pt;height:.05pt;mso-width-percent:0;mso-height-percent:0;mso-width-percent:0;mso-height-percent:0" o:hralign="center" o:hrstd="t" o:hr="t" fillcolor="#a0a0a0" stroked="f"/>
         </w:pict>
       </w:r>
     </w:p>
@@ -7368,35 +6741,7 @@
           <w:lang w:eastAsia="en-GB"/>
           <w14:ligatures w14:val="none"/>
         </w:rPr>
-        <w:t>A.2 Guest Controller (</w:t>
-      </w:r>
-      <w:proofErr w:type="gramStart"/>
-      <w:r>
-        <w:rPr>
-          <w:rFonts w:ascii="Times New Roman" w:eastAsia="Times New Roman" w:hAnsi="Times New Roman" w:cs="Times New Roman"/>
-          <w:b/>
-          <w:bCs/>
-          <w:kern w:val="0"/>
-          <w:sz w:val="27"/>
-          <w:szCs w:val="27"/>
-          <w:lang w:eastAsia="en-GB"/>
-          <w14:ligatures w14:val="none"/>
-        </w:rPr>
-        <w:t>Single-zone</w:t>
-      </w:r>
-      <w:proofErr w:type="gramEnd"/>
-      <w:r>
-        <w:rPr>
-          <w:rFonts w:ascii="Times New Roman" w:eastAsia="Times New Roman" w:hAnsi="Times New Roman" w:cs="Times New Roman"/>
-          <w:b/>
-          <w:bCs/>
-          <w:kern w:val="0"/>
-          <w:sz w:val="27"/>
-          <w:szCs w:val="27"/>
-          <w:lang w:eastAsia="en-GB"/>
-          <w14:ligatures w14:val="none"/>
-        </w:rPr>
-        <w:t>)</w:t>
+        <w:t>A.2 Guest Controller (Single-zone)</w:t>
       </w:r>
     </w:p>
     <w:p>
@@ -7435,25 +6780,14 @@
           <w14:ligatures w14:val="none"/>
         </w:rPr>
       </w:pPr>
-      <w:proofErr w:type="spellStart"/>
-      <w:r>
-        <w:rPr>
-          <w:rFonts w:ascii="Times New Roman" w:eastAsia="Times New Roman" w:hAnsi="Times New Roman" w:cs="Times New Roman"/>
-          <w:kern w:val="0"/>
-          <w:lang w:eastAsia="en-GB"/>
-          <w14:ligatures w14:val="none"/>
-        </w:rPr>
-        <w:t>zone_no</w:t>
-      </w:r>
-      <w:proofErr w:type="spellEnd"/>
-      <w:r>
-        <w:rPr>
-          <w:rFonts w:ascii="Times New Roman" w:eastAsia="Times New Roman" w:hAnsi="Times New Roman" w:cs="Times New Roman"/>
-          <w:kern w:val="0"/>
-          <w:lang w:eastAsia="en-GB"/>
-          <w14:ligatures w14:val="none"/>
-        </w:rPr>
-        <w:t xml:space="preserve"> = 0</w:t>
+      <w:r>
+        <w:rPr>
+          <w:rFonts w:ascii="Times New Roman" w:eastAsia="Times New Roman" w:hAnsi="Times New Roman" w:cs="Times New Roman"/>
+          <w:kern w:val="0"/>
+          <w:lang w:eastAsia="en-GB"/>
+          <w14:ligatures w14:val="none"/>
+        </w:rPr>
+        <w:t>zone_no = 0</w:t>
       </w:r>
     </w:p>
     <w:p>
@@ -7518,25 +6852,14 @@
           <w14:ligatures w14:val="none"/>
         </w:rPr>
       </w:pPr>
-      <w:proofErr w:type="spellStart"/>
-      <w:r>
-        <w:rPr>
-          <w:rFonts w:ascii="Times New Roman" w:eastAsia="Times New Roman" w:hAnsi="Times New Roman" w:cs="Times New Roman"/>
-          <w:kern w:val="0"/>
-          <w:lang w:eastAsia="en-GB"/>
-          <w14:ligatures w14:val="none"/>
-        </w:rPr>
-        <w:t>dis_zone_temp</w:t>
-      </w:r>
-      <w:proofErr w:type="spellEnd"/>
-      <w:r>
-        <w:rPr>
-          <w:rFonts w:ascii="Times New Roman" w:eastAsia="Times New Roman" w:hAnsi="Times New Roman" w:cs="Times New Roman"/>
-          <w:kern w:val="0"/>
-          <w:lang w:eastAsia="en-GB"/>
-          <w14:ligatures w14:val="none"/>
-        </w:rPr>
-        <w:t xml:space="preserve"> empty or omitted</w:t>
+      <w:r>
+        <w:rPr>
+          <w:rFonts w:ascii="Times New Roman" w:eastAsia="Times New Roman" w:hAnsi="Times New Roman" w:cs="Times New Roman"/>
+          <w:kern w:val="0"/>
+          <w:lang w:eastAsia="en-GB"/>
+          <w14:ligatures w14:val="none"/>
+        </w:rPr>
+        <w:t>dis_zone_temp empty or omitted</w:t>
       </w:r>
     </w:p>
     <w:p>
@@ -7582,47 +6905,7 @@
           <w:lang w:eastAsia="en-GB"/>
           <w14:ligatures w14:val="none"/>
         </w:rPr>
-        <w:t>System-level fields (</w:t>
-      </w:r>
-      <w:proofErr w:type="spellStart"/>
-      <w:r>
-        <w:rPr>
-          <w:rFonts w:ascii="Times New Roman" w:eastAsia="Times New Roman" w:hAnsi="Times New Roman" w:cs="Times New Roman"/>
-          <w:kern w:val="0"/>
-          <w:lang w:eastAsia="en-GB"/>
-          <w14:ligatures w14:val="none"/>
-        </w:rPr>
-        <w:t>equip_mode</w:t>
-      </w:r>
-      <w:proofErr w:type="spellEnd"/>
-      <w:r>
-        <w:rPr>
-          <w:rFonts w:ascii="Times New Roman" w:eastAsia="Times New Roman" w:hAnsi="Times New Roman" w:cs="Times New Roman"/>
-          <w:kern w:val="0"/>
-          <w:lang w:eastAsia="en-GB"/>
-          <w14:ligatures w14:val="none"/>
-        </w:rPr>
-        <w:t xml:space="preserve">, </w:t>
-      </w:r>
-      <w:proofErr w:type="spellStart"/>
-      <w:r>
-        <w:rPr>
-          <w:rFonts w:ascii="Times New Roman" w:eastAsia="Times New Roman" w:hAnsi="Times New Roman" w:cs="Times New Roman"/>
-          <w:kern w:val="0"/>
-          <w:lang w:eastAsia="en-GB"/>
-          <w14:ligatures w14:val="none"/>
-        </w:rPr>
-        <w:t>fan_mode</w:t>
-      </w:r>
-      <w:proofErr w:type="spellEnd"/>
-      <w:r>
-        <w:rPr>
-          <w:rFonts w:ascii="Times New Roman" w:eastAsia="Times New Roman" w:hAnsi="Times New Roman" w:cs="Times New Roman"/>
-          <w:kern w:val="0"/>
-          <w:lang w:eastAsia="en-GB"/>
-          <w14:ligatures w14:val="none"/>
-        </w:rPr>
-        <w:t>, temperatures) still present</w:t>
+        <w:t>System-level fields (equip_mode, fan_mode, temperatures) still present</w:t>
       </w:r>
     </w:p>
     <w:p>
@@ -7646,27 +6929,7 @@
           <w:lang w:eastAsia="en-GB"/>
           <w14:ligatures w14:val="none"/>
         </w:rPr>
-        <w:t xml:space="preserve">Zone-specific command payloads are ignored unless </w:t>
-      </w:r>
-      <w:proofErr w:type="spellStart"/>
-      <w:r>
-        <w:rPr>
-          <w:rFonts w:ascii="Times New Roman" w:eastAsia="Times New Roman" w:hAnsi="Times New Roman" w:cs="Times New Roman"/>
-          <w:kern w:val="0"/>
-          <w:lang w:eastAsia="en-GB"/>
-          <w14:ligatures w14:val="none"/>
-        </w:rPr>
-        <w:t>zone_no</w:t>
-      </w:r>
-      <w:proofErr w:type="spellEnd"/>
-      <w:r>
-        <w:rPr>
-          <w:rFonts w:ascii="Times New Roman" w:eastAsia="Times New Roman" w:hAnsi="Times New Roman" w:cs="Times New Roman"/>
-          <w:kern w:val="0"/>
-          <w:lang w:eastAsia="en-GB"/>
-          <w14:ligatures w14:val="none"/>
-        </w:rPr>
-        <w:t xml:space="preserve"> &gt; 0</w:t>
+        <w:t>Zone-specific command payloads are ignored unless zone_no &gt; 0</w:t>
       </w:r>
     </w:p>
     <w:p>
@@ -7747,19 +7010,9 @@
           <w:noProof/>
           <w:kern w:val="0"/>
           <w:lang w:eastAsia="en-GB"/>
-          <w14:ligatures w14:val="none"/>
-        </w:rPr>
-      </w:r>
-      <w:r>
-        <w:rPr>
-          <w:rFonts w:ascii="Times New Roman" w:eastAsia="Times New Roman" w:hAnsi="Times New Roman" w:cs="Times New Roman"/>
-          <w:noProof/>
-          <w:kern w:val="0"/>
-          <w:lang w:eastAsia="en-GB"/>
-          <w14:ligatures w14:val="none"/>
-        </w:rPr>
-        <w:pict w14:anchorId="38FFAE49">
-          <v:rect id="_x0000_i1043" alt="" style="width:451.3pt;height:.05pt;mso-width-percent:0;mso-height-percent:0;mso-width-percent:0;mso-height-percent:0" o:hralign="center" o:hrstd="t" o:hr="t" fillcolor="#a0a0a0" stroked="f"/>
+        </w:rPr>
+        <w:pict w14:anchorId="4FF6D40C">
+          <v:rect id="_x0000_i1026" alt="" style="width:451.3pt;height:.05pt;mso-width-percent:0;mso-height-percent:0;mso-width-percent:0;mso-height-percent:0" o:hralign="center" o:hrstd="t" o:hr="t" fillcolor="#a0a0a0" stroked="f"/>
         </w:pict>
       </w:r>
     </w:p>
@@ -7836,27 +7089,7 @@
           <w:lang w:eastAsia="en-GB"/>
           <w14:ligatures w14:val="none"/>
         </w:rPr>
-        <w:t xml:space="preserve">Clients must dynamically adapt to </w:t>
-      </w:r>
-      <w:proofErr w:type="spellStart"/>
-      <w:r>
-        <w:rPr>
-          <w:rFonts w:ascii="Times New Roman" w:eastAsia="Times New Roman" w:hAnsi="Times New Roman" w:cs="Times New Roman"/>
-          <w:kern w:val="0"/>
-          <w:lang w:eastAsia="en-GB"/>
-          <w14:ligatures w14:val="none"/>
-        </w:rPr>
-        <w:t>zone_no</w:t>
-      </w:r>
-      <w:proofErr w:type="spellEnd"/>
-      <w:r>
-        <w:rPr>
-          <w:rFonts w:ascii="Times New Roman" w:eastAsia="Times New Roman" w:hAnsi="Times New Roman" w:cs="Times New Roman"/>
-          <w:kern w:val="0"/>
-          <w:lang w:eastAsia="en-GB"/>
-          <w14:ligatures w14:val="none"/>
-        </w:rPr>
-        <w:t xml:space="preserve"> and presence/absence of fields.</w:t>
+        <w:t>Clients must dynamically adapt to zone_no and presence/absence of fields.</w:t>
       </w:r>
     </w:p>
     <w:p>
@@ -8062,19 +7295,9 @@
           <w:noProof/>
           <w:kern w:val="0"/>
           <w:lang w:eastAsia="en-GB"/>
-          <w14:ligatures w14:val="none"/>
-        </w:rPr>
-      </w:r>
-      <w:r>
-        <w:rPr>
-          <w:rFonts w:ascii="Times New Roman" w:eastAsia="Times New Roman" w:hAnsi="Times New Roman" w:cs="Times New Roman"/>
-          <w:noProof/>
-          <w:kern w:val="0"/>
-          <w:lang w:eastAsia="en-GB"/>
-          <w14:ligatures w14:val="none"/>
-        </w:rPr>
-        <w:pict w14:anchorId="43CDEEC0">
-          <v:rect id="_x0000_i1044" alt="" style="width:451.3pt;height:.05pt;mso-width-percent:0;mso-height-percent:0;mso-width-percent:0;mso-height-percent:0" o:hralign="center" o:hrstd="t" o:hr="t" fillcolor="#a0a0a0" stroked="f"/>
+        </w:rPr>
+        <w:pict w14:anchorId="406C9678">
+          <v:rect id="_x0000_i1025" alt="" style="width:451.3pt;height:.05pt;mso-width-percent:0;mso-height-percent:0;mso-width-percent:0;mso-height-percent:0" o:hralign="center" o:hrstd="t" o:hr="t" fillcolor="#a0a0a0" stroked="f"/>
         </w:pict>
       </w:r>
     </w:p>

</xml_diff>

<commit_message>
Update Status of project
</commit_message>
<xml_diff>
--- a/Documentation/SmartTemp TCP Protocol V2.docx
+++ b/Documentation/SmartTemp TCP Protocol V2.docx
@@ -359,6 +359,20 @@
         </w:rPr>
         <w:t>not MQTT</w:t>
       </w:r>
+      <w:r>
+        <w:rPr>
+          <w:rFonts w:ascii=".AppleSystemUIFont" w:eastAsia="Times New Roman" w:hAnsi=".AppleSystemUIFont" w:cs="Times New Roman"/>
+          <w:b/>
+          <w:bCs/>
+          <w:color w:val="0E0E0E"/>
+          <w:kern w:val="0"/>
+          <w:sz w:val="21"/>
+          <w:szCs w:val="21"/>
+          <w:lang w:eastAsia="en-GB"/>
+          <w14:ligatures w14:val="none"/>
+        </w:rPr>
+        <w:t xml:space="preserve"> – JSON based</w:t>
+      </w:r>
     </w:p>
     <w:p>
       <w:pPr>
@@ -376,8 +390,8 @@
           <w:kern w:val="0"/>
           <w:lang w:eastAsia="en-GB"/>
         </w:rPr>
-        <w:pict w14:anchorId="5FB3CBD3">
-          <v:rect id="_x0000_i1044" alt="" style="width:451.3pt;height:.05pt;mso-width-percent:0;mso-height-percent:0;mso-width-percent:0;mso-height-percent:0" o:hralign="center" o:hrstd="t" o:hr="t" fillcolor="#a0a0a0" stroked="f"/>
+        <w:pict w14:anchorId="456A7D2D">
+          <v:rect id="_x0000_i1043" alt="" style="width:451.3pt;height:.05pt;mso-width-percent:0;mso-height-percent:0;mso-width-percent:0;mso-height-percent:0" o:hralign="center" o:hrstd="t" o:hr="t" fillcolor="#a0a0a0" stroked="f"/>
         </w:pict>
       </w:r>
     </w:p>
@@ -616,6 +630,126 @@
     </w:p>
     <w:p>
       <w:pPr>
+        <w:numPr>
+          <w:ilvl w:val="0"/>
+          <w:numId w:val="17"/>
+        </w:numPr>
+        <w:spacing w:before="100" w:beforeAutospacing="1" w:after="100" w:afterAutospacing="1"/>
+        <w:rPr>
+          <w:rFonts w:ascii="Times New Roman" w:eastAsia="Times New Roman" w:hAnsi="Times New Roman" w:cs="Times New Roman"/>
+          <w:color w:val="000000"/>
+          <w:kern w:val="0"/>
+          <w:lang w:eastAsia="en-GB"/>
+          <w14:ligatures w14:val="none"/>
+        </w:rPr>
+      </w:pPr>
+      <w:r>
+        <w:rPr>
+          <w:rFonts w:ascii="Times New Roman" w:eastAsia="Times New Roman" w:hAnsi="Times New Roman" w:cs="Times New Roman"/>
+          <w:b/>
+          <w:bCs/>
+          <w:color w:val="000000"/>
+          <w:kern w:val="0"/>
+          <w:lang w:eastAsia="en-GB"/>
+          <w14:ligatures w14:val="none"/>
+        </w:rPr>
+        <w:t>Framing:</w:t>
+      </w:r>
+      <w:r>
+        <w:rPr>
+          <w:rFonts w:ascii="Times New Roman" w:eastAsia="Times New Roman" w:hAnsi="Times New Roman" w:cs="Times New Roman"/>
+          <w:color w:val="000000"/>
+          <w:kern w:val="0"/>
+          <w:lang w:eastAsia="en-GB"/>
+          <w14:ligatures w14:val="none"/>
+        </w:rPr>
+        <w:t> The device uses a non-standard registration header (</w:t>
+      </w:r>
+      <w:r>
+        <w:rPr>
+          <w:rFonts w:ascii="Courier New" w:eastAsia="Times New Roman" w:hAnsi="Courier New" w:cs="Courier New"/>
+          <w:color w:val="000000"/>
+          <w:kern w:val="0"/>
+          <w:sz w:val="20"/>
+          <w:szCs w:val="20"/>
+          <w:lang w:eastAsia="en-GB"/>
+          <w14:ligatures w14:val="none"/>
+        </w:rPr>
+        <w:t>SUB [MAC]\n</w:t>
+      </w:r>
+      <w:r>
+        <w:rPr>
+          <w:rFonts w:ascii="Times New Roman" w:eastAsia="Times New Roman" w:hAnsi="Times New Roman" w:cs="Times New Roman"/>
+          <w:color w:val="000000"/>
+          <w:kern w:val="0"/>
+          <w:lang w:eastAsia="en-GB"/>
+          <w14:ligatures w14:val="none"/>
+        </w:rPr>
+        <w:t>) followed by a stream of JSON objects.</w:t>
+      </w:r>
+    </w:p>
+    <w:p>
+      <w:pPr>
+        <w:numPr>
+          <w:ilvl w:val="0"/>
+          <w:numId w:val="17"/>
+        </w:numPr>
+        <w:spacing w:before="100" w:beforeAutospacing="1" w:after="100" w:afterAutospacing="1"/>
+        <w:rPr>
+          <w:rFonts w:ascii="Times New Roman" w:eastAsia="Times New Roman" w:hAnsi="Times New Roman" w:cs="Times New Roman"/>
+          <w:color w:val="000000"/>
+          <w:kern w:val="0"/>
+          <w:lang w:eastAsia="en-GB"/>
+          <w14:ligatures w14:val="none"/>
+        </w:rPr>
+      </w:pPr>
+      <w:r>
+        <w:rPr>
+          <w:rFonts w:ascii="Times New Roman" w:eastAsia="Times New Roman" w:hAnsi="Times New Roman" w:cs="Times New Roman"/>
+          <w:b/>
+          <w:bCs/>
+          <w:color w:val="000000"/>
+          <w:kern w:val="0"/>
+          <w:lang w:eastAsia="en-GB"/>
+          <w14:ligatures w14:val="none"/>
+        </w:rPr>
+        <w:t>Fragmentation:</w:t>
+      </w:r>
+      <w:r>
+        <w:rPr>
+          <w:rFonts w:ascii="Times New Roman" w:eastAsia="Times New Roman" w:hAnsi="Times New Roman" w:cs="Times New Roman"/>
+          <w:color w:val="000000"/>
+          <w:kern w:val="0"/>
+          <w:lang w:eastAsia="en-GB"/>
+          <w14:ligatures w14:val="none"/>
+        </w:rPr>
+        <w:t> Data arrives in small MTU chunks (10–100 bytes). The server </w:t>
+      </w:r>
+      <w:r>
+        <w:rPr>
+          <w:rFonts w:ascii="Times New Roman" w:eastAsia="Times New Roman" w:hAnsi="Times New Roman" w:cs="Times New Roman"/>
+          <w:b/>
+          <w:bCs/>
+          <w:color w:val="000000"/>
+          <w:kern w:val="0"/>
+          <w:lang w:eastAsia="en-GB"/>
+          <w14:ligatures w14:val="none"/>
+        </w:rPr>
+        <w:t>must</w:t>
+      </w:r>
+      <w:r>
+        <w:rPr>
+          <w:rFonts w:ascii="Times New Roman" w:eastAsia="Times New Roman" w:hAnsi="Times New Roman" w:cs="Times New Roman"/>
+          <w:color w:val="000000"/>
+          <w:kern w:val="0"/>
+          <w:lang w:eastAsia="en-GB"/>
+          <w14:ligatures w14:val="none"/>
+        </w:rPr>
+        <w:t> implement a bracket-matching buffer to ensure valid JSON parsing.</w:t>
+      </w:r>
+    </w:p>
+    <w:p>
+      <w:pPr>
         <w:rPr>
           <w:rFonts w:ascii="Times New Roman" w:eastAsia="Times New Roman" w:hAnsi="Times New Roman" w:cs="Times New Roman"/>
           <w:kern w:val="0"/>
@@ -630,8 +764,8 @@
           <w:kern w:val="0"/>
           <w:lang w:eastAsia="en-GB"/>
         </w:rPr>
-        <w:pict w14:anchorId="35EDA584">
-          <v:rect id="_x0000_i1043" alt="" style="width:451.3pt;height:.05pt;mso-width-percent:0;mso-height-percent:0;mso-width-percent:0;mso-height-percent:0" o:hralign="center" o:hrstd="t" o:hr="t" fillcolor="#a0a0a0" stroked="f"/>
+        <w:pict w14:anchorId="22F3C225">
+          <v:rect id="_x0000_i1042" alt="" style="width:451.3pt;height:.05pt;mso-width-percent:0;mso-height-percent:0;mso-width-percent:0;mso-height-percent:0" o:hralign="center" o:hrstd="t" o:hr="t" fillcolor="#a0a0a0" stroked="f"/>
         </w:pict>
       </w:r>
     </w:p>
@@ -841,8 +975,8 @@
           <w:kern w:val="0"/>
           <w:lang w:eastAsia="en-GB"/>
         </w:rPr>
-        <w:pict w14:anchorId="0300697C">
-          <v:rect id="_x0000_i1042" alt="" style="width:451.3pt;height:.05pt;mso-width-percent:0;mso-height-percent:0;mso-width-percent:0;mso-height-percent:0" o:hralign="center" o:hrstd="t" o:hr="t" fillcolor="#a0a0a0" stroked="f"/>
+        <w:pict w14:anchorId="37FB6302">
+          <v:rect id="_x0000_i1041" alt="" style="width:451.3pt;height:.05pt;mso-width-percent:0;mso-height-percent:0;mso-width-percent:0;mso-height-percent:0" o:hralign="center" o:hrstd="t" o:hr="t" fillcolor="#a0a0a0" stroked="f"/>
         </w:pict>
       </w:r>
     </w:p>
@@ -937,6 +1071,7 @@
           <w:lang w:eastAsia="en-GB"/>
           <w14:ligatures w14:val="none"/>
         </w:rPr>
+        <w:lastRenderedPageBreak/>
         <w:t>Direction</w:t>
       </w:r>
       <w:r>
@@ -1040,7 +1175,6 @@
           <w:lang w:eastAsia="en-GB"/>
           <w14:ligatures w14:val="none"/>
         </w:rPr>
-        <w:lastRenderedPageBreak/>
         <w:t>Example (ASCII)</w:t>
       </w:r>
       <w:r>
@@ -1099,215 +1233,23 @@
         <w:spacing w:before="100" w:beforeAutospacing="1"/>
         <w:rPr>
           <w:rFonts w:ascii="Times New Roman" w:eastAsia="Times New Roman" w:hAnsi="Times New Roman" w:cs="Times New Roman"/>
-          <w:kern w:val="0"/>
-          <w:lang w:eastAsia="en-GB"/>
-          <w14:ligatures w14:val="none"/>
-        </w:rPr>
-      </w:pPr>
-      <w:r>
-        <w:rPr>
-          <w:rFonts w:ascii="Times New Roman" w:eastAsia="Times New Roman" w:hAnsi="Times New Roman" w:cs="Times New Roman"/>
           <w:b/>
           <w:bCs/>
           <w:kern w:val="0"/>
           <w:lang w:eastAsia="en-GB"/>
           <w14:ligatures w14:val="none"/>
         </w:rPr>
-        <w:t>Notes</w:t>
-      </w:r>
-      <w:r>
-        <w:rPr>
-          <w:rFonts w:ascii="Times New Roman" w:eastAsia="Times New Roman" w:hAnsi="Times New Roman" w:cs="Times New Roman"/>
-          <w:kern w:val="0"/>
-          <w:lang w:eastAsia="en-GB"/>
-          <w14:ligatures w14:val="none"/>
-        </w:rPr>
-        <w:t>:</w:t>
-      </w:r>
-    </w:p>
-    <w:p>
-      <w:pPr>
-        <w:numPr>
-          <w:ilvl w:val="0"/>
-          <w:numId w:val="3"/>
-        </w:numPr>
-        <w:spacing w:after="100" w:afterAutospacing="1"/>
-        <w:ind w:left="714" w:hanging="357"/>
-        <w:rPr>
-          <w:rFonts w:ascii="Times New Roman" w:eastAsia="Times New Roman" w:hAnsi="Times New Roman" w:cs="Times New Roman"/>
-          <w:kern w:val="0"/>
-          <w:lang w:eastAsia="en-GB"/>
-          <w14:ligatures w14:val="none"/>
-        </w:rPr>
-      </w:pPr>
-      <w:r>
-        <w:rPr>
-          <w:rFonts w:ascii="Times New Roman" w:eastAsia="Times New Roman" w:hAnsi="Times New Roman" w:cs="Times New Roman"/>
-          <w:kern w:val="0"/>
-          <w:lang w:eastAsia="en-GB"/>
-          <w14:ligatures w14:val="none"/>
-        </w:rPr>
-        <w:t>Sent at connection startup</w:t>
-      </w:r>
-    </w:p>
-    <w:p>
-      <w:pPr>
-        <w:numPr>
-          <w:ilvl w:val="0"/>
-          <w:numId w:val="3"/>
-        </w:numPr>
-        <w:spacing w:before="100" w:beforeAutospacing="1" w:after="100" w:afterAutospacing="1"/>
-        <w:rPr>
-          <w:rFonts w:ascii="Times New Roman" w:eastAsia="Times New Roman" w:hAnsi="Times New Roman" w:cs="Times New Roman"/>
-          <w:kern w:val="0"/>
-          <w:lang w:eastAsia="en-GB"/>
-          <w14:ligatures w14:val="none"/>
-        </w:rPr>
-      </w:pPr>
-      <w:r>
-        <w:rPr>
-          <w:rFonts w:ascii="Times New Roman" w:eastAsia="Times New Roman" w:hAnsi="Times New Roman" w:cs="Times New Roman"/>
-          <w:kern w:val="0"/>
-          <w:lang w:eastAsia="en-GB"/>
-          <w14:ligatures w14:val="none"/>
-        </w:rPr>
-        <w:t>May be sent multiple times</w:t>
-      </w:r>
-    </w:p>
-    <w:p>
-      <w:pPr>
-        <w:numPr>
-          <w:ilvl w:val="0"/>
-          <w:numId w:val="3"/>
-        </w:numPr>
-        <w:spacing w:before="100" w:beforeAutospacing="1" w:after="100" w:afterAutospacing="1"/>
-        <w:rPr>
-          <w:rFonts w:ascii="Times New Roman" w:eastAsia="Times New Roman" w:hAnsi="Times New Roman" w:cs="Times New Roman"/>
-          <w:kern w:val="0"/>
-          <w:lang w:eastAsia="en-GB"/>
-          <w14:ligatures w14:val="none"/>
-        </w:rPr>
-      </w:pPr>
-      <w:r>
-        <w:rPr>
-          <w:rFonts w:ascii="Times New Roman" w:eastAsia="Times New Roman" w:hAnsi="Times New Roman" w:cs="Times New Roman"/>
-          <w:kern w:val="0"/>
-          <w:lang w:eastAsia="en-GB"/>
-          <w14:ligatures w14:val="none"/>
-        </w:rPr>
-        <w:t>Must be forwarded verbatim</w:t>
-      </w:r>
-    </w:p>
-    <w:p>
-      <w:pPr>
-        <w:rPr>
-          <w:rFonts w:ascii="Times New Roman" w:eastAsia="Times New Roman" w:hAnsi="Times New Roman" w:cs="Times New Roman"/>
-          <w:kern w:val="0"/>
-          <w:lang w:eastAsia="en-GB"/>
-          <w14:ligatures w14:val="none"/>
-        </w:rPr>
-      </w:pPr>
-      <w:r>
-        <w:rPr>
-          <w:rFonts w:ascii="Times New Roman" w:eastAsia="Times New Roman" w:hAnsi="Times New Roman" w:cs="Times New Roman"/>
-          <w:noProof/>
-          <w:kern w:val="0"/>
-          <w:lang w:eastAsia="en-GB"/>
-        </w:rPr>
-        <w:pict w14:anchorId="5162476E">
-          <v:rect id="_x0000_i1041" alt="" style="width:451.3pt;height:.05pt;mso-width-percent:0;mso-height-percent:0;mso-width-percent:0;mso-height-percent:0" o:hralign="center" o:hrstd="t" o:hr="t" fillcolor="#a0a0a0" stroked="f"/>
-        </w:pict>
-      </w:r>
-    </w:p>
-    <w:p>
-      <w:pPr>
-        <w:spacing w:before="100" w:beforeAutospacing="1" w:after="100" w:afterAutospacing="1"/>
-        <w:outlineLvl w:val="2"/>
+      </w:pPr>
+      <w:r>
         <w:rPr>
           <w:rFonts w:ascii="Times New Roman" w:eastAsia="Times New Roman" w:hAnsi="Times New Roman" w:cs="Times New Roman"/>
           <w:b/>
           <w:bCs/>
           <w:kern w:val="0"/>
-          <w:sz w:val="27"/>
-          <w:szCs w:val="27"/>
-          <w:lang w:eastAsia="en-GB"/>
-          <w14:ligatures w14:val="none"/>
-        </w:rPr>
-      </w:pPr>
-      <w:r>
-        <w:rPr>
-          <w:rFonts w:ascii="Times New Roman" w:eastAsia="Times New Roman" w:hAnsi="Times New Roman" w:cs="Times New Roman"/>
-          <w:b/>
-          <w:bCs/>
-          <w:kern w:val="0"/>
-          <w:sz w:val="27"/>
-          <w:szCs w:val="27"/>
-          <w:lang w:eastAsia="en-GB"/>
-          <w14:ligatures w14:val="none"/>
-        </w:rPr>
-        <w:t>3.2 Heartbeat</w:t>
-      </w:r>
-    </w:p>
-    <w:p>
-      <w:pPr>
-        <w:spacing w:before="100" w:beforeAutospacing="1" w:after="100" w:afterAutospacing="1"/>
-        <w:rPr>
-          <w:rFonts w:ascii="Times New Roman" w:eastAsia="Times New Roman" w:hAnsi="Times New Roman" w:cs="Times New Roman"/>
-          <w:kern w:val="0"/>
-          <w:lang w:eastAsia="en-GB"/>
-          <w14:ligatures w14:val="none"/>
-        </w:rPr>
-      </w:pPr>
-      <w:r>
-        <w:rPr>
-          <w:rFonts w:ascii="Times New Roman" w:eastAsia="Times New Roman" w:hAnsi="Times New Roman" w:cs="Times New Roman"/>
-          <w:b/>
-          <w:bCs/>
-          <w:kern w:val="0"/>
-          <w:lang w:eastAsia="en-GB"/>
-          <w14:ligatures w14:val="none"/>
-        </w:rPr>
-        <w:t>Direction</w:t>
-      </w:r>
-      <w:r>
-        <w:rPr>
-          <w:rFonts w:ascii="Times New Roman" w:eastAsia="Times New Roman" w:hAnsi="Times New Roman" w:cs="Times New Roman"/>
-          <w:kern w:val="0"/>
-          <w:lang w:eastAsia="en-GB"/>
-          <w14:ligatures w14:val="none"/>
-        </w:rPr>
-        <w:t>: Device → Cloud</w:t>
-      </w:r>
-    </w:p>
-    <w:p>
-      <w:pPr>
-        <w:spacing w:before="100" w:beforeAutospacing="1" w:after="100" w:afterAutospacing="1"/>
-        <w:rPr>
-          <w:rFonts w:ascii="Times New Roman" w:eastAsia="Times New Roman" w:hAnsi="Times New Roman" w:cs="Times New Roman"/>
-          <w:kern w:val="0"/>
-          <w:lang w:eastAsia="en-GB"/>
-          <w14:ligatures w14:val="none"/>
-        </w:rPr>
-      </w:pPr>
-      <w:r>
-        <w:rPr>
-          <w:rFonts w:ascii="Times New Roman" w:eastAsia="Times New Roman" w:hAnsi="Times New Roman" w:cs="Times New Roman"/>
-          <w:b/>
-          <w:bCs/>
-          <w:kern w:val="0"/>
-          <w:lang w:eastAsia="en-GB"/>
-          <w14:ligatures w14:val="none"/>
-        </w:rPr>
-        <w:t>Format</w:t>
-      </w:r>
-      <w:r>
-        <w:rPr>
-          <w:rFonts w:ascii="Times New Roman" w:eastAsia="Times New Roman" w:hAnsi="Times New Roman" w:cs="Times New Roman"/>
-          <w:kern w:val="0"/>
-          <w:lang w:eastAsia="en-GB"/>
-          <w14:ligatures w14:val="none"/>
-        </w:rPr>
-        <w:t>:</w:t>
+          <w:lang w:eastAsia="en-GB"/>
+          <w14:ligatures w14:val="none"/>
+        </w:rPr>
+        <w:t xml:space="preserve">Response </w:t>
       </w:r>
     </w:p>
     <w:p>
@@ -1348,6 +1290,462 @@
           <w:lang w:eastAsia="en-GB"/>
           <w14:ligatures w14:val="none"/>
         </w:rPr>
+        <w:t>{</w:t>
+      </w:r>
+    </w:p>
+    <w:p>
+      <w:pPr>
+        <w:tabs>
+          <w:tab w:val="left" w:pos="916"/>
+          <w:tab w:val="left" w:pos="1832"/>
+          <w:tab w:val="left" w:pos="2748"/>
+          <w:tab w:val="left" w:pos="3664"/>
+          <w:tab w:val="left" w:pos="4580"/>
+          <w:tab w:val="left" w:pos="5496"/>
+          <w:tab w:val="left" w:pos="6412"/>
+          <w:tab w:val="left" w:pos="7328"/>
+          <w:tab w:val="left" w:pos="8244"/>
+          <w:tab w:val="left" w:pos="9160"/>
+          <w:tab w:val="left" w:pos="10076"/>
+          <w:tab w:val="left" w:pos="10992"/>
+          <w:tab w:val="left" w:pos="11908"/>
+          <w:tab w:val="left" w:pos="12824"/>
+          <w:tab w:val="left" w:pos="13740"/>
+          <w:tab w:val="left" w:pos="14656"/>
+        </w:tabs>
+        <w:rPr>
+          <w:rFonts w:ascii="Courier New" w:eastAsia="Times New Roman" w:hAnsi="Courier New" w:cs="Courier New"/>
+          <w:kern w:val="0"/>
+          <w:sz w:val="20"/>
+          <w:szCs w:val="20"/>
+          <w:lang w:eastAsia="en-GB"/>
+          <w14:ligatures w14:val="none"/>
+        </w:rPr>
+      </w:pPr>
+      <w:r>
+        <w:rPr>
+          <w:rFonts w:ascii="Courier New" w:eastAsia="Times New Roman" w:hAnsi="Courier New" w:cs="Courier New"/>
+          <w:kern w:val="0"/>
+          <w:sz w:val="20"/>
+          <w:szCs w:val="20"/>
+          <w:lang w:eastAsia="en-GB"/>
+          <w14:ligatures w14:val="none"/>
+        </w:rPr>
+        <w:t xml:space="preserve">  "</w:t>
+      </w:r>
+      <w:r>
+        <w:rPr>
+          <w:rFonts w:ascii="Courier New" w:eastAsia="Times New Roman" w:hAnsi="Courier New" w:cs="Courier New"/>
+          <w:kern w:val="0"/>
+          <w:sz w:val="20"/>
+          <w:szCs w:val="20"/>
+          <w:lang w:eastAsia="en-GB"/>
+          <w14:ligatures w14:val="none"/>
+        </w:rPr>
+        <w:t>local_time</w:t>
+      </w:r>
+      <w:r>
+        <w:rPr>
+          <w:rFonts w:ascii="Courier New" w:eastAsia="Times New Roman" w:hAnsi="Courier New" w:cs="Courier New"/>
+          <w:kern w:val="0"/>
+          <w:sz w:val="20"/>
+          <w:szCs w:val="20"/>
+          <w:lang w:eastAsia="en-GB"/>
+          <w14:ligatures w14:val="none"/>
+        </w:rPr>
+        <w:t>": 4,</w:t>
+      </w:r>
+    </w:p>
+    <w:p>
+      <w:pPr>
+        <w:tabs>
+          <w:tab w:val="left" w:pos="916"/>
+          <w:tab w:val="left" w:pos="1832"/>
+          <w:tab w:val="left" w:pos="2748"/>
+          <w:tab w:val="left" w:pos="3664"/>
+          <w:tab w:val="left" w:pos="4580"/>
+          <w:tab w:val="left" w:pos="5496"/>
+          <w:tab w:val="left" w:pos="6412"/>
+          <w:tab w:val="left" w:pos="7328"/>
+          <w:tab w:val="left" w:pos="8244"/>
+          <w:tab w:val="left" w:pos="9160"/>
+          <w:tab w:val="left" w:pos="10076"/>
+          <w:tab w:val="left" w:pos="10992"/>
+          <w:tab w:val="left" w:pos="11908"/>
+          <w:tab w:val="left" w:pos="12824"/>
+          <w:tab w:val="left" w:pos="13740"/>
+          <w:tab w:val="left" w:pos="14656"/>
+        </w:tabs>
+        <w:rPr>
+          <w:rFonts w:ascii="Courier New" w:eastAsia="Times New Roman" w:hAnsi="Courier New" w:cs="Courier New"/>
+          <w:kern w:val="0"/>
+          <w:sz w:val="20"/>
+          <w:szCs w:val="20"/>
+          <w:lang w:eastAsia="en-GB"/>
+          <w14:ligatures w14:val="none"/>
+        </w:rPr>
+      </w:pPr>
+      <w:r>
+        <w:rPr>
+          <w:rFonts w:ascii="Courier New" w:eastAsia="Times New Roman" w:hAnsi="Courier New" w:cs="Courier New"/>
+          <w:kern w:val="0"/>
+          <w:sz w:val="20"/>
+          <w:szCs w:val="20"/>
+          <w:lang w:eastAsia="en-GB"/>
+          <w14:ligatures w14:val="none"/>
+        </w:rPr>
+        <w:t xml:space="preserve">  "MsgID": "20251227164121",</w:t>
+      </w:r>
+    </w:p>
+    <w:p>
+      <w:pPr>
+        <w:tabs>
+          <w:tab w:val="left" w:pos="916"/>
+          <w:tab w:val="left" w:pos="1832"/>
+          <w:tab w:val="left" w:pos="2748"/>
+          <w:tab w:val="left" w:pos="3664"/>
+          <w:tab w:val="left" w:pos="4580"/>
+          <w:tab w:val="left" w:pos="5496"/>
+          <w:tab w:val="left" w:pos="6412"/>
+          <w:tab w:val="left" w:pos="7328"/>
+          <w:tab w:val="left" w:pos="8244"/>
+          <w:tab w:val="left" w:pos="9160"/>
+          <w:tab w:val="left" w:pos="10076"/>
+          <w:tab w:val="left" w:pos="10992"/>
+          <w:tab w:val="left" w:pos="11908"/>
+          <w:tab w:val="left" w:pos="12824"/>
+          <w:tab w:val="left" w:pos="13740"/>
+          <w:tab w:val="left" w:pos="14656"/>
+        </w:tabs>
+        <w:rPr>
+          <w:rFonts w:ascii="Courier New" w:eastAsia="Times New Roman" w:hAnsi="Courier New" w:cs="Courier New"/>
+          <w:kern w:val="0"/>
+          <w:sz w:val="20"/>
+          <w:szCs w:val="20"/>
+          <w:lang w:eastAsia="en-GB"/>
+          <w14:ligatures w14:val="none"/>
+        </w:rPr>
+      </w:pPr>
+      <w:r>
+        <w:rPr>
+          <w:rFonts w:ascii="Courier New" w:eastAsia="Times New Roman" w:hAnsi="Courier New" w:cs="Courier New"/>
+          <w:kern w:val="0"/>
+          <w:sz w:val="20"/>
+          <w:szCs w:val="20"/>
+          <w:lang w:eastAsia="en-GB"/>
+          <w14:ligatures w14:val="none"/>
+        </w:rPr>
+        <w:t xml:space="preserve">  "mac": "289C6E309AA6"</w:t>
+      </w:r>
+    </w:p>
+    <w:p>
+      <w:pPr>
+        <w:tabs>
+          <w:tab w:val="left" w:pos="916"/>
+          <w:tab w:val="left" w:pos="1832"/>
+          <w:tab w:val="left" w:pos="2748"/>
+          <w:tab w:val="left" w:pos="3664"/>
+          <w:tab w:val="left" w:pos="4580"/>
+          <w:tab w:val="left" w:pos="5496"/>
+          <w:tab w:val="left" w:pos="6412"/>
+          <w:tab w:val="left" w:pos="7328"/>
+          <w:tab w:val="left" w:pos="8244"/>
+          <w:tab w:val="left" w:pos="9160"/>
+          <w:tab w:val="left" w:pos="10076"/>
+          <w:tab w:val="left" w:pos="10992"/>
+          <w:tab w:val="left" w:pos="11908"/>
+          <w:tab w:val="left" w:pos="12824"/>
+          <w:tab w:val="left" w:pos="13740"/>
+          <w:tab w:val="left" w:pos="14656"/>
+        </w:tabs>
+        <w:rPr>
+          <w:rFonts w:ascii="Courier New" w:eastAsia="Times New Roman" w:hAnsi="Courier New" w:cs="Courier New"/>
+          <w:kern w:val="0"/>
+          <w:sz w:val="20"/>
+          <w:szCs w:val="20"/>
+          <w:lang w:eastAsia="en-GB"/>
+          <w14:ligatures w14:val="none"/>
+        </w:rPr>
+      </w:pPr>
+      <w:r>
+        <w:rPr>
+          <w:rFonts w:ascii="Courier New" w:eastAsia="Times New Roman" w:hAnsi="Courier New" w:cs="Courier New"/>
+          <w:kern w:val="0"/>
+          <w:sz w:val="20"/>
+          <w:szCs w:val="20"/>
+          <w:lang w:eastAsia="en-GB"/>
+          <w14:ligatures w14:val="none"/>
+        </w:rPr>
+        <w:t>}</w:t>
+      </w:r>
+    </w:p>
+    <w:p>
+      <w:pPr>
+        <w:spacing w:before="100" w:beforeAutospacing="1"/>
+        <w:rPr>
+          <w:rFonts w:ascii="Times New Roman" w:eastAsia="Times New Roman" w:hAnsi="Times New Roman" w:cs="Times New Roman"/>
+          <w:b/>
+          <w:bCs/>
+          <w:kern w:val="0"/>
+          <w:lang w:eastAsia="en-GB"/>
+          <w14:ligatures w14:val="none"/>
+        </w:rPr>
+      </w:pPr>
+    </w:p>
+    <w:p>
+      <w:pPr>
+        <w:spacing w:before="100" w:beforeAutospacing="1"/>
+        <w:rPr>
+          <w:rFonts w:ascii="Times New Roman" w:eastAsia="Times New Roman" w:hAnsi="Times New Roman" w:cs="Times New Roman"/>
+          <w:kern w:val="0"/>
+          <w:lang w:eastAsia="en-GB"/>
+          <w14:ligatures w14:val="none"/>
+        </w:rPr>
+      </w:pPr>
+      <w:r>
+        <w:rPr>
+          <w:rFonts w:ascii="Times New Roman" w:eastAsia="Times New Roman" w:hAnsi="Times New Roman" w:cs="Times New Roman"/>
+          <w:b/>
+          <w:bCs/>
+          <w:kern w:val="0"/>
+          <w:lang w:eastAsia="en-GB"/>
+          <w14:ligatures w14:val="none"/>
+        </w:rPr>
+        <w:t>Notes</w:t>
+      </w:r>
+      <w:r>
+        <w:rPr>
+          <w:rFonts w:ascii="Times New Roman" w:eastAsia="Times New Roman" w:hAnsi="Times New Roman" w:cs="Times New Roman"/>
+          <w:kern w:val="0"/>
+          <w:lang w:eastAsia="en-GB"/>
+          <w14:ligatures w14:val="none"/>
+        </w:rPr>
+        <w:t>:</w:t>
+      </w:r>
+    </w:p>
+    <w:p>
+      <w:pPr>
+        <w:numPr>
+          <w:ilvl w:val="0"/>
+          <w:numId w:val="3"/>
+        </w:numPr>
+        <w:spacing w:after="100" w:afterAutospacing="1"/>
+        <w:ind w:left="714" w:hanging="357"/>
+        <w:rPr>
+          <w:rFonts w:ascii="Times New Roman" w:eastAsia="Times New Roman" w:hAnsi="Times New Roman" w:cs="Times New Roman"/>
+          <w:kern w:val="0"/>
+          <w:lang w:eastAsia="en-GB"/>
+          <w14:ligatures w14:val="none"/>
+        </w:rPr>
+      </w:pPr>
+      <w:r>
+        <w:rPr>
+          <w:rFonts w:ascii="Times New Roman" w:eastAsia="Times New Roman" w:hAnsi="Times New Roman" w:cs="Times New Roman"/>
+          <w:kern w:val="0"/>
+          <w:lang w:eastAsia="en-GB"/>
+          <w14:ligatures w14:val="none"/>
+        </w:rPr>
+        <w:t>Sent at connection startup</w:t>
+      </w:r>
+    </w:p>
+    <w:p>
+      <w:pPr>
+        <w:numPr>
+          <w:ilvl w:val="0"/>
+          <w:numId w:val="3"/>
+        </w:numPr>
+        <w:spacing w:before="100" w:beforeAutospacing="1" w:after="100" w:afterAutospacing="1"/>
+        <w:rPr>
+          <w:rFonts w:ascii="Times New Roman" w:eastAsia="Times New Roman" w:hAnsi="Times New Roman" w:cs="Times New Roman"/>
+          <w:kern w:val="0"/>
+          <w:lang w:eastAsia="en-GB"/>
+          <w14:ligatures w14:val="none"/>
+        </w:rPr>
+      </w:pPr>
+      <w:r>
+        <w:rPr>
+          <w:rFonts w:ascii="Times New Roman" w:eastAsia="Times New Roman" w:hAnsi="Times New Roman" w:cs="Times New Roman"/>
+          <w:kern w:val="0"/>
+          <w:lang w:eastAsia="en-GB"/>
+          <w14:ligatures w14:val="none"/>
+        </w:rPr>
+        <w:t>May be sent multiple times</w:t>
+      </w:r>
+    </w:p>
+    <w:p>
+      <w:pPr>
+        <w:numPr>
+          <w:ilvl w:val="0"/>
+          <w:numId w:val="3"/>
+        </w:numPr>
+        <w:spacing w:before="100" w:beforeAutospacing="1" w:after="100" w:afterAutospacing="1"/>
+        <w:rPr>
+          <w:rFonts w:ascii="Times New Roman" w:eastAsia="Times New Roman" w:hAnsi="Times New Roman" w:cs="Times New Roman"/>
+          <w:kern w:val="0"/>
+          <w:lang w:eastAsia="en-GB"/>
+          <w14:ligatures w14:val="none"/>
+        </w:rPr>
+      </w:pPr>
+      <w:r>
+        <w:rPr>
+          <w:rFonts w:ascii="Times New Roman" w:eastAsia="Times New Roman" w:hAnsi="Times New Roman" w:cs="Times New Roman"/>
+          <w:kern w:val="0"/>
+          <w:lang w:eastAsia="en-GB"/>
+          <w14:ligatures w14:val="none"/>
+        </w:rPr>
+        <w:t>Must be forwarded verbatim</w:t>
+      </w:r>
+    </w:p>
+    <w:p>
+      <w:pPr>
+        <w:rPr>
+          <w:rFonts w:ascii="Times New Roman" w:eastAsia="Times New Roman" w:hAnsi="Times New Roman" w:cs="Times New Roman"/>
+          <w:kern w:val="0"/>
+          <w:lang w:eastAsia="en-GB"/>
+          <w14:ligatures w14:val="none"/>
+        </w:rPr>
+      </w:pPr>
+      <w:r>
+        <w:rPr>
+          <w:rFonts w:ascii="Times New Roman" w:eastAsia="Times New Roman" w:hAnsi="Times New Roman" w:cs="Times New Roman"/>
+          <w:noProof/>
+          <w:kern w:val="0"/>
+          <w:lang w:eastAsia="en-GB"/>
+        </w:rPr>
+        <w:pict w14:anchorId="62F0915E">
+          <v:rect id="_x0000_i1040" alt="" style="width:451.3pt;height:.05pt;mso-width-percent:0;mso-height-percent:0;mso-width-percent:0;mso-height-percent:0" o:hralign="center" o:hrstd="t" o:hr="t" fillcolor="#a0a0a0" stroked="f"/>
+        </w:pict>
+      </w:r>
+    </w:p>
+    <w:p>
+      <w:pPr>
+        <w:spacing w:before="100" w:beforeAutospacing="1" w:after="100" w:afterAutospacing="1"/>
+        <w:outlineLvl w:val="2"/>
+        <w:rPr>
+          <w:rFonts w:ascii="Times New Roman" w:eastAsia="Times New Roman" w:hAnsi="Times New Roman" w:cs="Times New Roman"/>
+          <w:b/>
+          <w:bCs/>
+          <w:kern w:val="0"/>
+          <w:sz w:val="27"/>
+          <w:szCs w:val="27"/>
+          <w:lang w:eastAsia="en-GB"/>
+          <w14:ligatures w14:val="none"/>
+        </w:rPr>
+      </w:pPr>
+      <w:r>
+        <w:rPr>
+          <w:rFonts w:ascii="Times New Roman" w:eastAsia="Times New Roman" w:hAnsi="Times New Roman" w:cs="Times New Roman"/>
+          <w:b/>
+          <w:bCs/>
+          <w:kern w:val="0"/>
+          <w:sz w:val="27"/>
+          <w:szCs w:val="27"/>
+          <w:lang w:eastAsia="en-GB"/>
+          <w14:ligatures w14:val="none"/>
+        </w:rPr>
+        <w:t>3.2 Heartbeat</w:t>
+      </w:r>
+    </w:p>
+    <w:p>
+      <w:pPr>
+        <w:spacing w:before="100" w:beforeAutospacing="1" w:after="100" w:afterAutospacing="1"/>
+        <w:rPr>
+          <w:rFonts w:ascii="Times New Roman" w:eastAsia="Times New Roman" w:hAnsi="Times New Roman" w:cs="Times New Roman"/>
+          <w:kern w:val="0"/>
+          <w:lang w:eastAsia="en-GB"/>
+          <w14:ligatures w14:val="none"/>
+        </w:rPr>
+      </w:pPr>
+      <w:r>
+        <w:rPr>
+          <w:rFonts w:ascii="Times New Roman" w:eastAsia="Times New Roman" w:hAnsi="Times New Roman" w:cs="Times New Roman"/>
+          <w:b/>
+          <w:bCs/>
+          <w:kern w:val="0"/>
+          <w:lang w:eastAsia="en-GB"/>
+          <w14:ligatures w14:val="none"/>
+        </w:rPr>
+        <w:t>Direction</w:t>
+      </w:r>
+      <w:r>
+        <w:rPr>
+          <w:rFonts w:ascii="Times New Roman" w:eastAsia="Times New Roman" w:hAnsi="Times New Roman" w:cs="Times New Roman"/>
+          <w:kern w:val="0"/>
+          <w:lang w:eastAsia="en-GB"/>
+          <w14:ligatures w14:val="none"/>
+        </w:rPr>
+        <w:t>: Device → Cloud</w:t>
+      </w:r>
+    </w:p>
+    <w:p>
+      <w:pPr>
+        <w:spacing w:before="100" w:beforeAutospacing="1" w:after="100" w:afterAutospacing="1"/>
+        <w:rPr>
+          <w:rFonts w:ascii="Times New Roman" w:eastAsia="Times New Roman" w:hAnsi="Times New Roman" w:cs="Times New Roman"/>
+          <w:kern w:val="0"/>
+          <w:lang w:eastAsia="en-GB"/>
+          <w14:ligatures w14:val="none"/>
+        </w:rPr>
+      </w:pPr>
+      <w:r>
+        <w:rPr>
+          <w:rFonts w:ascii="Times New Roman" w:eastAsia="Times New Roman" w:hAnsi="Times New Roman" w:cs="Times New Roman"/>
+          <w:b/>
+          <w:bCs/>
+          <w:kern w:val="0"/>
+          <w:lang w:eastAsia="en-GB"/>
+          <w14:ligatures w14:val="none"/>
+        </w:rPr>
+        <w:t>Format</w:t>
+      </w:r>
+      <w:r>
+        <w:rPr>
+          <w:rFonts w:ascii="Times New Roman" w:eastAsia="Times New Roman" w:hAnsi="Times New Roman" w:cs="Times New Roman"/>
+          <w:kern w:val="0"/>
+          <w:lang w:eastAsia="en-GB"/>
+          <w14:ligatures w14:val="none"/>
+        </w:rPr>
+        <w:t>:</w:t>
+      </w:r>
+    </w:p>
+    <w:p>
+      <w:pPr>
+        <w:tabs>
+          <w:tab w:val="left" w:pos="916"/>
+          <w:tab w:val="left" w:pos="1832"/>
+          <w:tab w:val="left" w:pos="2748"/>
+          <w:tab w:val="left" w:pos="3664"/>
+          <w:tab w:val="left" w:pos="4580"/>
+          <w:tab w:val="left" w:pos="5496"/>
+          <w:tab w:val="left" w:pos="6412"/>
+          <w:tab w:val="left" w:pos="7328"/>
+          <w:tab w:val="left" w:pos="8244"/>
+          <w:tab w:val="left" w:pos="9160"/>
+          <w:tab w:val="left" w:pos="10076"/>
+          <w:tab w:val="left" w:pos="10992"/>
+          <w:tab w:val="left" w:pos="11908"/>
+          <w:tab w:val="left" w:pos="12824"/>
+          <w:tab w:val="left" w:pos="13740"/>
+          <w:tab w:val="left" w:pos="14656"/>
+        </w:tabs>
+        <w:rPr>
+          <w:rFonts w:ascii="Courier New" w:eastAsia="Times New Roman" w:hAnsi="Courier New" w:cs="Courier New"/>
+          <w:kern w:val="0"/>
+          <w:sz w:val="20"/>
+          <w:szCs w:val="20"/>
+          <w:lang w:eastAsia="en-GB"/>
+          <w14:ligatures w14:val="none"/>
+        </w:rPr>
+      </w:pPr>
+      <w:r>
+        <w:rPr>
+          <w:rFonts w:ascii="Courier New" w:eastAsia="Times New Roman" w:hAnsi="Courier New" w:cs="Courier New"/>
+          <w:kern w:val="0"/>
+          <w:sz w:val="20"/>
+          <w:szCs w:val="20"/>
+          <w:lang w:eastAsia="en-GB"/>
+          <w14:ligatures w14:val="none"/>
+        </w:rPr>
         <w:t>__heartbeat__\n</w:t>
       </w:r>
     </w:p>
@@ -1449,6 +1847,64 @@
           <w:lang w:eastAsia="en-GB"/>
           <w14:ligatures w14:val="none"/>
         </w:rPr>
+        <w:t xml:space="preserve">Response: </w:t>
+      </w:r>
+      <w:r>
+        <w:rPr>
+          <w:rFonts w:ascii="Times New Roman" w:eastAsia="Times New Roman" w:hAnsi="Times New Roman" w:cs="Times New Roman"/>
+          <w:kern w:val="0"/>
+          <w:lang w:eastAsia="en-GB"/>
+          <w14:ligatures w14:val="none"/>
+        </w:rPr>
+        <w:t xml:space="preserve">standard </w:t>
+      </w:r>
+      <w:r>
+        <w:rPr>
+          <w:rFonts w:ascii="Times New Roman" w:eastAsia="Times New Roman" w:hAnsi="Times New Roman" w:cs="Times New Roman"/>
+          <w:kern w:val="0"/>
+          <w:lang w:eastAsia="en-GB"/>
+          <w14:ligatures w14:val="none"/>
+        </w:rPr>
+        <w:t>c</w:t>
+      </w:r>
+      <w:r>
+        <w:rPr>
+          <w:rFonts w:ascii="Times New Roman" w:eastAsia="Times New Roman" w:hAnsi="Times New Roman" w:cs="Times New Roman"/>
+          <w:kern w:val="0"/>
+          <w:lang w:eastAsia="en-GB"/>
+          <w14:ligatures w14:val="none"/>
+        </w:rPr>
+        <w:t xml:space="preserve">loud Acknowledgement </w:t>
+      </w:r>
+      <w:r>
+        <w:rPr>
+          <w:rFonts w:ascii="Times New Roman" w:eastAsia="Times New Roman" w:hAnsi="Times New Roman" w:cs="Times New Roman"/>
+          <w:kern w:val="0"/>
+          <w:lang w:eastAsia="en-GB"/>
+          <w14:ligatures w14:val="none"/>
+        </w:rPr>
+        <w:t>(see 10.)</w:t>
+      </w:r>
+    </w:p>
+    <w:p>
+      <w:pPr>
+        <w:spacing w:before="100" w:beforeAutospacing="1" w:after="100" w:afterAutospacing="1"/>
+        <w:rPr>
+          <w:rFonts w:ascii="Times New Roman" w:eastAsia="Times New Roman" w:hAnsi="Times New Roman" w:cs="Times New Roman"/>
+          <w:kern w:val="0"/>
+          <w:lang w:eastAsia="en-GB"/>
+          <w14:ligatures w14:val="none"/>
+        </w:rPr>
+      </w:pPr>
+      <w:r>
+        <w:rPr>
+          <w:rFonts w:ascii="Times New Roman" w:eastAsia="Times New Roman" w:hAnsi="Times New Roman" w:cs="Times New Roman"/>
+          <w:b/>
+          <w:bCs/>
+          <w:kern w:val="0"/>
+          <w:lang w:eastAsia="en-GB"/>
+          <w14:ligatures w14:val="none"/>
+        </w:rPr>
         <w:t>Frequency</w:t>
       </w:r>
       <w:r>
@@ -1460,21 +1916,15 @@
         </w:rPr>
         <w:t>:</w:t>
       </w:r>
-    </w:p>
-    <w:p>
-      <w:pPr>
-        <w:numPr>
-          <w:ilvl w:val="0"/>
-          <w:numId w:val="5"/>
-        </w:numPr>
-        <w:spacing w:before="100" w:beforeAutospacing="1" w:after="100" w:afterAutospacing="1"/>
-        <w:rPr>
-          <w:rFonts w:ascii="Times New Roman" w:eastAsia="Times New Roman" w:hAnsi="Times New Roman" w:cs="Times New Roman"/>
-          <w:kern w:val="0"/>
-          <w:lang w:eastAsia="en-GB"/>
-          <w14:ligatures w14:val="none"/>
-        </w:rPr>
-      </w:pPr>
+      <w:r>
+        <w:rPr>
+          <w:rFonts w:ascii="Times New Roman" w:eastAsia="Times New Roman" w:hAnsi="Times New Roman" w:cs="Times New Roman"/>
+          <w:kern w:val="0"/>
+          <w:lang w:eastAsia="en-GB"/>
+          <w14:ligatures w14:val="none"/>
+        </w:rPr>
+        <w:t xml:space="preserve"> </w:t>
+      </w:r>
       <w:r>
         <w:rPr>
           <w:rFonts w:ascii="Times New Roman" w:eastAsia="Times New Roman" w:hAnsi="Times New Roman" w:cs="Times New Roman"/>
@@ -1501,8 +1951,8 @@
           <w:kern w:val="0"/>
           <w:lang w:eastAsia="en-GB"/>
         </w:rPr>
-        <w:pict w14:anchorId="030A439B">
-          <v:rect id="_x0000_i1040" alt="" style="width:451.3pt;height:.05pt;mso-width-percent:0;mso-height-percent:0;mso-width-percent:0;mso-height-percent:0" o:hralign="center" o:hrstd="t" o:hr="t" fillcolor="#a0a0a0" stroked="f"/>
+        <w:pict w14:anchorId="294C90CE">
+          <v:rect id="_x0000_i1039" alt="" style="width:451.3pt;height:.05pt;mso-width-percent:0;mso-height-percent:0;mso-width-percent:0;mso-height-percent:0" o:hralign="center" o:hrstd="t" o:hr="t" fillcolor="#a0a0a0" stroked="f"/>
         </w:pict>
       </w:r>
     </w:p>
@@ -1619,6 +2069,7 @@
           <w:lang w:eastAsia="en-GB"/>
           <w14:ligatures w14:val="none"/>
         </w:rPr>
+        <w:lastRenderedPageBreak/>
         <w:t>Pretty</w:t>
       </w:r>
       <w:r>
@@ -1724,6 +2175,44 @@
     </w:p>
     <w:p>
       <w:pPr>
+        <w:spacing w:before="100" w:beforeAutospacing="1" w:after="100" w:afterAutospacing="1"/>
+        <w:rPr>
+          <w:rFonts w:ascii="Times New Roman" w:eastAsia="Times New Roman" w:hAnsi="Times New Roman" w:cs="Times New Roman"/>
+          <w:kern w:val="0"/>
+          <w:lang w:eastAsia="en-GB"/>
+          <w14:ligatures w14:val="none"/>
+        </w:rPr>
+      </w:pPr>
+      <w:r>
+        <w:rPr>
+          <w:rFonts w:ascii="Times New Roman" w:eastAsia="Times New Roman" w:hAnsi="Times New Roman" w:cs="Times New Roman"/>
+          <w:kern w:val="0"/>
+          <w:lang w:eastAsia="en-GB"/>
+          <w14:ligatures w14:val="none"/>
+        </w:rPr>
+        <w:t xml:space="preserve">4.1 There appears to be only 1 </w:t>
+      </w:r>
+      <w:r>
+        <w:rPr>
+          <w:rFonts w:ascii="Times New Roman" w:eastAsia="Times New Roman" w:hAnsi="Times New Roman" w:cs="Times New Roman"/>
+          <w:kern w:val="0"/>
+          <w:lang w:eastAsia="en-GB"/>
+          <w14:ligatures w14:val="none"/>
+        </w:rPr>
+        <w:t>JSON payload to sync Controller status an</w:t>
+      </w:r>
+      <w:r>
+        <w:rPr>
+          <w:rFonts w:ascii="Times New Roman" w:eastAsia="Times New Roman" w:hAnsi="Times New Roman" w:cs="Times New Roman"/>
+          <w:kern w:val="0"/>
+          <w:lang w:eastAsia="en-GB"/>
+          <w14:ligatures w14:val="none"/>
+        </w:rPr>
+        <w:t>d its titled “pair_key”</w:t>
+      </w:r>
+    </w:p>
+    <w:p>
+      <w:pPr>
         <w:rPr>
           <w:rFonts w:ascii="Times New Roman" w:eastAsia="Times New Roman" w:hAnsi="Times New Roman" w:cs="Times New Roman"/>
           <w:kern w:val="0"/>
@@ -1738,8 +2227,8 @@
           <w:kern w:val="0"/>
           <w:lang w:eastAsia="en-GB"/>
         </w:rPr>
-        <w:pict w14:anchorId="12841CE4">
-          <v:rect id="_x0000_i1039" alt="" style="width:451.3pt;height:.05pt;mso-width-percent:0;mso-height-percent:0;mso-width-percent:0;mso-height-percent:0" o:hralign="center" o:hrstd="t" o:hr="t" fillcolor="#a0a0a0" stroked="f"/>
+        <w:pict w14:anchorId="31B55F98">
+          <v:rect id="_x0000_i1038" alt="" style="width:451.3pt;height:.05pt;mso-width-percent:0;mso-height-percent:0;mso-width-percent:0;mso-height-percent:0" o:hralign="center" o:hrstd="t" o:hr="t" fillcolor="#a0a0a0" stroked="f"/>
         </w:pict>
       </w:r>
     </w:p>
@@ -2100,7 +2589,6 @@
                 <w:lang w:eastAsia="en-GB"/>
                 <w14:ligatures w14:val="none"/>
               </w:rPr>
-              <w:lastRenderedPageBreak/>
               <w:t>time</w:t>
             </w:r>
           </w:p>
@@ -2349,8 +2837,8 @@
           <w:kern w:val="0"/>
           <w:lang w:eastAsia="en-GB"/>
         </w:rPr>
-        <w:pict w14:anchorId="1DB949F0">
-          <v:rect id="_x0000_i1038" alt="" style="width:451.3pt;height:.05pt;mso-width-percent:0;mso-height-percent:0;mso-width-percent:0;mso-height-percent:0" o:hralign="center" o:hrstd="t" o:hr="t" fillcolor="#a0a0a0" stroked="f"/>
+        <w:pict w14:anchorId="069C0CEF">
+          <v:rect id="_x0000_i1037" alt="" style="width:451.3pt;height:.05pt;mso-width-percent:0;mso-height-percent:0;mso-width-percent:0;mso-height-percent:0" o:hralign="center" o:hrstd="t" o:hr="t" fillcolor="#a0a0a0" stroked="f"/>
         </w:pict>
       </w:r>
     </w:p>
@@ -2742,8 +3230,8 @@
           <w:kern w:val="0"/>
           <w:lang w:eastAsia="en-GB"/>
         </w:rPr>
-        <w:pict w14:anchorId="79816052">
-          <v:rect id="_x0000_i1037" alt="" style="width:451.3pt;height:.05pt;mso-width-percent:0;mso-height-percent:0;mso-width-percent:0;mso-height-percent:0" o:hralign="center" o:hrstd="t" o:hr="t" fillcolor="#a0a0a0" stroked="f"/>
+        <w:pict w14:anchorId="78EABA33">
+          <v:rect id="_x0000_i1036" alt="" style="width:451.3pt;height:.05pt;mso-width-percent:0;mso-height-percent:0;mso-width-percent:0;mso-height-percent:0" o:hralign="center" o:hrstd="t" o:hr="t" fillcolor="#a0a0a0" stroked="f"/>
         </w:pict>
       </w:r>
     </w:p>
@@ -3155,6 +3643,7 @@
           <w:lang w:eastAsia="en-GB"/>
           <w14:ligatures w14:val="none"/>
         </w:rPr>
+        <w:lastRenderedPageBreak/>
         <w:t>{</w:t>
       </w:r>
     </w:p>
@@ -3491,8 +3980,8 @@
           <w:kern w:val="0"/>
           <w:lang w:eastAsia="en-GB"/>
         </w:rPr>
-        <w:pict w14:anchorId="326DFAA8">
-          <v:rect id="_x0000_i1036" alt="" style="width:451.3pt;height:.05pt;mso-width-percent:0;mso-height-percent:0;mso-width-percent:0;mso-height-percent:0" o:hralign="center" o:hrstd="t" o:hr="t" fillcolor="#a0a0a0" stroked="f"/>
+        <w:pict w14:anchorId="22C90E76">
+          <v:rect id="_x0000_i1035" alt="" style="width:451.3pt;height:.05pt;mso-width-percent:0;mso-height-percent:0;mso-width-percent:0;mso-height-percent:0" o:hralign="center" o:hrstd="t" o:hr="t" fillcolor="#a0a0a0" stroked="f"/>
         </w:pict>
       </w:r>
     </w:p>
@@ -3542,7 +4031,6 @@
           <w:lang w:eastAsia="en-GB"/>
           <w14:ligatures w14:val="none"/>
         </w:rPr>
-        <w:lastRenderedPageBreak/>
         <w:t>Devices may support zero or more zones.</w:t>
       </w:r>
     </w:p>
@@ -4594,8 +5082,8 @@
           <w:kern w:val="0"/>
           <w:lang w:eastAsia="en-GB"/>
         </w:rPr>
-        <w:pict w14:anchorId="594C7ABA">
-          <v:rect id="_x0000_i1035" alt="" style="width:451.3pt;height:.05pt;mso-width-percent:0;mso-height-percent:0;mso-width-percent:0;mso-height-percent:0" o:hralign="center" o:hrstd="t" o:hr="t" fillcolor="#a0a0a0" stroked="f"/>
+        <w:pict w14:anchorId="00584246">
+          <v:rect id="_x0000_i1034" alt="" style="width:451.3pt;height:.05pt;mso-width-percent:0;mso-height-percent:0;mso-width-percent:0;mso-height-percent:0" o:hralign="center" o:hrstd="t" o:hr="t" fillcolor="#a0a0a0" stroked="f"/>
         </w:pict>
       </w:r>
     </w:p>
@@ -5085,8 +5573,9 @@
           <w:kern w:val="0"/>
           <w:lang w:eastAsia="en-GB"/>
         </w:rPr>
-        <w:pict w14:anchorId="690D9CA2">
-          <v:rect id="_x0000_i1034" alt="" style="width:451.3pt;height:.05pt;mso-width-percent:0;mso-height-percent:0;mso-width-percent:0;mso-height-percent:0" o:hralign="center" o:hrstd="t" o:hr="t" fillcolor="#a0a0a0" stroked="f"/>
+        <w:lastRenderedPageBreak/>
+        <w:pict w14:anchorId="1614BA71">
+          <v:rect id="_x0000_i1033" alt="" style="width:451.3pt;height:.05pt;mso-width-percent:0;mso-height-percent:0;mso-width-percent:0;mso-height-percent:0" o:hralign="center" o:hrstd="t" o:hr="t" fillcolor="#a0a0a0" stroked="f"/>
         </w:pict>
       </w:r>
     </w:p>
@@ -5258,8 +5747,8 @@
           <w:kern w:val="0"/>
           <w:lang w:eastAsia="en-GB"/>
         </w:rPr>
-        <w:pict w14:anchorId="133D0ACA">
-          <v:rect id="_x0000_i1033" alt="" style="width:451.3pt;height:.05pt;mso-width-percent:0;mso-height-percent:0;mso-width-percent:0;mso-height-percent:0" o:hralign="center" o:hrstd="t" o:hr="t" fillcolor="#a0a0a0" stroked="f"/>
+        <w:pict w14:anchorId="0D2F955B">
+          <v:rect id="_x0000_i1032" alt="" style="width:451.3pt;height:.05pt;mso-width-percent:0;mso-height-percent:0;mso-width-percent:0;mso-height-percent:0" o:hralign="center" o:hrstd="t" o:hr="t" fillcolor="#a0a0a0" stroked="f"/>
         </w:pict>
       </w:r>
     </w:p>
@@ -5289,7 +5778,360 @@
           <w:lang w:eastAsia="en-GB"/>
           <w14:ligatures w14:val="none"/>
         </w:rPr>
-        <w:lastRenderedPageBreak/>
+        <w:t>10</w:t>
+      </w:r>
+      <w:r>
+        <w:rPr>
+          <w:rFonts w:ascii="Times New Roman" w:eastAsia="Times New Roman" w:hAnsi="Times New Roman" w:cs="Times New Roman"/>
+          <w:b/>
+          <w:bCs/>
+          <w:kern w:val="0"/>
+          <w:sz w:val="36"/>
+          <w:szCs w:val="36"/>
+          <w:lang w:eastAsia="en-GB"/>
+          <w14:ligatures w14:val="none"/>
+        </w:rPr>
+        <w:t>. The "Golden Handshake" (Time Sync)</w:t>
+      </w:r>
+    </w:p>
+    <w:p>
+      <w:pPr>
+        <w:spacing w:before="100" w:beforeAutospacing="1" w:after="100" w:afterAutospacing="1"/>
+        <w:rPr>
+          <w:rFonts w:ascii="Times New Roman" w:eastAsia="Times New Roman" w:hAnsi="Times New Roman" w:cs="Times New Roman"/>
+          <w:color w:val="000000"/>
+          <w:kern w:val="0"/>
+          <w:lang w:eastAsia="en-GB"/>
+          <w14:ligatures w14:val="none"/>
+        </w:rPr>
+      </w:pPr>
+      <w:r>
+        <w:rPr>
+          <w:rFonts w:ascii="Times New Roman" w:eastAsia="Times New Roman" w:hAnsi="Times New Roman" w:cs="Times New Roman"/>
+          <w:color w:val="000000"/>
+          <w:kern w:val="0"/>
+          <w:lang w:eastAsia="en-GB"/>
+          <w14:ligatures w14:val="none"/>
+        </w:rPr>
+        <w:t>The most critical part of the protocol. If the response is malformed or lacks the specific hour offset, the device enters a "fail-state" and polls every 3 seconds.</w:t>
+      </w:r>
+    </w:p>
+    <w:p>
+      <w:pPr>
+        <w:numPr>
+          <w:ilvl w:val="0"/>
+          <w:numId w:val="18"/>
+        </w:numPr>
+        <w:spacing w:before="100" w:beforeAutospacing="1" w:after="100" w:afterAutospacing="1"/>
+        <w:rPr>
+          <w:rFonts w:ascii="Times New Roman" w:eastAsia="Times New Roman" w:hAnsi="Times New Roman" w:cs="Times New Roman"/>
+          <w:color w:val="000000"/>
+          <w:kern w:val="0"/>
+          <w:lang w:eastAsia="en-GB"/>
+          <w14:ligatures w14:val="none"/>
+        </w:rPr>
+      </w:pPr>
+      <w:r>
+        <w:rPr>
+          <w:rFonts w:ascii="Times New Roman" w:eastAsia="Times New Roman" w:hAnsi="Times New Roman" w:cs="Times New Roman"/>
+          <w:b/>
+          <w:bCs/>
+          <w:color w:val="000000"/>
+          <w:kern w:val="0"/>
+          <w:lang w:eastAsia="en-GB"/>
+          <w14:ligatures w14:val="none"/>
+        </w:rPr>
+        <w:t>Trigger:</w:t>
+      </w:r>
+      <w:r>
+        <w:rPr>
+          <w:rFonts w:ascii="Times New Roman" w:eastAsia="Times New Roman" w:hAnsi="Times New Roman" w:cs="Times New Roman"/>
+          <w:color w:val="000000"/>
+          <w:kern w:val="0"/>
+          <w:lang w:eastAsia="en-GB"/>
+          <w14:ligatures w14:val="none"/>
+        </w:rPr>
+        <w:t> Device sends </w:t>
+      </w:r>
+      <w:r>
+        <w:rPr>
+          <w:rFonts w:ascii="Courier New" w:eastAsia="Times New Roman" w:hAnsi="Courier New" w:cs="Courier New"/>
+          <w:color w:val="000000"/>
+          <w:kern w:val="0"/>
+          <w:sz w:val="20"/>
+          <w:szCs w:val="20"/>
+          <w:lang w:eastAsia="en-GB"/>
+          <w14:ligatures w14:val="none"/>
+        </w:rPr>
+        <w:t>{"cmd": "time"}</w:t>
+      </w:r>
+      <w:r>
+        <w:rPr>
+          <w:rFonts w:ascii="Times New Roman" w:eastAsia="Times New Roman" w:hAnsi="Times New Roman" w:cs="Times New Roman"/>
+          <w:color w:val="000000"/>
+          <w:kern w:val="0"/>
+          <w:lang w:eastAsia="en-GB"/>
+          <w14:ligatures w14:val="none"/>
+        </w:rPr>
+        <w:t>.</w:t>
+      </w:r>
+    </w:p>
+    <w:p>
+      <w:pPr>
+        <w:numPr>
+          <w:ilvl w:val="0"/>
+          <w:numId w:val="18"/>
+        </w:numPr>
+        <w:spacing w:before="100" w:beforeAutospacing="1" w:after="100" w:afterAutospacing="1"/>
+        <w:rPr>
+          <w:rFonts w:ascii="Times New Roman" w:eastAsia="Times New Roman" w:hAnsi="Times New Roman" w:cs="Times New Roman"/>
+          <w:color w:val="000000"/>
+          <w:kern w:val="0"/>
+          <w:lang w:eastAsia="en-GB"/>
+          <w14:ligatures w14:val="none"/>
+        </w:rPr>
+      </w:pPr>
+      <w:r>
+        <w:rPr>
+          <w:rFonts w:ascii="Times New Roman" w:eastAsia="Times New Roman" w:hAnsi="Times New Roman" w:cs="Times New Roman"/>
+          <w:b/>
+          <w:bCs/>
+          <w:color w:val="000000"/>
+          <w:kern w:val="0"/>
+          <w:lang w:eastAsia="en-GB"/>
+          <w14:ligatures w14:val="none"/>
+        </w:rPr>
+        <w:t>Correct Server Response:</w:t>
+      </w:r>
+      <w:r>
+        <w:rPr>
+          <w:rFonts w:ascii="Times New Roman" w:eastAsia="Times New Roman" w:hAnsi="Times New Roman" w:cs="Times New Roman"/>
+          <w:color w:val="000000"/>
+          <w:kern w:val="0"/>
+          <w:lang w:eastAsia="en-GB"/>
+          <w14:ligatures w14:val="none"/>
+        </w:rPr>
+        <w:t> </w:t>
+      </w:r>
+      <w:r>
+        <w:rPr>
+          <w:rFonts w:ascii="Courier New" w:eastAsia="Times New Roman" w:hAnsi="Courier New" w:cs="Courier New"/>
+          <w:color w:val="000000"/>
+          <w:kern w:val="0"/>
+          <w:sz w:val="20"/>
+          <w:szCs w:val="20"/>
+          <w:lang w:eastAsia="en-GB"/>
+          <w14:ligatures w14:val="none"/>
+        </w:rPr>
+        <w:t>{"local_time":"YYYYMMDDHHMM","MsgID":"YYYYMMDDHHMMSS"}</w:t>
+      </w:r>
+    </w:p>
+    <w:p>
+      <w:pPr>
+        <w:numPr>
+          <w:ilvl w:val="0"/>
+          <w:numId w:val="18"/>
+        </w:numPr>
+        <w:spacing w:before="100" w:beforeAutospacing="1" w:after="100" w:afterAutospacing="1"/>
+        <w:rPr>
+          <w:rFonts w:ascii="Times New Roman" w:eastAsia="Times New Roman" w:hAnsi="Times New Roman" w:cs="Times New Roman"/>
+          <w:color w:val="000000"/>
+          <w:kern w:val="0"/>
+          <w:lang w:eastAsia="en-GB"/>
+          <w14:ligatures w14:val="none"/>
+        </w:rPr>
+      </w:pPr>
+      <w:r>
+        <w:rPr>
+          <w:rFonts w:ascii="Times New Roman" w:eastAsia="Times New Roman" w:hAnsi="Times New Roman" w:cs="Times New Roman"/>
+          <w:b/>
+          <w:bCs/>
+          <w:color w:val="000000"/>
+          <w:kern w:val="0"/>
+          <w:lang w:eastAsia="en-GB"/>
+          <w14:ligatures w14:val="none"/>
+        </w:rPr>
+        <w:t>Crucial Rule:</w:t>
+      </w:r>
+      <w:r>
+        <w:rPr>
+          <w:rFonts w:ascii="Times New Roman" w:eastAsia="Times New Roman" w:hAnsi="Times New Roman" w:cs="Times New Roman"/>
+          <w:color w:val="000000"/>
+          <w:kern w:val="0"/>
+          <w:lang w:eastAsia="en-GB"/>
+          <w14:ligatures w14:val="none"/>
+        </w:rPr>
+        <w:t> </w:t>
+      </w:r>
+      <w:r>
+        <w:rPr>
+          <w:rFonts w:ascii="Courier New" w:eastAsia="Times New Roman" w:hAnsi="Courier New" w:cs="Courier New"/>
+          <w:color w:val="000000"/>
+          <w:kern w:val="0"/>
+          <w:sz w:val="20"/>
+          <w:szCs w:val="20"/>
+          <w:lang w:eastAsia="en-GB"/>
+          <w14:ligatures w14:val="none"/>
+        </w:rPr>
+        <w:t>MsgID</w:t>
+      </w:r>
+      <w:r>
+        <w:rPr>
+          <w:rFonts w:ascii="Times New Roman" w:eastAsia="Times New Roman" w:hAnsi="Times New Roman" w:cs="Times New Roman"/>
+          <w:color w:val="000000"/>
+          <w:kern w:val="0"/>
+          <w:lang w:eastAsia="en-GB"/>
+          <w14:ligatures w14:val="none"/>
+        </w:rPr>
+        <w:t> must be </w:t>
+      </w:r>
+      <w:r>
+        <w:rPr>
+          <w:rFonts w:ascii="Times New Roman" w:eastAsia="Times New Roman" w:hAnsi="Times New Roman" w:cs="Times New Roman"/>
+          <w:b/>
+          <w:bCs/>
+          <w:color w:val="000000"/>
+          <w:kern w:val="0"/>
+          <w:lang w:eastAsia="en-GB"/>
+          <w14:ligatures w14:val="none"/>
+        </w:rPr>
+        <w:t>exactly 1 hour ahead</w:t>
+      </w:r>
+      <w:r>
+        <w:rPr>
+          <w:rFonts w:ascii="Times New Roman" w:eastAsia="Times New Roman" w:hAnsi="Times New Roman" w:cs="Times New Roman"/>
+          <w:color w:val="000000"/>
+          <w:kern w:val="0"/>
+          <w:lang w:eastAsia="en-GB"/>
+          <w14:ligatures w14:val="none"/>
+        </w:rPr>
+        <w:t> of </w:t>
+      </w:r>
+      <w:r>
+        <w:rPr>
+          <w:rFonts w:ascii="Courier New" w:eastAsia="Times New Roman" w:hAnsi="Courier New" w:cs="Courier New"/>
+          <w:color w:val="000000"/>
+          <w:kern w:val="0"/>
+          <w:sz w:val="20"/>
+          <w:szCs w:val="20"/>
+          <w:lang w:eastAsia="en-GB"/>
+          <w14:ligatures w14:val="none"/>
+        </w:rPr>
+        <w:t>local_time</w:t>
+      </w:r>
+      <w:r>
+        <w:rPr>
+          <w:rFonts w:ascii="Times New Roman" w:eastAsia="Times New Roman" w:hAnsi="Times New Roman" w:cs="Times New Roman"/>
+          <w:color w:val="000000"/>
+          <w:kern w:val="0"/>
+          <w:lang w:eastAsia="en-GB"/>
+          <w14:ligatures w14:val="none"/>
+        </w:rPr>
+        <w:t> (likely a legacy artifact of the original Melbourne-based cloud server's UTC/DST handling).</w:t>
+      </w:r>
+    </w:p>
+    <w:p>
+      <w:pPr>
+        <w:numPr>
+          <w:ilvl w:val="0"/>
+          <w:numId w:val="18"/>
+        </w:numPr>
+        <w:spacing w:before="100" w:beforeAutospacing="1" w:after="100" w:afterAutospacing="1"/>
+        <w:rPr>
+          <w:rFonts w:ascii="Times New Roman" w:eastAsia="Times New Roman" w:hAnsi="Times New Roman" w:cs="Times New Roman"/>
+          <w:color w:val="000000"/>
+          <w:kern w:val="0"/>
+          <w:lang w:eastAsia="en-GB"/>
+          <w14:ligatures w14:val="none"/>
+        </w:rPr>
+      </w:pPr>
+      <w:r>
+        <w:rPr>
+          <w:rFonts w:ascii="Times New Roman" w:eastAsia="Times New Roman" w:hAnsi="Times New Roman" w:cs="Times New Roman"/>
+          <w:b/>
+          <w:bCs/>
+          <w:color w:val="000000"/>
+          <w:kern w:val="0"/>
+          <w:lang w:eastAsia="en-GB"/>
+          <w14:ligatures w14:val="none"/>
+        </w:rPr>
+        <w:t>Formatting:</w:t>
+      </w:r>
+      <w:r>
+        <w:rPr>
+          <w:rFonts w:ascii="Times New Roman" w:eastAsia="Times New Roman" w:hAnsi="Times New Roman" w:cs="Times New Roman"/>
+          <w:color w:val="000000"/>
+          <w:kern w:val="0"/>
+          <w:lang w:eastAsia="en-GB"/>
+          <w14:ligatures w14:val="none"/>
+        </w:rPr>
+        <w:t> No spaces, no newlines. Use </w:t>
+      </w:r>
+      <w:r>
+        <w:rPr>
+          <w:rFonts w:ascii="Courier New" w:eastAsia="Times New Roman" w:hAnsi="Courier New" w:cs="Courier New"/>
+          <w:color w:val="000000"/>
+          <w:kern w:val="0"/>
+          <w:sz w:val="20"/>
+          <w:szCs w:val="20"/>
+          <w:lang w:eastAsia="en-GB"/>
+          <w14:ligatures w14:val="none"/>
+        </w:rPr>
+        <w:t>separators=(',', ':')</w:t>
+      </w:r>
+      <w:r>
+        <w:rPr>
+          <w:rFonts w:ascii="Times New Roman" w:eastAsia="Times New Roman" w:hAnsi="Times New Roman" w:cs="Times New Roman"/>
+          <w:color w:val="000000"/>
+          <w:kern w:val="0"/>
+          <w:lang w:eastAsia="en-GB"/>
+          <w14:ligatures w14:val="none"/>
+        </w:rPr>
+        <w:t>.</w:t>
+      </w:r>
+    </w:p>
+    <w:p>
+      <w:pPr>
+        <w:spacing w:before="100" w:beforeAutospacing="1" w:after="100" w:afterAutospacing="1"/>
+        <w:outlineLvl w:val="1"/>
+        <w:rPr>
+          <w:rFonts w:ascii="Times New Roman" w:eastAsia="Times New Roman" w:hAnsi="Times New Roman" w:cs="Times New Roman"/>
+          <w:b/>
+          <w:bCs/>
+          <w:kern w:val="0"/>
+          <w:sz w:val="36"/>
+          <w:szCs w:val="36"/>
+          <w:lang w:eastAsia="en-GB"/>
+          <w14:ligatures w14:val="none"/>
+        </w:rPr>
+      </w:pPr>
+    </w:p>
+    <w:p>
+      <w:pPr>
+        <w:spacing w:before="100" w:beforeAutospacing="1" w:after="100" w:afterAutospacing="1"/>
+        <w:outlineLvl w:val="1"/>
+        <w:rPr>
+          <w:rFonts w:ascii="Times New Roman" w:eastAsia="Times New Roman" w:hAnsi="Times New Roman" w:cs="Times New Roman"/>
+          <w:b/>
+          <w:bCs/>
+          <w:kern w:val="0"/>
+          <w:sz w:val="36"/>
+          <w:szCs w:val="36"/>
+          <w:lang w:eastAsia="en-GB"/>
+          <w14:ligatures w14:val="none"/>
+        </w:rPr>
+      </w:pPr>
+      <w:r>
+        <w:rPr>
+          <w:rFonts w:ascii="Times New Roman" w:eastAsia="Times New Roman" w:hAnsi="Times New Roman" w:cs="Times New Roman"/>
+          <w:b/>
+          <w:bCs/>
+          <w:kern w:val="0"/>
+          <w:sz w:val="36"/>
+          <w:szCs w:val="36"/>
+          <w:lang w:eastAsia="en-GB"/>
+          <w14:ligatures w14:val="none"/>
+        </w:rPr>
         <w:t>11. Weather Command (Observed, Optional)</w:t>
       </w:r>
     </w:p>
@@ -5594,8 +6436,8 @@
           <w:kern w:val="0"/>
           <w:lang w:eastAsia="en-GB"/>
         </w:rPr>
-        <w:pict w14:anchorId="078506FC">
-          <v:rect id="_x0000_i1032" alt="" style="width:451.3pt;height:.05pt;mso-width-percent:0;mso-height-percent:0;mso-width-percent:0;mso-height-percent:0" o:hralign="center" o:hrstd="t" o:hr="t" fillcolor="#a0a0a0" stroked="f"/>
+        <w:pict w14:anchorId="456E2CCC">
+          <v:rect id="_x0000_i1031" alt="" style="width:451.3pt;height:.05pt;mso-width-percent:0;mso-height-percent:0;mso-width-percent:0;mso-height-percent:0" o:hralign="center" o:hrstd="t" o:hr="t" fillcolor="#a0a0a0" stroked="f"/>
         </w:pict>
       </w:r>
     </w:p>
@@ -5649,6 +6491,7 @@
           <w:lang w:eastAsia="en-GB"/>
           <w14:ligatures w14:val="none"/>
         </w:rPr>
+        <w:lastRenderedPageBreak/>
         <w:t>❌</w:t>
       </w:r>
       <w:r>
@@ -5885,8 +6728,8 @@
           <w:kern w:val="0"/>
           <w:lang w:eastAsia="en-GB"/>
         </w:rPr>
-        <w:pict w14:anchorId="22AC118A">
-          <v:rect id="_x0000_i1031" alt="" style="width:451.3pt;height:.05pt;mso-width-percent:0;mso-height-percent:0;mso-width-percent:0;mso-height-percent:0" o:hralign="center" o:hrstd="t" o:hr="t" fillcolor="#a0a0a0" stroked="f"/>
+        <w:pict w14:anchorId="631F7BA6">
+          <v:rect id="_x0000_i1030" alt="" style="width:451.3pt;height:.05pt;mso-width-percent:0;mso-height-percent:0;mso-width-percent:0;mso-height-percent:0" o:hralign="center" o:hrstd="t" o:hr="t" fillcolor="#a0a0a0" stroked="f"/>
         </w:pict>
       </w:r>
     </w:p>
@@ -6031,239 +6874,13 @@
           <w:kern w:val="0"/>
           <w:lang w:eastAsia="en-GB"/>
         </w:rPr>
-        <w:pict w14:anchorId="13751818">
-          <v:rect id="_x0000_i1030" alt="" style="width:451.3pt;height:.05pt;mso-width-percent:0;mso-height-percent:0;mso-width-percent:0;mso-height-percent:0" o:hralign="center" o:hrstd="t" o:hr="t" fillcolor="#a0a0a0" stroked="f"/>
-        </w:pict>
-      </w:r>
-    </w:p>
-    <w:p>
-      <w:pPr>
-        <w:spacing w:before="100" w:beforeAutospacing="1" w:after="100" w:afterAutospacing="1"/>
-        <w:outlineLvl w:val="1"/>
-        <w:rPr>
-          <w:rFonts w:ascii="Times New Roman" w:eastAsia="Times New Roman" w:hAnsi="Times New Roman" w:cs="Times New Roman"/>
-          <w:b/>
-          <w:bCs/>
-          <w:kern w:val="0"/>
-          <w:sz w:val="36"/>
-          <w:szCs w:val="36"/>
-          <w:lang w:eastAsia="en-GB"/>
-          <w14:ligatures w14:val="none"/>
-        </w:rPr>
-      </w:pPr>
-      <w:r>
-        <w:rPr>
-          <w:rFonts w:ascii="Times New Roman" w:eastAsia="Times New Roman" w:hAnsi="Times New Roman" w:cs="Times New Roman"/>
-          <w:b/>
-          <w:bCs/>
-          <w:kern w:val="0"/>
-          <w:sz w:val="36"/>
-          <w:szCs w:val="36"/>
-          <w:lang w:eastAsia="en-GB"/>
-          <w14:ligatures w14:val="none"/>
-        </w:rPr>
-        <w:t>14. Open Questions / To</w:t>
-      </w:r>
-      <w:r>
-        <w:rPr>
-          <w:rFonts w:ascii="Times New Roman" w:eastAsia="Times New Roman" w:hAnsi="Times New Roman" w:cs="Times New Roman"/>
-          <w:b/>
-          <w:bCs/>
-          <w:kern w:val="0"/>
-          <w:sz w:val="36"/>
-          <w:szCs w:val="36"/>
-          <w:lang w:eastAsia="en-GB"/>
-          <w14:ligatures w14:val="none"/>
-        </w:rPr>
-        <w:noBreakHyphen/>
-        <w:t>Be</w:t>
-      </w:r>
-      <w:r>
-        <w:rPr>
-          <w:rFonts w:ascii="Times New Roman" w:eastAsia="Times New Roman" w:hAnsi="Times New Roman" w:cs="Times New Roman"/>
-          <w:b/>
-          <w:bCs/>
-          <w:kern w:val="0"/>
-          <w:sz w:val="36"/>
-          <w:szCs w:val="36"/>
-          <w:lang w:eastAsia="en-GB"/>
-          <w14:ligatures w14:val="none"/>
-        </w:rPr>
-        <w:noBreakHyphen/>
-        <w:t>Determined</w:t>
-      </w:r>
-    </w:p>
-    <w:p>
-      <w:pPr>
-        <w:numPr>
-          <w:ilvl w:val="0"/>
-          <w:numId w:val="11"/>
-        </w:numPr>
-        <w:spacing w:before="100" w:beforeAutospacing="1" w:after="100" w:afterAutospacing="1"/>
-        <w:rPr>
-          <w:rFonts w:ascii="Times New Roman" w:eastAsia="Times New Roman" w:hAnsi="Times New Roman" w:cs="Times New Roman"/>
-          <w:kern w:val="0"/>
-          <w:lang w:eastAsia="en-GB"/>
-          <w14:ligatures w14:val="none"/>
-        </w:rPr>
-      </w:pPr>
-      <w:r>
-        <w:rPr>
-          <w:rFonts w:ascii="Times New Roman" w:eastAsia="Times New Roman" w:hAnsi="Times New Roman" w:cs="Times New Roman"/>
-          <w:kern w:val="0"/>
-          <w:lang w:eastAsia="en-GB"/>
-          <w14:ligatures w14:val="none"/>
-        </w:rPr>
-        <w:t>Multi</w:t>
-      </w:r>
-      <w:r>
-        <w:rPr>
-          <w:rFonts w:ascii="Times New Roman" w:eastAsia="Times New Roman" w:hAnsi="Times New Roman" w:cs="Times New Roman"/>
-          <w:kern w:val="0"/>
-          <w:lang w:eastAsia="en-GB"/>
-          <w14:ligatures w14:val="none"/>
-        </w:rPr>
-        <w:noBreakHyphen/>
-        <w:t>controller coordination semantics</w:t>
-      </w:r>
-    </w:p>
-    <w:p>
-      <w:pPr>
-        <w:numPr>
-          <w:ilvl w:val="0"/>
-          <w:numId w:val="11"/>
-        </w:numPr>
-        <w:spacing w:before="100" w:beforeAutospacing="1" w:after="100" w:afterAutospacing="1"/>
-        <w:rPr>
-          <w:rFonts w:ascii="Times New Roman" w:eastAsia="Times New Roman" w:hAnsi="Times New Roman" w:cs="Times New Roman"/>
-          <w:kern w:val="0"/>
-          <w:lang w:eastAsia="en-GB"/>
-          <w14:ligatures w14:val="none"/>
-        </w:rPr>
-      </w:pPr>
-      <w:r>
-        <w:rPr>
-          <w:rFonts w:ascii="Times New Roman" w:eastAsia="Times New Roman" w:hAnsi="Times New Roman" w:cs="Times New Roman"/>
-          <w:kern w:val="0"/>
-          <w:lang w:eastAsia="en-GB"/>
-          <w14:ligatures w14:val="none"/>
-        </w:rPr>
-        <w:t>Firmware update mechanism</w:t>
-      </w:r>
-    </w:p>
-    <w:p>
-      <w:pPr>
-        <w:numPr>
-          <w:ilvl w:val="0"/>
-          <w:numId w:val="11"/>
-        </w:numPr>
-        <w:spacing w:before="100" w:beforeAutospacing="1" w:after="100" w:afterAutospacing="1"/>
-        <w:rPr>
-          <w:rFonts w:ascii="Times New Roman" w:eastAsia="Times New Roman" w:hAnsi="Times New Roman" w:cs="Times New Roman"/>
-          <w:kern w:val="0"/>
-          <w:lang w:eastAsia="en-GB"/>
-          <w14:ligatures w14:val="none"/>
-        </w:rPr>
-      </w:pPr>
-      <w:r>
-        <w:rPr>
-          <w:rFonts w:ascii="Times New Roman" w:eastAsia="Times New Roman" w:hAnsi="Times New Roman" w:cs="Times New Roman"/>
-          <w:kern w:val="0"/>
-          <w:lang w:eastAsia="en-GB"/>
-          <w14:ligatures w14:val="none"/>
-        </w:rPr>
-        <w:t>Error response formats</w:t>
-      </w:r>
-    </w:p>
-    <w:p>
-      <w:pPr>
-        <w:numPr>
-          <w:ilvl w:val="0"/>
-          <w:numId w:val="11"/>
-        </w:numPr>
-        <w:spacing w:before="100" w:beforeAutospacing="1" w:after="100" w:afterAutospacing="1"/>
-        <w:rPr>
-          <w:rFonts w:ascii="Times New Roman" w:eastAsia="Times New Roman" w:hAnsi="Times New Roman" w:cs="Times New Roman"/>
-          <w:kern w:val="0"/>
-          <w:lang w:eastAsia="en-GB"/>
-          <w14:ligatures w14:val="none"/>
-        </w:rPr>
-      </w:pPr>
-      <w:r>
-        <w:rPr>
-          <w:rFonts w:ascii="Times New Roman" w:eastAsia="Times New Roman" w:hAnsi="Times New Roman" w:cs="Times New Roman"/>
-          <w:kern w:val="0"/>
-          <w:lang w:eastAsia="en-GB"/>
-          <w14:ligatures w14:val="none"/>
-        </w:rPr>
-        <w:t>Authentication hardening (if any)</w:t>
-      </w:r>
-    </w:p>
-    <w:p>
-      <w:pPr>
-        <w:rPr>
-          <w:rFonts w:ascii="Times New Roman" w:eastAsia="Times New Roman" w:hAnsi="Times New Roman" w:cs="Times New Roman"/>
-          <w:kern w:val="0"/>
-          <w:lang w:eastAsia="en-GB"/>
-          <w14:ligatures w14:val="none"/>
-        </w:rPr>
-      </w:pPr>
-      <w:r>
-        <w:rPr>
-          <w:rFonts w:ascii="Times New Roman" w:eastAsia="Times New Roman" w:hAnsi="Times New Roman" w:cs="Times New Roman"/>
-          <w:noProof/>
-          <w:kern w:val="0"/>
-          <w:lang w:eastAsia="en-GB"/>
-        </w:rPr>
-        <w:pict w14:anchorId="08F80BDA">
+        <w:pict w14:anchorId="17D9AFB8">
           <v:rect id="_x0000_i1029" alt="" style="width:451.3pt;height:.05pt;mso-width-percent:0;mso-height-percent:0;mso-width-percent:0;mso-height-percent:0" o:hralign="center" o:hrstd="t" o:hr="t" fillcolor="#a0a0a0" stroked="f"/>
         </w:pict>
       </w:r>
     </w:p>
     <w:p>
       <w:pPr>
-        <w:spacing w:before="100" w:beforeAutospacing="1" w:after="100" w:afterAutospacing="1"/>
-        <w:rPr>
-          <w:rFonts w:ascii="Times New Roman" w:eastAsia="Times New Roman" w:hAnsi="Times New Roman" w:cs="Times New Roman"/>
-          <w:kern w:val="0"/>
-          <w:lang w:eastAsia="en-GB"/>
-          <w14:ligatures w14:val="none"/>
-        </w:rPr>
-      </w:pPr>
-      <w:r>
-        <w:rPr>
-          <w:rFonts w:ascii="Times New Roman" w:eastAsia="Times New Roman" w:hAnsi="Times New Roman" w:cs="Times New Roman"/>
-          <w:b/>
-          <w:bCs/>
-          <w:kern w:val="0"/>
-          <w:lang w:eastAsia="en-GB"/>
-          <w14:ligatures w14:val="none"/>
-        </w:rPr>
-        <w:lastRenderedPageBreak/>
-        <w:t>Document version</w:t>
-      </w:r>
-      <w:r>
-        <w:rPr>
-          <w:rFonts w:ascii="Times New Roman" w:eastAsia="Times New Roman" w:hAnsi="Times New Roman" w:cs="Times New Roman"/>
-          <w:kern w:val="0"/>
-          <w:lang w:eastAsia="en-GB"/>
-          <w14:ligatures w14:val="none"/>
-        </w:rPr>
-        <w:t>: 0.1 (reverse</w:t>
-      </w:r>
-      <w:r>
-        <w:rPr>
-          <w:rFonts w:ascii="Times New Roman" w:eastAsia="Times New Roman" w:hAnsi="Times New Roman" w:cs="Times New Roman"/>
-          <w:kern w:val="0"/>
-          <w:lang w:eastAsia="en-GB"/>
-          <w14:ligatures w14:val="none"/>
-        </w:rPr>
-        <w:noBreakHyphen/>
-        <w:t>engineered)</w:t>
-      </w:r>
-    </w:p>
-    <w:p>
-      <w:pPr>
         <w:rPr>
           <w:rFonts w:ascii="Times New Roman" w:eastAsia="Times New Roman" w:hAnsi="Times New Roman" w:cs="Times New Roman"/>
           <w:kern w:val="0"/>
@@ -6278,7 +6895,7 @@
           <w:kern w:val="0"/>
           <w:lang w:eastAsia="en-GB"/>
         </w:rPr>
-        <w:pict w14:anchorId="72AC304A">
+        <w:pict w14:anchorId="4A1313C4">
           <v:rect id="_x0000_i1028" alt="" style="width:451.3pt;height:.05pt;mso-width-percent:0;mso-height-percent:0;mso-width-percent:0;mso-height-percent:0" o:hralign="center" o:hrstd="t" o:hr="t" fillcolor="#a0a0a0" stroked="f"/>
         </w:pict>
       </w:r>
@@ -6710,7 +7327,8 @@
           <w:kern w:val="0"/>
           <w:lang w:eastAsia="en-GB"/>
         </w:rPr>
-        <w:pict w14:anchorId="58DF565C">
+        <w:lastRenderedPageBreak/>
+        <w:pict w14:anchorId="57351A35">
           <v:rect id="_x0000_i1027" alt="" style="width:451.3pt;height:.05pt;mso-width-percent:0;mso-height-percent:0;mso-width-percent:0;mso-height-percent:0" o:hralign="center" o:hrstd="t" o:hr="t" fillcolor="#a0a0a0" stroked="f"/>
         </w:pict>
       </w:r>
@@ -6951,7 +7569,6 @@
           <w:lang w:eastAsia="en-GB"/>
           <w14:ligatures w14:val="none"/>
         </w:rPr>
-        <w:lastRenderedPageBreak/>
         <w:t>Conclusion</w:t>
       </w:r>
     </w:p>
@@ -7011,7 +7628,7 @@
           <w:kern w:val="0"/>
           <w:lang w:eastAsia="en-GB"/>
         </w:rPr>
-        <w:pict w14:anchorId="4FF6D40C">
+        <w:pict w14:anchorId="71DED138">
           <v:rect id="_x0000_i1026" alt="" style="width:451.3pt;height:.05pt;mso-width-percent:0;mso-height-percent:0;mso-width-percent:0;mso-height-percent:0" o:hralign="center" o:hrstd="t" o:hr="t" fillcolor="#a0a0a0" stroked="f"/>
         </w:pict>
       </w:r>
@@ -7296,7 +7913,7 @@
           <w:kern w:val="0"/>
           <w:lang w:eastAsia="en-GB"/>
         </w:rPr>
-        <w:pict w14:anchorId="406C9678">
+        <w:pict w14:anchorId="4ED4A631">
           <v:rect id="_x0000_i1025" alt="" style="width:451.3pt;height:.05pt;mso-width-percent:0;mso-height-percent:0;mso-width-percent:0;mso-height-percent:0" o:hralign="center" o:hrstd="t" o:hr="t" fillcolor="#a0a0a0" stroked="f"/>
         </w:pict>
       </w:r>
@@ -7335,6 +7952,155 @@
 <file path=word/numbering.xml><?xml version="1.0" encoding="utf-8"?>
 <w:numbering xmlns:wpc="http://schemas.microsoft.com/office/word/2010/wordprocessingCanvas" xmlns:cx="http://schemas.microsoft.com/office/drawing/2014/chartex" xmlns:cx1="http://schemas.microsoft.com/office/drawing/2015/9/8/chartex" xmlns:cx2="http://schemas.microsoft.com/office/drawing/2015/10/21/chartex" xmlns:cx3="http://schemas.microsoft.com/office/drawing/2016/5/9/chartex" xmlns:cx4="http://schemas.microsoft.com/office/drawing/2016/5/10/chartex" xmlns:cx5="http://schemas.microsoft.com/office/drawing/2016/5/11/chartex" xmlns:cx6="http://schemas.microsoft.com/office/drawing/2016/5/12/chartex" xmlns:cx7="http://schemas.microsoft.com/office/drawing/2016/5/13/chartex" xmlns:cx8="http://schemas.microsoft.com/office/drawing/2016/5/14/chartex" xmlns:mc="http://schemas.openxmlformats.org/markup-compatibility/2006" xmlns:aink="http://schemas.microsoft.com/office/drawing/2016/ink" xmlns:am3d="http://schemas.microsoft.com/office/drawing/2017/model3d" xmlns:o="urn:schemas-microsoft-com:office:office" xmlns:oel="http://schemas.microsoft.com/office/2019/extlst" xmlns:r="http://schemas.openxmlformats.org/officeDocument/2006/relationships" xmlns:m="http://schemas.openxmlformats.org/officeDocument/2006/math" xmlns:v="urn:schemas-microsoft-com:vml" xmlns:wp14="http://schemas.microsoft.com/office/word/2010/wordprocessingDrawing" xmlns:wp="http://schemas.openxmlformats.org/drawingml/2006/wordprocessingDrawing" xmlns:w10="urn:schemas-microsoft-com:office:word" xmlns:w="http://schemas.openxmlformats.org/wordprocessingml/2006/main" xmlns:w14="http://schemas.microsoft.com/office/word/2010/wordml" xmlns:w15="http://schemas.microsoft.com/office/word/2012/wordml" xmlns:w16cex="http://schemas.microsoft.com/office/word/2018/wordml/cex" xmlns:w16cid="http://schemas.microsoft.com/office/word/2016/wordml/cid" xmlns:w16="http://schemas.microsoft.com/office/word/2018/wordml" xmlns:w16du="http://schemas.microsoft.com/office/word/2023/wordml/word16du" xmlns:w16sdtdh="http://schemas.microsoft.com/office/word/2020/wordml/sdtdatahash" xmlns:w16sdtfl="http://schemas.microsoft.com/office/word/2024/wordml/sdtformatlock" xmlns:w16se="http://schemas.microsoft.com/office/word/2015/wordml/symex" xmlns:wpg="http://schemas.microsoft.com/office/word/2010/wordprocessingGroup" xmlns:wpi="http://schemas.microsoft.com/office/word/2010/wordprocessingInk" xmlns:wne="http://schemas.microsoft.com/office/word/2006/wordml" xmlns:wps="http://schemas.microsoft.com/office/word/2010/wordprocessingShape" mc:Ignorable="w14 w15 w16se w16cid w16 w16cex w16sdtdh w16sdtfl w16du wp14">
   <w:abstractNum w:abstractNumId="0" w15:restartNumberingAfterBreak="0">
+    <w:nsid w:val="06DA193D"/>
+    <w:multiLevelType w:val="multilevel"/>
+    <w:tmpl w:val="D67001FE"/>
+    <w:lvl w:ilvl="0">
+      <w:start w:val="1"/>
+      <w:numFmt w:val="bullet"/>
+      <w:lvlText w:val=""/>
+      <w:lvlJc w:val="left"/>
+      <w:pPr>
+        <w:tabs>
+          <w:tab w:val="num" w:pos="720"/>
+        </w:tabs>
+        <w:ind w:left="720" w:hanging="360"/>
+      </w:pPr>
+      <w:rPr>
+        <w:rFonts w:ascii="Symbol" w:hAnsi="Symbol" w:hint="default"/>
+        <w:sz w:val="20"/>
+      </w:rPr>
+    </w:lvl>
+    <w:lvl w:ilvl="1" w:tentative="1">
+      <w:start w:val="1"/>
+      <w:numFmt w:val="bullet"/>
+      <w:lvlText w:val="o"/>
+      <w:lvlJc w:val="left"/>
+      <w:pPr>
+        <w:tabs>
+          <w:tab w:val="num" w:pos="1440"/>
+        </w:tabs>
+        <w:ind w:left="1440" w:hanging="360"/>
+      </w:pPr>
+      <w:rPr>
+        <w:rFonts w:ascii="Courier New" w:hAnsi="Courier New" w:hint="default"/>
+        <w:sz w:val="20"/>
+      </w:rPr>
+    </w:lvl>
+    <w:lvl w:ilvl="2" w:tentative="1">
+      <w:start w:val="1"/>
+      <w:numFmt w:val="bullet"/>
+      <w:lvlText w:val=""/>
+      <w:lvlJc w:val="left"/>
+      <w:pPr>
+        <w:tabs>
+          <w:tab w:val="num" w:pos="2160"/>
+        </w:tabs>
+        <w:ind w:left="2160" w:hanging="360"/>
+      </w:pPr>
+      <w:rPr>
+        <w:rFonts w:ascii="Wingdings" w:hAnsi="Wingdings" w:hint="default"/>
+        <w:sz w:val="20"/>
+      </w:rPr>
+    </w:lvl>
+    <w:lvl w:ilvl="3" w:tentative="1">
+      <w:start w:val="1"/>
+      <w:numFmt w:val="bullet"/>
+      <w:lvlText w:val=""/>
+      <w:lvlJc w:val="left"/>
+      <w:pPr>
+        <w:tabs>
+          <w:tab w:val="num" w:pos="2880"/>
+        </w:tabs>
+        <w:ind w:left="2880" w:hanging="360"/>
+      </w:pPr>
+      <w:rPr>
+        <w:rFonts w:ascii="Wingdings" w:hAnsi="Wingdings" w:hint="default"/>
+        <w:sz w:val="20"/>
+      </w:rPr>
+    </w:lvl>
+    <w:lvl w:ilvl="4" w:tentative="1">
+      <w:start w:val="1"/>
+      <w:numFmt w:val="bullet"/>
+      <w:lvlText w:val=""/>
+      <w:lvlJc w:val="left"/>
+      <w:pPr>
+        <w:tabs>
+          <w:tab w:val="num" w:pos="3600"/>
+        </w:tabs>
+        <w:ind w:left="3600" w:hanging="360"/>
+      </w:pPr>
+      <w:rPr>
+        <w:rFonts w:ascii="Wingdings" w:hAnsi="Wingdings" w:hint="default"/>
+        <w:sz w:val="20"/>
+      </w:rPr>
+    </w:lvl>
+    <w:lvl w:ilvl="5" w:tentative="1">
+      <w:start w:val="1"/>
+      <w:numFmt w:val="bullet"/>
+      <w:lvlText w:val=""/>
+      <w:lvlJc w:val="left"/>
+      <w:pPr>
+        <w:tabs>
+          <w:tab w:val="num" w:pos="4320"/>
+        </w:tabs>
+        <w:ind w:left="4320" w:hanging="360"/>
+      </w:pPr>
+      <w:rPr>
+        <w:rFonts w:ascii="Wingdings" w:hAnsi="Wingdings" w:hint="default"/>
+        <w:sz w:val="20"/>
+      </w:rPr>
+    </w:lvl>
+    <w:lvl w:ilvl="6" w:tentative="1">
+      <w:start w:val="1"/>
+      <w:numFmt w:val="bullet"/>
+      <w:lvlText w:val=""/>
+      <w:lvlJc w:val="left"/>
+      <w:pPr>
+        <w:tabs>
+          <w:tab w:val="num" w:pos="5040"/>
+        </w:tabs>
+        <w:ind w:left="5040" w:hanging="360"/>
+      </w:pPr>
+      <w:rPr>
+        <w:rFonts w:ascii="Wingdings" w:hAnsi="Wingdings" w:hint="default"/>
+        <w:sz w:val="20"/>
+      </w:rPr>
+    </w:lvl>
+    <w:lvl w:ilvl="7" w:tentative="1">
+      <w:start w:val="1"/>
+      <w:numFmt w:val="bullet"/>
+      <w:lvlText w:val=""/>
+      <w:lvlJc w:val="left"/>
+      <w:pPr>
+        <w:tabs>
+          <w:tab w:val="num" w:pos="5760"/>
+        </w:tabs>
+        <w:ind w:left="5760" w:hanging="360"/>
+      </w:pPr>
+      <w:rPr>
+        <w:rFonts w:ascii="Wingdings" w:hAnsi="Wingdings" w:hint="default"/>
+        <w:sz w:val="20"/>
+      </w:rPr>
+    </w:lvl>
+    <w:lvl w:ilvl="8" w:tentative="1">
+      <w:start w:val="1"/>
+      <w:numFmt w:val="bullet"/>
+      <w:lvlText w:val=""/>
+      <w:lvlJc w:val="left"/>
+      <w:pPr>
+        <w:tabs>
+          <w:tab w:val="num" w:pos="6480"/>
+        </w:tabs>
+        <w:ind w:left="6480" w:hanging="360"/>
+      </w:pPr>
+      <w:rPr>
+        <w:rFonts w:ascii="Wingdings" w:hAnsi="Wingdings" w:hint="default"/>
+        <w:sz w:val="20"/>
+      </w:rPr>
+    </w:lvl>
+  </w:abstractNum>
+  <w:abstractNum w:abstractNumId="1" w15:restartNumberingAfterBreak="0">
     <w:nsid w:val="0CE56B5A"/>
     <w:multiLevelType w:val="multilevel"/>
     <w:tmpl w:val="4176A1D8"/>
@@ -7483,7 +8249,7 @@
       </w:rPr>
     </w:lvl>
   </w:abstractNum>
-  <w:abstractNum w:abstractNumId="1" w15:restartNumberingAfterBreak="0">
+  <w:abstractNum w:abstractNumId="2" w15:restartNumberingAfterBreak="0">
     <w:nsid w:val="12CF3CA6"/>
     <w:multiLevelType w:val="multilevel"/>
     <w:tmpl w:val="DFC62FEE"/>
@@ -7632,7 +8398,7 @@
       </w:rPr>
     </w:lvl>
   </w:abstractNum>
-  <w:abstractNum w:abstractNumId="2" w15:restartNumberingAfterBreak="0">
+  <w:abstractNum w:abstractNumId="3" w15:restartNumberingAfterBreak="0">
     <w:nsid w:val="132D4DA9"/>
     <w:multiLevelType w:val="multilevel"/>
     <w:tmpl w:val="36CEE480"/>
@@ -7781,7 +8547,7 @@
       </w:rPr>
     </w:lvl>
   </w:abstractNum>
-  <w:abstractNum w:abstractNumId="3" w15:restartNumberingAfterBreak="0">
+  <w:abstractNum w:abstractNumId="4" w15:restartNumberingAfterBreak="0">
     <w:nsid w:val="18A824B8"/>
     <w:multiLevelType w:val="multilevel"/>
     <w:tmpl w:val="BC5A406A"/>
@@ -7930,7 +8696,7 @@
       </w:rPr>
     </w:lvl>
   </w:abstractNum>
-  <w:abstractNum w:abstractNumId="4" w15:restartNumberingAfterBreak="0">
+  <w:abstractNum w:abstractNumId="5" w15:restartNumberingAfterBreak="0">
     <w:nsid w:val="1F733E93"/>
     <w:multiLevelType w:val="multilevel"/>
     <w:tmpl w:val="B9AA36D0"/>
@@ -8079,7 +8845,7 @@
       </w:rPr>
     </w:lvl>
   </w:abstractNum>
-  <w:abstractNum w:abstractNumId="5" w15:restartNumberingAfterBreak="0">
+  <w:abstractNum w:abstractNumId="6" w15:restartNumberingAfterBreak="0">
     <w:nsid w:val="1FE82CCD"/>
     <w:multiLevelType w:val="multilevel"/>
     <w:tmpl w:val="FB8E022E"/>
@@ -8228,7 +8994,7 @@
       </w:rPr>
     </w:lvl>
   </w:abstractNum>
-  <w:abstractNum w:abstractNumId="6" w15:restartNumberingAfterBreak="0">
+  <w:abstractNum w:abstractNumId="7" w15:restartNumberingAfterBreak="0">
     <w:nsid w:val="248075D5"/>
     <w:multiLevelType w:val="multilevel"/>
     <w:tmpl w:val="5660212C"/>
@@ -8341,7 +9107,7 @@
       </w:pPr>
     </w:lvl>
   </w:abstractNum>
-  <w:abstractNum w:abstractNumId="7" w15:restartNumberingAfterBreak="0">
+  <w:abstractNum w:abstractNumId="8" w15:restartNumberingAfterBreak="0">
     <w:nsid w:val="25624881"/>
     <w:multiLevelType w:val="multilevel"/>
     <w:tmpl w:val="93B88D3C"/>
@@ -8490,7 +9256,7 @@
       </w:rPr>
     </w:lvl>
   </w:abstractNum>
-  <w:abstractNum w:abstractNumId="8" w15:restartNumberingAfterBreak="0">
+  <w:abstractNum w:abstractNumId="9" w15:restartNumberingAfterBreak="0">
     <w:nsid w:val="35C042C1"/>
     <w:multiLevelType w:val="multilevel"/>
     <w:tmpl w:val="5E16D274"/>
@@ -8639,7 +9405,7 @@
       </w:rPr>
     </w:lvl>
   </w:abstractNum>
-  <w:abstractNum w:abstractNumId="9" w15:restartNumberingAfterBreak="0">
+  <w:abstractNum w:abstractNumId="10" w15:restartNumberingAfterBreak="0">
     <w:nsid w:val="47986512"/>
     <w:multiLevelType w:val="multilevel"/>
     <w:tmpl w:val="3B324998"/>
@@ -8788,7 +9554,7 @@
       </w:rPr>
     </w:lvl>
   </w:abstractNum>
-  <w:abstractNum w:abstractNumId="10" w15:restartNumberingAfterBreak="0">
+  <w:abstractNum w:abstractNumId="11" w15:restartNumberingAfterBreak="0">
     <w:nsid w:val="4ACC3DD2"/>
     <w:multiLevelType w:val="multilevel"/>
     <w:tmpl w:val="BF1C0F82"/>
@@ -8901,7 +9667,7 @@
       </w:pPr>
     </w:lvl>
   </w:abstractNum>
-  <w:abstractNum w:abstractNumId="11" w15:restartNumberingAfterBreak="0">
+  <w:abstractNum w:abstractNumId="12" w15:restartNumberingAfterBreak="0">
     <w:nsid w:val="4FC922AD"/>
     <w:multiLevelType w:val="multilevel"/>
     <w:tmpl w:val="0736000A"/>
@@ -9050,7 +9816,7 @@
       </w:rPr>
     </w:lvl>
   </w:abstractNum>
-  <w:abstractNum w:abstractNumId="12" w15:restartNumberingAfterBreak="0">
+  <w:abstractNum w:abstractNumId="13" w15:restartNumberingAfterBreak="0">
     <w:nsid w:val="58EF13FA"/>
     <w:multiLevelType w:val="multilevel"/>
     <w:tmpl w:val="30BACBD6"/>
@@ -9199,7 +9965,7 @@
       </w:rPr>
     </w:lvl>
   </w:abstractNum>
-  <w:abstractNum w:abstractNumId="13" w15:restartNumberingAfterBreak="0">
+  <w:abstractNum w:abstractNumId="14" w15:restartNumberingAfterBreak="0">
     <w:nsid w:val="611D58DB"/>
     <w:multiLevelType w:val="multilevel"/>
     <w:tmpl w:val="0114D14E"/>
@@ -9348,7 +10114,156 @@
       </w:rPr>
     </w:lvl>
   </w:abstractNum>
-  <w:abstractNum w:abstractNumId="14" w15:restartNumberingAfterBreak="0">
+  <w:abstractNum w:abstractNumId="15" w15:restartNumberingAfterBreak="0">
+    <w:nsid w:val="65ED7161"/>
+    <w:multiLevelType w:val="multilevel"/>
+    <w:tmpl w:val="B6BA8E04"/>
+    <w:lvl w:ilvl="0">
+      <w:start w:val="1"/>
+      <w:numFmt w:val="bullet"/>
+      <w:lvlText w:val=""/>
+      <w:lvlJc w:val="left"/>
+      <w:pPr>
+        <w:tabs>
+          <w:tab w:val="num" w:pos="720"/>
+        </w:tabs>
+        <w:ind w:left="720" w:hanging="360"/>
+      </w:pPr>
+      <w:rPr>
+        <w:rFonts w:ascii="Symbol" w:hAnsi="Symbol" w:hint="default"/>
+        <w:sz w:val="20"/>
+      </w:rPr>
+    </w:lvl>
+    <w:lvl w:ilvl="1" w:tentative="1">
+      <w:start w:val="1"/>
+      <w:numFmt w:val="bullet"/>
+      <w:lvlText w:val="o"/>
+      <w:lvlJc w:val="left"/>
+      <w:pPr>
+        <w:tabs>
+          <w:tab w:val="num" w:pos="1440"/>
+        </w:tabs>
+        <w:ind w:left="1440" w:hanging="360"/>
+      </w:pPr>
+      <w:rPr>
+        <w:rFonts w:ascii="Courier New" w:hAnsi="Courier New" w:hint="default"/>
+        <w:sz w:val="20"/>
+      </w:rPr>
+    </w:lvl>
+    <w:lvl w:ilvl="2" w:tentative="1">
+      <w:start w:val="1"/>
+      <w:numFmt w:val="bullet"/>
+      <w:lvlText w:val=""/>
+      <w:lvlJc w:val="left"/>
+      <w:pPr>
+        <w:tabs>
+          <w:tab w:val="num" w:pos="2160"/>
+        </w:tabs>
+        <w:ind w:left="2160" w:hanging="360"/>
+      </w:pPr>
+      <w:rPr>
+        <w:rFonts w:ascii="Wingdings" w:hAnsi="Wingdings" w:hint="default"/>
+        <w:sz w:val="20"/>
+      </w:rPr>
+    </w:lvl>
+    <w:lvl w:ilvl="3" w:tentative="1">
+      <w:start w:val="1"/>
+      <w:numFmt w:val="bullet"/>
+      <w:lvlText w:val=""/>
+      <w:lvlJc w:val="left"/>
+      <w:pPr>
+        <w:tabs>
+          <w:tab w:val="num" w:pos="2880"/>
+        </w:tabs>
+        <w:ind w:left="2880" w:hanging="360"/>
+      </w:pPr>
+      <w:rPr>
+        <w:rFonts w:ascii="Wingdings" w:hAnsi="Wingdings" w:hint="default"/>
+        <w:sz w:val="20"/>
+      </w:rPr>
+    </w:lvl>
+    <w:lvl w:ilvl="4" w:tentative="1">
+      <w:start w:val="1"/>
+      <w:numFmt w:val="bullet"/>
+      <w:lvlText w:val=""/>
+      <w:lvlJc w:val="left"/>
+      <w:pPr>
+        <w:tabs>
+          <w:tab w:val="num" w:pos="3600"/>
+        </w:tabs>
+        <w:ind w:left="3600" w:hanging="360"/>
+      </w:pPr>
+      <w:rPr>
+        <w:rFonts w:ascii="Wingdings" w:hAnsi="Wingdings" w:hint="default"/>
+        <w:sz w:val="20"/>
+      </w:rPr>
+    </w:lvl>
+    <w:lvl w:ilvl="5" w:tentative="1">
+      <w:start w:val="1"/>
+      <w:numFmt w:val="bullet"/>
+      <w:lvlText w:val=""/>
+      <w:lvlJc w:val="left"/>
+      <w:pPr>
+        <w:tabs>
+          <w:tab w:val="num" w:pos="4320"/>
+        </w:tabs>
+        <w:ind w:left="4320" w:hanging="360"/>
+      </w:pPr>
+      <w:rPr>
+        <w:rFonts w:ascii="Wingdings" w:hAnsi="Wingdings" w:hint="default"/>
+        <w:sz w:val="20"/>
+      </w:rPr>
+    </w:lvl>
+    <w:lvl w:ilvl="6" w:tentative="1">
+      <w:start w:val="1"/>
+      <w:numFmt w:val="bullet"/>
+      <w:lvlText w:val=""/>
+      <w:lvlJc w:val="left"/>
+      <w:pPr>
+        <w:tabs>
+          <w:tab w:val="num" w:pos="5040"/>
+        </w:tabs>
+        <w:ind w:left="5040" w:hanging="360"/>
+      </w:pPr>
+      <w:rPr>
+        <w:rFonts w:ascii="Wingdings" w:hAnsi="Wingdings" w:hint="default"/>
+        <w:sz w:val="20"/>
+      </w:rPr>
+    </w:lvl>
+    <w:lvl w:ilvl="7" w:tentative="1">
+      <w:start w:val="1"/>
+      <w:numFmt w:val="bullet"/>
+      <w:lvlText w:val=""/>
+      <w:lvlJc w:val="left"/>
+      <w:pPr>
+        <w:tabs>
+          <w:tab w:val="num" w:pos="5760"/>
+        </w:tabs>
+        <w:ind w:left="5760" w:hanging="360"/>
+      </w:pPr>
+      <w:rPr>
+        <w:rFonts w:ascii="Wingdings" w:hAnsi="Wingdings" w:hint="default"/>
+        <w:sz w:val="20"/>
+      </w:rPr>
+    </w:lvl>
+    <w:lvl w:ilvl="8" w:tentative="1">
+      <w:start w:val="1"/>
+      <w:numFmt w:val="bullet"/>
+      <w:lvlText w:val=""/>
+      <w:lvlJc w:val="left"/>
+      <w:pPr>
+        <w:tabs>
+          <w:tab w:val="num" w:pos="6480"/>
+        </w:tabs>
+        <w:ind w:left="6480" w:hanging="360"/>
+      </w:pPr>
+      <w:rPr>
+        <w:rFonts w:ascii="Wingdings" w:hAnsi="Wingdings" w:hint="default"/>
+        <w:sz w:val="20"/>
+      </w:rPr>
+    </w:lvl>
+  </w:abstractNum>
+  <w:abstractNum w:abstractNumId="16" w15:restartNumberingAfterBreak="0">
     <w:nsid w:val="67934558"/>
     <w:multiLevelType w:val="multilevel"/>
     <w:tmpl w:val="1C985DDA"/>
@@ -9497,7 +10412,7 @@
       </w:rPr>
     </w:lvl>
   </w:abstractNum>
-  <w:abstractNum w:abstractNumId="15" w15:restartNumberingAfterBreak="0">
+  <w:abstractNum w:abstractNumId="17" w15:restartNumberingAfterBreak="0">
     <w:nsid w:val="7B983EBC"/>
     <w:multiLevelType w:val="multilevel"/>
     <w:tmpl w:val="C4E8AF2A"/>
@@ -9647,52 +10562,58 @@
     </w:lvl>
   </w:abstractNum>
   <w:num w:numId="1" w16cid:durableId="378671146">
+    <w:abstractNumId w:val="2"/>
+  </w:num>
+  <w:num w:numId="2" w16cid:durableId="452795707">
+    <w:abstractNumId w:val="11"/>
+  </w:num>
+  <w:num w:numId="3" w16cid:durableId="1301157729">
+    <w:abstractNumId w:val="3"/>
+  </w:num>
+  <w:num w:numId="4" w16cid:durableId="1820027466">
+    <w:abstractNumId w:val="6"/>
+  </w:num>
+  <w:num w:numId="5" w16cid:durableId="578827232">
+    <w:abstractNumId w:val="13"/>
+  </w:num>
+  <w:num w:numId="6" w16cid:durableId="18167636">
+    <w:abstractNumId w:val="16"/>
+  </w:num>
+  <w:num w:numId="7" w16cid:durableId="13894987">
+    <w:abstractNumId w:val="12"/>
+  </w:num>
+  <w:num w:numId="8" w16cid:durableId="604582295">
     <w:abstractNumId w:val="1"/>
   </w:num>
-  <w:num w:numId="2" w16cid:durableId="452795707">
+  <w:num w:numId="9" w16cid:durableId="494686117">
+    <w:abstractNumId w:val="5"/>
+  </w:num>
+  <w:num w:numId="10" w16cid:durableId="374548868">
+    <w:abstractNumId w:val="9"/>
+  </w:num>
+  <w:num w:numId="11" w16cid:durableId="723717610">
+    <w:abstractNumId w:val="14"/>
+  </w:num>
+  <w:num w:numId="12" w16cid:durableId="919291963">
+    <w:abstractNumId w:val="17"/>
+  </w:num>
+  <w:num w:numId="13" w16cid:durableId="1768765907">
     <w:abstractNumId w:val="10"/>
   </w:num>
-  <w:num w:numId="3" w16cid:durableId="1301157729">
-    <w:abstractNumId w:val="2"/>
+  <w:num w:numId="14" w16cid:durableId="1838956718">
+    <w:abstractNumId w:val="8"/>
   </w:num>
-  <w:num w:numId="4" w16cid:durableId="1820027466">
-    <w:abstractNumId w:val="5"/>
+  <w:num w:numId="15" w16cid:durableId="1181315687">
+    <w:abstractNumId w:val="4"/>
   </w:num>
-  <w:num w:numId="5" w16cid:durableId="578827232">
-    <w:abstractNumId w:val="12"/>
+  <w:num w:numId="16" w16cid:durableId="2062437421">
+    <w:abstractNumId w:val="7"/>
   </w:num>
-  <w:num w:numId="6" w16cid:durableId="18167636">
-    <w:abstractNumId w:val="14"/>
-  </w:num>
-  <w:num w:numId="7" w16cid:durableId="13894987">
-    <w:abstractNumId w:val="11"/>
-  </w:num>
-  <w:num w:numId="8" w16cid:durableId="604582295">
+  <w:num w:numId="17" w16cid:durableId="1414662790">
     <w:abstractNumId w:val="0"/>
   </w:num>
-  <w:num w:numId="9" w16cid:durableId="494686117">
-    <w:abstractNumId w:val="4"/>
-  </w:num>
-  <w:num w:numId="10" w16cid:durableId="374548868">
-    <w:abstractNumId w:val="8"/>
-  </w:num>
-  <w:num w:numId="11" w16cid:durableId="723717610">
-    <w:abstractNumId w:val="13"/>
-  </w:num>
-  <w:num w:numId="12" w16cid:durableId="919291963">
+  <w:num w:numId="18" w16cid:durableId="1501844285">
     <w:abstractNumId w:val="15"/>
-  </w:num>
-  <w:num w:numId="13" w16cid:durableId="1768765907">
-    <w:abstractNumId w:val="9"/>
-  </w:num>
-  <w:num w:numId="14" w16cid:durableId="1838956718">
-    <w:abstractNumId w:val="7"/>
-  </w:num>
-  <w:num w:numId="15" w16cid:durableId="1181315687">
-    <w:abstractNumId w:val="3"/>
-  </w:num>
-  <w:num w:numId="16" w16cid:durableId="2062437421">
-    <w:abstractNumId w:val="6"/>
   </w:num>
 </w:numbering>
 </file>

</xml_diff>

<commit_message>
Cleanu up supporting documents
</commit_message>
<xml_diff>
--- a/Documentation/SmartTemp TCP Protocol V2.docx
+++ b/Documentation/SmartTemp TCP Protocol V2.docx
@@ -17,6 +17,7 @@
           <w14:ligatures w14:val="none"/>
         </w:rPr>
       </w:pPr>
+      <w:proofErr w:type="spellStart"/>
       <w:r>
         <w:rPr>
           <w:rFonts w:ascii="Times New Roman" w:eastAsia="Times New Roman" w:hAnsi="Times New Roman" w:cs="Times New Roman"/>
@@ -28,8 +29,9 @@
           <w:lang w:eastAsia="en-GB"/>
           <w14:ligatures w14:val="none"/>
         </w:rPr>
-        <w:t>SmartTemp TCP Protocol</w:t>
-      </w:r>
+        <w:t>SmartTemp</w:t>
+      </w:r>
+      <w:proofErr w:type="spellEnd"/>
       <w:r>
         <w:rPr>
           <w:rFonts w:ascii="Times New Roman" w:eastAsia="Times New Roman" w:hAnsi="Times New Roman" w:cs="Times New Roman"/>
@@ -41,7 +43,7 @@
           <w:lang w:eastAsia="en-GB"/>
           <w14:ligatures w14:val="none"/>
         </w:rPr>
-        <w:t xml:space="preserve"> </w:t>
+        <w:t xml:space="preserve"> TCP Protocol</w:t>
       </w:r>
       <w:r>
         <w:rPr>
@@ -54,7 +56,7 @@
           <w:lang w:eastAsia="en-GB"/>
           <w14:ligatures w14:val="none"/>
         </w:rPr>
-        <w:t>(Reverse</w:t>
+        <w:t xml:space="preserve"> </w:t>
       </w:r>
       <w:r>
         <w:rPr>
@@ -67,6 +69,19 @@
           <w:lang w:eastAsia="en-GB"/>
           <w14:ligatures w14:val="none"/>
         </w:rPr>
+        <w:t>(Reverse</w:t>
+      </w:r>
+      <w:r>
+        <w:rPr>
+          <w:rFonts w:ascii="Times New Roman" w:eastAsia="Times New Roman" w:hAnsi="Times New Roman" w:cs="Times New Roman"/>
+          <w:b/>
+          <w:bCs/>
+          <w:kern w:val="36"/>
+          <w:sz w:val="44"/>
+          <w:szCs w:val="44"/>
+          <w:lang w:eastAsia="en-GB"/>
+          <w14:ligatures w14:val="none"/>
+        </w:rPr>
         <w:noBreakHyphen/>
         <w:t>Engineered)</w:t>
       </w:r>
@@ -330,20 +345,7 @@
           <w:lang w:eastAsia="en-GB"/>
           <w14:ligatures w14:val="none"/>
         </w:rPr>
-        <w:t>: Custom, MQTT</w:t>
-      </w:r>
-      <w:r>
-        <w:rPr>
-          <w:rFonts w:ascii=".AppleSystemUIFont" w:eastAsia="Times New Roman" w:hAnsi=".AppleSystemUIFont" w:cs="Times New Roman"/>
-          <w:color w:val="0E0E0E"/>
-          <w:kern w:val="0"/>
-          <w:sz w:val="21"/>
-          <w:szCs w:val="21"/>
-          <w:lang w:eastAsia="en-GB"/>
-          <w14:ligatures w14:val="none"/>
-        </w:rPr>
-        <w:noBreakHyphen/>
-        <w:t xml:space="preserve">inspired but </w:t>
+        <w:t>:</w:t>
       </w:r>
       <w:r>
         <w:rPr>
@@ -357,48 +359,54 @@
           <w:lang w:eastAsia="en-GB"/>
           <w14:ligatures w14:val="none"/>
         </w:rPr>
-        <w:t>not MQTT</w:t>
-      </w:r>
-      <w:r>
-        <w:rPr>
-          <w:rFonts w:ascii=".AppleSystemUIFont" w:eastAsia="Times New Roman" w:hAnsi=".AppleSystemUIFont" w:cs="Times New Roman"/>
+        <w:t xml:space="preserve"> JSON based</w:t>
+      </w:r>
+    </w:p>
+    <w:p>
+      <w:pPr>
+        <w:rPr>
+          <w:rFonts w:ascii="Times New Roman" w:eastAsia="Times New Roman" w:hAnsi="Times New Roman" w:cs="Times New Roman"/>
+          <w:kern w:val="0"/>
+          <w:lang w:eastAsia="en-GB"/>
+          <w14:ligatures w14:val="none"/>
+        </w:rPr>
+      </w:pPr>
+      <w:r>
+        <w:rPr>
+          <w:rFonts w:ascii="Times New Roman" w:eastAsia="Times New Roman" w:hAnsi="Times New Roman" w:cs="Times New Roman"/>
+          <w:noProof/>
+          <w:kern w:val="0"/>
+          <w:lang w:eastAsia="en-GB"/>
+        </w:rPr>
+      </w:r>
+      <w:r>
+        <w:rPr>
+          <w:rFonts w:ascii="Times New Roman" w:eastAsia="Times New Roman" w:hAnsi="Times New Roman" w:cs="Times New Roman"/>
+          <w:noProof/>
+          <w:kern w:val="0"/>
+          <w:lang w:eastAsia="en-GB"/>
+        </w:rPr>
+        <w:pict w14:anchorId="456A7D2D">
+          <v:rect id="_x0000_i1025" alt="" style="width:451.3pt;height:.05pt;mso-width-percent:0;mso-height-percent:0;mso-width-percent:0;mso-height-percent:0" o:hralign="center" o:hrstd="t" o:hr="t" fillcolor="#a0a0a0" stroked="f"/>
+        </w:pict>
+      </w:r>
+    </w:p>
+    <w:p>
+      <w:pPr>
+        <w:spacing w:before="100" w:beforeAutospacing="1" w:after="100" w:afterAutospacing="1"/>
+        <w:outlineLvl w:val="1"/>
+        <w:rPr>
+          <w:rFonts w:ascii="Times New Roman" w:eastAsia="Times New Roman" w:hAnsi="Times New Roman" w:cs="Times New Roman"/>
           <w:b/>
           <w:bCs/>
-          <w:color w:val="0E0E0E"/>
-          <w:kern w:val="0"/>
-          <w:sz w:val="21"/>
-          <w:szCs w:val="21"/>
-          <w:lang w:eastAsia="en-GB"/>
-          <w14:ligatures w14:val="none"/>
-        </w:rPr>
-        <w:t xml:space="preserve"> – JSON based</w:t>
-      </w:r>
-    </w:p>
-    <w:p>
-      <w:pPr>
-        <w:rPr>
-          <w:rFonts w:ascii="Times New Roman" w:eastAsia="Times New Roman" w:hAnsi="Times New Roman" w:cs="Times New Roman"/>
-          <w:kern w:val="0"/>
-          <w:lang w:eastAsia="en-GB"/>
-          <w14:ligatures w14:val="none"/>
-        </w:rPr>
-      </w:pPr>
-      <w:r>
-        <w:rPr>
-          <w:rFonts w:ascii="Times New Roman" w:eastAsia="Times New Roman" w:hAnsi="Times New Roman" w:cs="Times New Roman"/>
-          <w:noProof/>
-          <w:kern w:val="0"/>
-          <w:lang w:eastAsia="en-GB"/>
-        </w:rPr>
-        <w:pict w14:anchorId="456A7D2D">
-          <v:rect id="_x0000_i1043" alt="" style="width:451.3pt;height:.05pt;mso-width-percent:0;mso-height-percent:0;mso-width-percent:0;mso-height-percent:0" o:hralign="center" o:hrstd="t" o:hr="t" fillcolor="#a0a0a0" stroked="f"/>
-        </w:pict>
-      </w:r>
-    </w:p>
-    <w:p>
-      <w:pPr>
-        <w:spacing w:before="100" w:beforeAutospacing="1" w:after="100" w:afterAutospacing="1"/>
-        <w:outlineLvl w:val="1"/>
+          <w:kern w:val="0"/>
+          <w:sz w:val="36"/>
+          <w:szCs w:val="36"/>
+          <w:lang w:eastAsia="en-GB"/>
+          <w14:ligatures w14:val="none"/>
+        </w:rPr>
+      </w:pPr>
+      <w:r>
         <w:rPr>
           <w:rFonts w:ascii="Times New Roman" w:eastAsia="Times New Roman" w:hAnsi="Times New Roman" w:cs="Times New Roman"/>
           <w:b/>
@@ -409,18 +417,6 @@
           <w:lang w:eastAsia="en-GB"/>
           <w14:ligatures w14:val="none"/>
         </w:rPr>
-      </w:pPr>
-      <w:r>
-        <w:rPr>
-          <w:rFonts w:ascii="Times New Roman" w:eastAsia="Times New Roman" w:hAnsi="Times New Roman" w:cs="Times New Roman"/>
-          <w:b/>
-          <w:bCs/>
-          <w:kern w:val="0"/>
-          <w:sz w:val="36"/>
-          <w:szCs w:val="36"/>
-          <w:lang w:eastAsia="en-GB"/>
-          <w14:ligatures w14:val="none"/>
-        </w:rPr>
         <w:t>1. Overview</w:t>
       </w:r>
     </w:p>
@@ -434,14 +430,25 @@
           <w14:ligatures w14:val="none"/>
         </w:rPr>
       </w:pPr>
-      <w:r>
-        <w:rPr>
-          <w:rFonts w:ascii="Times New Roman" w:eastAsia="Times New Roman" w:hAnsi="Times New Roman" w:cs="Times New Roman"/>
-          <w:kern w:val="0"/>
-          <w:lang w:eastAsia="en-GB"/>
-          <w14:ligatures w14:val="none"/>
-        </w:rPr>
-        <w:t xml:space="preserve">SmartTemp controllers communicate with a cloud service using a </w:t>
+      <w:proofErr w:type="spellStart"/>
+      <w:r>
+        <w:rPr>
+          <w:rFonts w:ascii="Times New Roman" w:eastAsia="Times New Roman" w:hAnsi="Times New Roman" w:cs="Times New Roman"/>
+          <w:kern w:val="0"/>
+          <w:lang w:eastAsia="en-GB"/>
+          <w14:ligatures w14:val="none"/>
+        </w:rPr>
+        <w:t>SmartTemp</w:t>
+      </w:r>
+      <w:proofErr w:type="spellEnd"/>
+      <w:r>
+        <w:rPr>
+          <w:rFonts w:ascii="Times New Roman" w:eastAsia="Times New Roman" w:hAnsi="Times New Roman" w:cs="Times New Roman"/>
+          <w:kern w:val="0"/>
+          <w:lang w:eastAsia="en-GB"/>
+          <w14:ligatures w14:val="none"/>
+        </w:rPr>
+        <w:t xml:space="preserve"> controllers communicate with a cloud service using a </w:t>
       </w:r>
       <w:r>
         <w:rPr>
@@ -764,8 +771,16 @@
           <w:kern w:val="0"/>
           <w:lang w:eastAsia="en-GB"/>
         </w:rPr>
+      </w:r>
+      <w:r>
+        <w:rPr>
+          <w:rFonts w:ascii="Times New Roman" w:eastAsia="Times New Roman" w:hAnsi="Times New Roman" w:cs="Times New Roman"/>
+          <w:noProof/>
+          <w:kern w:val="0"/>
+          <w:lang w:eastAsia="en-GB"/>
+        </w:rPr>
         <w:pict w14:anchorId="22F3C225">
-          <v:rect id="_x0000_i1042" alt="" style="width:451.3pt;height:.05pt;mso-width-percent:0;mso-height-percent:0;mso-width-percent:0;mso-height-percent:0" o:hralign="center" o:hrstd="t" o:hr="t" fillcolor="#a0a0a0" stroked="f"/>
+          <v:rect id="_x0000_i1026" alt="" style="width:451.3pt;height:.05pt;mso-width-percent:0;mso-height-percent:0;mso-width-percent:0;mso-height-percent:0" o:hralign="center" o:hrstd="t" o:hr="t" fillcolor="#a0a0a0" stroked="f"/>
         </w:pict>
       </w:r>
     </w:p>
@@ -975,8 +990,16 @@
           <w:kern w:val="0"/>
           <w:lang w:eastAsia="en-GB"/>
         </w:rPr>
+      </w:r>
+      <w:r>
+        <w:rPr>
+          <w:rFonts w:ascii="Times New Roman" w:eastAsia="Times New Roman" w:hAnsi="Times New Roman" w:cs="Times New Roman"/>
+          <w:noProof/>
+          <w:kern w:val="0"/>
+          <w:lang w:eastAsia="en-GB"/>
+        </w:rPr>
         <w:pict w14:anchorId="37FB6302">
-          <v:rect id="_x0000_i1041" alt="" style="width:451.3pt;height:.05pt;mso-width-percent:0;mso-height-percent:0;mso-width-percent:0;mso-height-percent:0" o:hralign="center" o:hrstd="t" o:hr="t" fillcolor="#a0a0a0" stroked="f"/>
+          <v:rect id="_x0000_i1027" alt="" style="width:451.3pt;height:.05pt;mso-width-percent:0;mso-height-percent:0;mso-width-percent:0;mso-height-percent:0" o:hralign="center" o:hrstd="t" o:hr="t" fillcolor="#a0a0a0" stroked="f"/>
         </w:pict>
       </w:r>
     </w:p>
@@ -1333,6 +1356,8 @@
         </w:rPr>
         <w:t xml:space="preserve">  "</w:t>
       </w:r>
+      <w:proofErr w:type="spellStart"/>
+      <w:proofErr w:type="gramStart"/>
       <w:r>
         <w:rPr>
           <w:rFonts w:ascii="Courier New" w:eastAsia="Times New Roman" w:hAnsi="Courier New" w:cs="Courier New"/>
@@ -1342,8 +1367,21 @@
           <w:lang w:eastAsia="en-GB"/>
           <w14:ligatures w14:val="none"/>
         </w:rPr>
-        <w:t>local_time</w:t>
-      </w:r>
+        <w:t>local</w:t>
+      </w:r>
+      <w:proofErr w:type="gramEnd"/>
+      <w:r>
+        <w:rPr>
+          <w:rFonts w:ascii="Courier New" w:eastAsia="Times New Roman" w:hAnsi="Courier New" w:cs="Courier New"/>
+          <w:kern w:val="0"/>
+          <w:sz w:val="20"/>
+          <w:szCs w:val="20"/>
+          <w:lang w:eastAsia="en-GB"/>
+          <w14:ligatures w14:val="none"/>
+        </w:rPr>
+        <w:t>_time</w:t>
+      </w:r>
+      <w:proofErr w:type="spellEnd"/>
       <w:r>
         <w:rPr>
           <w:rFonts w:ascii="Courier New" w:eastAsia="Times New Roman" w:hAnsi="Courier New" w:cs="Courier New"/>
@@ -1394,7 +1432,31 @@
           <w:lang w:eastAsia="en-GB"/>
           <w14:ligatures w14:val="none"/>
         </w:rPr>
-        <w:t xml:space="preserve">  "MsgID": "20251227164121",</w:t>
+        <w:t xml:space="preserve">  "</w:t>
+      </w:r>
+      <w:proofErr w:type="spellStart"/>
+      <w:r>
+        <w:rPr>
+          <w:rFonts w:ascii="Courier New" w:eastAsia="Times New Roman" w:hAnsi="Courier New" w:cs="Courier New"/>
+          <w:kern w:val="0"/>
+          <w:sz w:val="20"/>
+          <w:szCs w:val="20"/>
+          <w:lang w:eastAsia="en-GB"/>
+          <w14:ligatures w14:val="none"/>
+        </w:rPr>
+        <w:t>MsgID</w:t>
+      </w:r>
+      <w:proofErr w:type="spellEnd"/>
+      <w:r>
+        <w:rPr>
+          <w:rFonts w:ascii="Courier New" w:eastAsia="Times New Roman" w:hAnsi="Courier New" w:cs="Courier New"/>
+          <w:kern w:val="0"/>
+          <w:sz w:val="20"/>
+          <w:szCs w:val="20"/>
+          <w:lang w:eastAsia="en-GB"/>
+          <w14:ligatures w14:val="none"/>
+        </w:rPr>
+        <w:t>": "20251227164121",</w:t>
       </w:r>
     </w:p>
     <w:p>
@@ -1484,19 +1546,6 @@
         <w:spacing w:before="100" w:beforeAutospacing="1"/>
         <w:rPr>
           <w:rFonts w:ascii="Times New Roman" w:eastAsia="Times New Roman" w:hAnsi="Times New Roman" w:cs="Times New Roman"/>
-          <w:b/>
-          <w:bCs/>
-          <w:kern w:val="0"/>
-          <w:lang w:eastAsia="en-GB"/>
-          <w14:ligatures w14:val="none"/>
-        </w:rPr>
-      </w:pPr>
-    </w:p>
-    <w:p>
-      <w:pPr>
-        <w:spacing w:before="100" w:beforeAutospacing="1"/>
-        <w:rPr>
-          <w:rFonts w:ascii="Times New Roman" w:eastAsia="Times New Roman" w:hAnsi="Times New Roman" w:cs="Times New Roman"/>
           <w:kern w:val="0"/>
           <w:lang w:eastAsia="en-GB"/>
           <w14:ligatures w14:val="none"/>
@@ -1612,8 +1661,16 @@
           <w:kern w:val="0"/>
           <w:lang w:eastAsia="en-GB"/>
         </w:rPr>
+      </w:r>
+      <w:r>
+        <w:rPr>
+          <w:rFonts w:ascii="Times New Roman" w:eastAsia="Times New Roman" w:hAnsi="Times New Roman" w:cs="Times New Roman"/>
+          <w:noProof/>
+          <w:kern w:val="0"/>
+          <w:lang w:eastAsia="en-GB"/>
+        </w:rPr>
         <w:pict w14:anchorId="62F0915E">
-          <v:rect id="_x0000_i1040" alt="" style="width:451.3pt;height:.05pt;mso-width-percent:0;mso-height-percent:0;mso-width-percent:0;mso-height-percent:0" o:hralign="center" o:hrstd="t" o:hr="t" fillcolor="#a0a0a0" stroked="f"/>
+          <v:rect id="_x0000_i1028" alt="" style="width:451.3pt;height:.05pt;mso-width-percent:0;mso-height-percent:0;mso-width-percent:0;mso-height-percent:0" o:hralign="center" o:hrstd="t" o:hr="t" fillcolor="#a0a0a0" stroked="f"/>
         </w:pict>
       </w:r>
     </w:p>
@@ -1951,8 +2008,16 @@
           <w:kern w:val="0"/>
           <w:lang w:eastAsia="en-GB"/>
         </w:rPr>
+      </w:r>
+      <w:r>
+        <w:rPr>
+          <w:rFonts w:ascii="Times New Roman" w:eastAsia="Times New Roman" w:hAnsi="Times New Roman" w:cs="Times New Roman"/>
+          <w:noProof/>
+          <w:kern w:val="0"/>
+          <w:lang w:eastAsia="en-GB"/>
+        </w:rPr>
         <w:pict w14:anchorId="294C90CE">
-          <v:rect id="_x0000_i1039" alt="" style="width:451.3pt;height:.05pt;mso-width-percent:0;mso-height-percent:0;mso-width-percent:0;mso-height-percent:0" o:hralign="center" o:hrstd="t" o:hr="t" fillcolor="#a0a0a0" stroked="f"/>
+          <v:rect id="_x0000_i1029" alt="" style="width:451.3pt;height:.05pt;mso-width-percent:0;mso-height-percent:0;mso-width-percent:0;mso-height-percent:0" o:hralign="center" o:hrstd="t" o:hr="t" fillcolor="#a0a0a0" stroked="f"/>
         </w:pict>
       </w:r>
     </w:p>
@@ -2069,7 +2134,6 @@
           <w:lang w:eastAsia="en-GB"/>
           <w14:ligatures w14:val="none"/>
         </w:rPr>
-        <w:lastRenderedPageBreak/>
         <w:t>Pretty</w:t>
       </w:r>
       <w:r>
@@ -2139,6 +2203,7 @@
           <w:lang w:eastAsia="en-GB"/>
           <w14:ligatures w14:val="none"/>
         </w:rPr>
+        <w:lastRenderedPageBreak/>
         <w:t>No guaranteed delimiter between JSON objects</w:t>
       </w:r>
     </w:p>
@@ -2208,7 +2273,27 @@
           <w:lang w:eastAsia="en-GB"/>
           <w14:ligatures w14:val="none"/>
         </w:rPr>
-        <w:t>d its titled “pair_key”</w:t>
+        <w:t>d its titled “</w:t>
+      </w:r>
+      <w:proofErr w:type="spellStart"/>
+      <w:r>
+        <w:rPr>
+          <w:rFonts w:ascii="Times New Roman" w:eastAsia="Times New Roman" w:hAnsi="Times New Roman" w:cs="Times New Roman"/>
+          <w:kern w:val="0"/>
+          <w:lang w:eastAsia="en-GB"/>
+          <w14:ligatures w14:val="none"/>
+        </w:rPr>
+        <w:t>pair_key</w:t>
+      </w:r>
+      <w:proofErr w:type="spellEnd"/>
+      <w:r>
+        <w:rPr>
+          <w:rFonts w:ascii="Times New Roman" w:eastAsia="Times New Roman" w:hAnsi="Times New Roman" w:cs="Times New Roman"/>
+          <w:kern w:val="0"/>
+          <w:lang w:eastAsia="en-GB"/>
+          <w14:ligatures w14:val="none"/>
+        </w:rPr>
+        <w:t>”</w:t>
       </w:r>
     </w:p>
     <w:p>
@@ -2227,8 +2312,16 @@
           <w:kern w:val="0"/>
           <w:lang w:eastAsia="en-GB"/>
         </w:rPr>
+      </w:r>
+      <w:r>
+        <w:rPr>
+          <w:rFonts w:ascii="Times New Roman" w:eastAsia="Times New Roman" w:hAnsi="Times New Roman" w:cs="Times New Roman"/>
+          <w:noProof/>
+          <w:kern w:val="0"/>
+          <w:lang w:eastAsia="en-GB"/>
+        </w:rPr>
         <w:pict w14:anchorId="31B55F98">
-          <v:rect id="_x0000_i1038" alt="" style="width:451.3pt;height:.05pt;mso-width-percent:0;mso-height-percent:0;mso-width-percent:0;mso-height-percent:0" o:hralign="center" o:hrstd="t" o:hr="t" fillcolor="#a0a0a0" stroked="f"/>
+          <v:rect id="_x0000_i1030" alt="" style="width:451.3pt;height:.05pt;mso-width-percent:0;mso-height-percent:0;mso-width-percent:0;mso-height-percent:0" o:hralign="center" o:hrstd="t" o:hr="t" fillcolor="#a0a0a0" stroked="f"/>
         </w:pict>
       </w:r>
     </w:p>
@@ -2486,6 +2579,7 @@
                 <w14:ligatures w14:val="none"/>
               </w:rPr>
             </w:pPr>
+            <w:proofErr w:type="spellStart"/>
             <w:r>
               <w:rPr>
                 <w:rFonts w:ascii="Times New Roman" w:eastAsia="Times New Roman" w:hAnsi="Times New Roman" w:cs="Times New Roman"/>
@@ -2495,6 +2589,7 @@
               </w:rPr>
               <w:t>MsgID</w:t>
             </w:r>
+            <w:proofErr w:type="spellEnd"/>
           </w:p>
         </w:tc>
         <w:tc>
@@ -2754,6 +2849,7 @@
                 <w14:ligatures w14:val="none"/>
               </w:rPr>
             </w:pPr>
+            <w:proofErr w:type="spellStart"/>
             <w:r>
               <w:rPr>
                 <w:rFonts w:ascii="Times New Roman" w:eastAsia="Times New Roman" w:hAnsi="Times New Roman" w:cs="Times New Roman"/>
@@ -2763,6 +2859,7 @@
               </w:rPr>
               <w:t>equip_mode</w:t>
             </w:r>
+            <w:proofErr w:type="spellEnd"/>
           </w:p>
         </w:tc>
         <w:tc>
@@ -2837,8 +2934,16 @@
           <w:kern w:val="0"/>
           <w:lang w:eastAsia="en-GB"/>
         </w:rPr>
+      </w:r>
+      <w:r>
+        <w:rPr>
+          <w:rFonts w:ascii="Times New Roman" w:eastAsia="Times New Roman" w:hAnsi="Times New Roman" w:cs="Times New Roman"/>
+          <w:noProof/>
+          <w:kern w:val="0"/>
+          <w:lang w:eastAsia="en-GB"/>
+        </w:rPr>
         <w:pict w14:anchorId="069C0CEF">
-          <v:rect id="_x0000_i1037" alt="" style="width:451.3pt;height:.05pt;mso-width-percent:0;mso-height-percent:0;mso-width-percent:0;mso-height-percent:0" o:hralign="center" o:hrstd="t" o:hr="t" fillcolor="#a0a0a0" stroked="f"/>
+          <v:rect id="_x0000_i1031" alt="" style="width:451.3pt;height:.05pt;mso-width-percent:0;mso-height-percent:0;mso-width-percent:0;mso-height-percent:0" o:hralign="center" o:hrstd="t" o:hr="t" fillcolor="#a0a0a0" stroked="f"/>
         </w:pict>
       </w:r>
     </w:p>
@@ -2868,7 +2973,35 @@
           <w:lang w:eastAsia="en-GB"/>
           <w14:ligatures w14:val="none"/>
         </w:rPr>
-        <w:t>6. Operating Modes (equip_mode)</w:t>
+        <w:t>6. Operating Modes (</w:t>
+      </w:r>
+      <w:proofErr w:type="spellStart"/>
+      <w:r>
+        <w:rPr>
+          <w:rFonts w:ascii="Times New Roman" w:eastAsia="Times New Roman" w:hAnsi="Times New Roman" w:cs="Times New Roman"/>
+          <w:b/>
+          <w:bCs/>
+          <w:kern w:val="0"/>
+          <w:sz w:val="36"/>
+          <w:szCs w:val="36"/>
+          <w:lang w:eastAsia="en-GB"/>
+          <w14:ligatures w14:val="none"/>
+        </w:rPr>
+        <w:t>equip_mode</w:t>
+      </w:r>
+      <w:proofErr w:type="spellEnd"/>
+      <w:r>
+        <w:rPr>
+          <w:rFonts w:ascii="Times New Roman" w:eastAsia="Times New Roman" w:hAnsi="Times New Roman" w:cs="Times New Roman"/>
+          <w:b/>
+          <w:bCs/>
+          <w:kern w:val="0"/>
+          <w:sz w:val="36"/>
+          <w:szCs w:val="36"/>
+          <w:lang w:eastAsia="en-GB"/>
+          <w14:ligatures w14:val="none"/>
+        </w:rPr>
+        <w:t>)</w:t>
       </w:r>
     </w:p>
     <w:tbl>
@@ -3230,8 +3363,16 @@
           <w:kern w:val="0"/>
           <w:lang w:eastAsia="en-GB"/>
         </w:rPr>
+      </w:r>
+      <w:r>
+        <w:rPr>
+          <w:rFonts w:ascii="Times New Roman" w:eastAsia="Times New Roman" w:hAnsi="Times New Roman" w:cs="Times New Roman"/>
+          <w:noProof/>
+          <w:kern w:val="0"/>
+          <w:lang w:eastAsia="en-GB"/>
+        </w:rPr>
         <w:pict w14:anchorId="78EABA33">
-          <v:rect id="_x0000_i1036" alt="" style="width:451.3pt;height:.05pt;mso-width-percent:0;mso-height-percent:0;mso-width-percent:0;mso-height-percent:0" o:hralign="center" o:hrstd="t" o:hr="t" fillcolor="#a0a0a0" stroked="f"/>
+          <v:rect id="_x0000_i1032" alt="" style="width:451.3pt;height:.05pt;mso-width-percent:0;mso-height-percent:0;mso-width-percent:0;mso-height-percent:0" o:hralign="center" o:hrstd="t" o:hr="t" fillcolor="#a0a0a0" stroked="f"/>
         </w:pict>
       </w:r>
     </w:p>
@@ -3448,7 +3589,44 @@
           <w:lang w:eastAsia="en-GB"/>
           <w14:ligatures w14:val="none"/>
         </w:rPr>
-        <w:t xml:space="preserve">  "equip_mode": 4,</w:t>
+        <w:t xml:space="preserve">  "</w:t>
+      </w:r>
+      <w:proofErr w:type="spellStart"/>
+      <w:proofErr w:type="gramStart"/>
+      <w:r>
+        <w:rPr>
+          <w:rFonts w:ascii="Courier New" w:eastAsia="Times New Roman" w:hAnsi="Courier New" w:cs="Courier New"/>
+          <w:kern w:val="0"/>
+          <w:sz w:val="20"/>
+          <w:szCs w:val="20"/>
+          <w:lang w:eastAsia="en-GB"/>
+          <w14:ligatures w14:val="none"/>
+        </w:rPr>
+        <w:t>equip</w:t>
+      </w:r>
+      <w:proofErr w:type="gramEnd"/>
+      <w:r>
+        <w:rPr>
+          <w:rFonts w:ascii="Courier New" w:eastAsia="Times New Roman" w:hAnsi="Courier New" w:cs="Courier New"/>
+          <w:kern w:val="0"/>
+          <w:sz w:val="20"/>
+          <w:szCs w:val="20"/>
+          <w:lang w:eastAsia="en-GB"/>
+          <w14:ligatures w14:val="none"/>
+        </w:rPr>
+        <w:t>_mode</w:t>
+      </w:r>
+      <w:proofErr w:type="spellEnd"/>
+      <w:r>
+        <w:rPr>
+          <w:rFonts w:ascii="Courier New" w:eastAsia="Times New Roman" w:hAnsi="Courier New" w:cs="Courier New"/>
+          <w:kern w:val="0"/>
+          <w:sz w:val="20"/>
+          <w:szCs w:val="20"/>
+          <w:lang w:eastAsia="en-GB"/>
+          <w14:ligatures w14:val="none"/>
+        </w:rPr>
+        <w:t>": 4,</w:t>
       </w:r>
     </w:p>
     <w:p>
@@ -3489,7 +3667,31 @@
           <w:lang w:eastAsia="en-GB"/>
           <w14:ligatures w14:val="none"/>
         </w:rPr>
-        <w:t xml:space="preserve">  "MsgID": "20251227164121",</w:t>
+        <w:t xml:space="preserve">  "</w:t>
+      </w:r>
+      <w:proofErr w:type="spellStart"/>
+      <w:r>
+        <w:rPr>
+          <w:rFonts w:ascii="Courier New" w:eastAsia="Times New Roman" w:hAnsi="Courier New" w:cs="Courier New"/>
+          <w:kern w:val="0"/>
+          <w:sz w:val="20"/>
+          <w:szCs w:val="20"/>
+          <w:lang w:eastAsia="en-GB"/>
+          <w14:ligatures w14:val="none"/>
+        </w:rPr>
+        <w:t>MsgID</w:t>
+      </w:r>
+      <w:proofErr w:type="spellEnd"/>
+      <w:r>
+        <w:rPr>
+          <w:rFonts w:ascii="Courier New" w:eastAsia="Times New Roman" w:hAnsi="Courier New" w:cs="Courier New"/>
+          <w:kern w:val="0"/>
+          <w:sz w:val="20"/>
+          <w:szCs w:val="20"/>
+          <w:lang w:eastAsia="en-GB"/>
+          <w14:ligatures w14:val="none"/>
+        </w:rPr>
+        <w:t>": "20251227164121",</w:t>
       </w:r>
     </w:p>
     <w:p>
@@ -3643,7 +3845,6 @@
           <w:lang w:eastAsia="en-GB"/>
           <w14:ligatures w14:val="none"/>
         </w:rPr>
-        <w:lastRenderedPageBreak/>
         <w:t>{</w:t>
       </w:r>
     </w:p>
@@ -3685,7 +3886,45 @@
           <w:lang w:eastAsia="en-GB"/>
           <w14:ligatures w14:val="none"/>
         </w:rPr>
-        <w:t xml:space="preserve">  "equip_mode": 4,</w:t>
+        <w:lastRenderedPageBreak/>
+        <w:t xml:space="preserve">  "</w:t>
+      </w:r>
+      <w:proofErr w:type="spellStart"/>
+      <w:proofErr w:type="gramStart"/>
+      <w:r>
+        <w:rPr>
+          <w:rFonts w:ascii="Courier New" w:eastAsia="Times New Roman" w:hAnsi="Courier New" w:cs="Courier New"/>
+          <w:kern w:val="0"/>
+          <w:sz w:val="20"/>
+          <w:szCs w:val="20"/>
+          <w:lang w:eastAsia="en-GB"/>
+          <w14:ligatures w14:val="none"/>
+        </w:rPr>
+        <w:t>equip</w:t>
+      </w:r>
+      <w:proofErr w:type="gramEnd"/>
+      <w:r>
+        <w:rPr>
+          <w:rFonts w:ascii="Courier New" w:eastAsia="Times New Roman" w:hAnsi="Courier New" w:cs="Courier New"/>
+          <w:kern w:val="0"/>
+          <w:sz w:val="20"/>
+          <w:szCs w:val="20"/>
+          <w:lang w:eastAsia="en-GB"/>
+          <w14:ligatures w14:val="none"/>
+        </w:rPr>
+        <w:t>_mode</w:t>
+      </w:r>
+      <w:proofErr w:type="spellEnd"/>
+      <w:r>
+        <w:rPr>
+          <w:rFonts w:ascii="Courier New" w:eastAsia="Times New Roman" w:hAnsi="Courier New" w:cs="Courier New"/>
+          <w:kern w:val="0"/>
+          <w:sz w:val="20"/>
+          <w:szCs w:val="20"/>
+          <w:lang w:eastAsia="en-GB"/>
+          <w14:ligatures w14:val="none"/>
+        </w:rPr>
+        <w:t>": 4,</w:t>
       </w:r>
     </w:p>
     <w:p>
@@ -3954,14 +4193,25 @@
           <w14:ligatures w14:val="none"/>
         </w:rPr>
       </w:pPr>
-      <w:r>
-        <w:rPr>
-          <w:rFonts w:ascii="Times New Roman" w:eastAsia="Times New Roman" w:hAnsi="Times New Roman" w:cs="Times New Roman"/>
-          <w:kern w:val="0"/>
-          <w:lang w:eastAsia="en-GB"/>
-          <w14:ligatures w14:val="none"/>
-        </w:rPr>
-        <w:t>MsgID only appears in the first message</w:t>
+      <w:proofErr w:type="spellStart"/>
+      <w:r>
+        <w:rPr>
+          <w:rFonts w:ascii="Times New Roman" w:eastAsia="Times New Roman" w:hAnsi="Times New Roman" w:cs="Times New Roman"/>
+          <w:kern w:val="0"/>
+          <w:lang w:eastAsia="en-GB"/>
+          <w14:ligatures w14:val="none"/>
+        </w:rPr>
+        <w:t>MsgID</w:t>
+      </w:r>
+      <w:proofErr w:type="spellEnd"/>
+      <w:r>
+        <w:rPr>
+          <w:rFonts w:ascii="Times New Roman" w:eastAsia="Times New Roman" w:hAnsi="Times New Roman" w:cs="Times New Roman"/>
+          <w:kern w:val="0"/>
+          <w:lang w:eastAsia="en-GB"/>
+          <w14:ligatures w14:val="none"/>
+        </w:rPr>
+        <w:t xml:space="preserve"> only appears in the first message</w:t>
       </w:r>
     </w:p>
     <w:p>
@@ -3980,8 +4230,16 @@
           <w:kern w:val="0"/>
           <w:lang w:eastAsia="en-GB"/>
         </w:rPr>
+      </w:r>
+      <w:r>
+        <w:rPr>
+          <w:rFonts w:ascii="Times New Roman" w:eastAsia="Times New Roman" w:hAnsi="Times New Roman" w:cs="Times New Roman"/>
+          <w:noProof/>
+          <w:kern w:val="0"/>
+          <w:lang w:eastAsia="en-GB"/>
+        </w:rPr>
         <w:pict w14:anchorId="22C90E76">
-          <v:rect id="_x0000_i1035" alt="" style="width:451.3pt;height:.05pt;mso-width-percent:0;mso-height-percent:0;mso-width-percent:0;mso-height-percent:0" o:hralign="center" o:hrstd="t" o:hr="t" fillcolor="#a0a0a0" stroked="f"/>
+          <v:rect id="_x0000_i1033" alt="" style="width:451.3pt;height:.05pt;mso-width-percent:0;mso-height-percent:0;mso-width-percent:0;mso-height-percent:0" o:hralign="center" o:hrstd="t" o:hr="t" fillcolor="#a0a0a0" stroked="f"/>
         </w:pict>
       </w:r>
     </w:p>
@@ -4142,7 +4400,31 @@
           <w:lang w:eastAsia="en-GB"/>
           <w14:ligatures w14:val="none"/>
         </w:rPr>
-        <w:t xml:space="preserve">  "onoff": 1,</w:t>
+        <w:t xml:space="preserve">  "</w:t>
+      </w:r>
+      <w:proofErr w:type="spellStart"/>
+      <w:r>
+        <w:rPr>
+          <w:rFonts w:ascii="Courier New" w:eastAsia="Times New Roman" w:hAnsi="Courier New" w:cs="Courier New"/>
+          <w:kern w:val="0"/>
+          <w:sz w:val="20"/>
+          <w:szCs w:val="20"/>
+          <w:lang w:eastAsia="en-GB"/>
+          <w14:ligatures w14:val="none"/>
+        </w:rPr>
+        <w:t>onoff</w:t>
+      </w:r>
+      <w:proofErr w:type="spellEnd"/>
+      <w:r>
+        <w:rPr>
+          <w:rFonts w:ascii="Courier New" w:eastAsia="Times New Roman" w:hAnsi="Courier New" w:cs="Courier New"/>
+          <w:kern w:val="0"/>
+          <w:sz w:val="20"/>
+          <w:szCs w:val="20"/>
+          <w:lang w:eastAsia="en-GB"/>
+          <w14:ligatures w14:val="none"/>
+        </w:rPr>
+        <w:t>": 1,</w:t>
       </w:r>
     </w:p>
     <w:p>
@@ -4183,7 +4465,31 @@
           <w:lang w:eastAsia="en-GB"/>
           <w14:ligatures w14:val="none"/>
         </w:rPr>
-        <w:t xml:space="preserve">  "heatset": 190,</w:t>
+        <w:t xml:space="preserve">  "</w:t>
+      </w:r>
+      <w:proofErr w:type="spellStart"/>
+      <w:r>
+        <w:rPr>
+          <w:rFonts w:ascii="Courier New" w:eastAsia="Times New Roman" w:hAnsi="Courier New" w:cs="Courier New"/>
+          <w:kern w:val="0"/>
+          <w:sz w:val="20"/>
+          <w:szCs w:val="20"/>
+          <w:lang w:eastAsia="en-GB"/>
+          <w14:ligatures w14:val="none"/>
+        </w:rPr>
+        <w:t>heatset</w:t>
+      </w:r>
+      <w:proofErr w:type="spellEnd"/>
+      <w:r>
+        <w:rPr>
+          <w:rFonts w:ascii="Courier New" w:eastAsia="Times New Roman" w:hAnsi="Courier New" w:cs="Courier New"/>
+          <w:kern w:val="0"/>
+          <w:sz w:val="20"/>
+          <w:szCs w:val="20"/>
+          <w:lang w:eastAsia="en-GB"/>
+          <w14:ligatures w14:val="none"/>
+        </w:rPr>
+        <w:t>": 190,</w:t>
       </w:r>
     </w:p>
     <w:p>
@@ -4224,7 +4530,31 @@
           <w:lang w:eastAsia="en-GB"/>
           <w14:ligatures w14:val="none"/>
         </w:rPr>
-        <w:t xml:space="preserve">  "coolset": 215,</w:t>
+        <w:t xml:space="preserve">  "</w:t>
+      </w:r>
+      <w:proofErr w:type="spellStart"/>
+      <w:r>
+        <w:rPr>
+          <w:rFonts w:ascii="Courier New" w:eastAsia="Times New Roman" w:hAnsi="Courier New" w:cs="Courier New"/>
+          <w:kern w:val="0"/>
+          <w:sz w:val="20"/>
+          <w:szCs w:val="20"/>
+          <w:lang w:eastAsia="en-GB"/>
+          <w14:ligatures w14:val="none"/>
+        </w:rPr>
+        <w:t>coolset</w:t>
+      </w:r>
+      <w:proofErr w:type="spellEnd"/>
+      <w:r>
+        <w:rPr>
+          <w:rFonts w:ascii="Courier New" w:eastAsia="Times New Roman" w:hAnsi="Courier New" w:cs="Courier New"/>
+          <w:kern w:val="0"/>
+          <w:sz w:val="20"/>
+          <w:szCs w:val="20"/>
+          <w:lang w:eastAsia="en-GB"/>
+          <w14:ligatures w14:val="none"/>
+        </w:rPr>
+        <w:t>": 215,</w:t>
       </w:r>
     </w:p>
     <w:p>
@@ -4265,7 +4595,31 @@
           <w:lang w:eastAsia="en-GB"/>
           <w14:ligatures w14:val="none"/>
         </w:rPr>
-        <w:t xml:space="preserve">  "progen": 0,</w:t>
+        <w:t xml:space="preserve">  "</w:t>
+      </w:r>
+      <w:proofErr w:type="spellStart"/>
+      <w:r>
+        <w:rPr>
+          <w:rFonts w:ascii="Courier New" w:eastAsia="Times New Roman" w:hAnsi="Courier New" w:cs="Courier New"/>
+          <w:kern w:val="0"/>
+          <w:sz w:val="20"/>
+          <w:szCs w:val="20"/>
+          <w:lang w:eastAsia="en-GB"/>
+          <w14:ligatures w14:val="none"/>
+        </w:rPr>
+        <w:t>progen</w:t>
+      </w:r>
+      <w:proofErr w:type="spellEnd"/>
+      <w:r>
+        <w:rPr>
+          <w:rFonts w:ascii="Courier New" w:eastAsia="Times New Roman" w:hAnsi="Courier New" w:cs="Courier New"/>
+          <w:kern w:val="0"/>
+          <w:sz w:val="20"/>
+          <w:szCs w:val="20"/>
+          <w:lang w:eastAsia="en-GB"/>
+          <w14:ligatures w14:val="none"/>
+        </w:rPr>
+        <w:t>": 0,</w:t>
       </w:r>
     </w:p>
     <w:p>
@@ -4306,7 +4660,31 @@
           <w:lang w:eastAsia="en-GB"/>
           <w14:ligatures w14:val="none"/>
         </w:rPr>
-        <w:t xml:space="preserve">  "ovrdtime": 0,</w:t>
+        <w:t xml:space="preserve">  "</w:t>
+      </w:r>
+      <w:proofErr w:type="spellStart"/>
+      <w:r>
+        <w:rPr>
+          <w:rFonts w:ascii="Courier New" w:eastAsia="Times New Roman" w:hAnsi="Courier New" w:cs="Courier New"/>
+          <w:kern w:val="0"/>
+          <w:sz w:val="20"/>
+          <w:szCs w:val="20"/>
+          <w:lang w:eastAsia="en-GB"/>
+          <w14:ligatures w14:val="none"/>
+        </w:rPr>
+        <w:t>ovrdtime</w:t>
+      </w:r>
+      <w:proofErr w:type="spellEnd"/>
+      <w:r>
+        <w:rPr>
+          <w:rFonts w:ascii="Courier New" w:eastAsia="Times New Roman" w:hAnsi="Courier New" w:cs="Courier New"/>
+          <w:kern w:val="0"/>
+          <w:sz w:val="20"/>
+          <w:szCs w:val="20"/>
+          <w:lang w:eastAsia="en-GB"/>
+          <w14:ligatures w14:val="none"/>
+        </w:rPr>
+        <w:t>": 0,</w:t>
       </w:r>
     </w:p>
     <w:p>
@@ -4347,7 +4725,31 @@
           <w:lang w:eastAsia="en-GB"/>
           <w14:ligatures w14:val="none"/>
         </w:rPr>
-        <w:t xml:space="preserve">  "autoofftime": -1</w:t>
+        <w:t xml:space="preserve">  "</w:t>
+      </w:r>
+      <w:proofErr w:type="spellStart"/>
+      <w:r>
+        <w:rPr>
+          <w:rFonts w:ascii="Courier New" w:eastAsia="Times New Roman" w:hAnsi="Courier New" w:cs="Courier New"/>
+          <w:kern w:val="0"/>
+          <w:sz w:val="20"/>
+          <w:szCs w:val="20"/>
+          <w:lang w:eastAsia="en-GB"/>
+          <w14:ligatures w14:val="none"/>
+        </w:rPr>
+        <w:t>autoofftime</w:t>
+      </w:r>
+      <w:proofErr w:type="spellEnd"/>
+      <w:r>
+        <w:rPr>
+          <w:rFonts w:ascii="Courier New" w:eastAsia="Times New Roman" w:hAnsi="Courier New" w:cs="Courier New"/>
+          <w:kern w:val="0"/>
+          <w:sz w:val="20"/>
+          <w:szCs w:val="20"/>
+          <w:lang w:eastAsia="en-GB"/>
+          <w14:ligatures w14:val="none"/>
+        </w:rPr>
+        <w:t>": -1</w:t>
       </w:r>
     </w:p>
     <w:p>
@@ -4559,6 +4961,7 @@
                 <w14:ligatures w14:val="none"/>
               </w:rPr>
             </w:pPr>
+            <w:proofErr w:type="spellStart"/>
             <w:r>
               <w:rPr>
                 <w:rFonts w:ascii="Times New Roman" w:eastAsia="Times New Roman" w:hAnsi="Times New Roman" w:cs="Times New Roman"/>
@@ -4568,6 +4971,7 @@
               </w:rPr>
               <w:t>onoff</w:t>
             </w:r>
+            <w:proofErr w:type="spellEnd"/>
           </w:p>
         </w:tc>
         <w:tc>
@@ -4645,6 +5049,7 @@
                 <w14:ligatures w14:val="none"/>
               </w:rPr>
             </w:pPr>
+            <w:proofErr w:type="spellStart"/>
             <w:r>
               <w:rPr>
                 <w:rFonts w:ascii="Times New Roman" w:eastAsia="Times New Roman" w:hAnsi="Times New Roman" w:cs="Times New Roman"/>
@@ -4654,6 +5059,7 @@
               </w:rPr>
               <w:t>heatset</w:t>
             </w:r>
+            <w:proofErr w:type="spellEnd"/>
           </w:p>
         </w:tc>
         <w:tc>
@@ -4731,6 +5137,7 @@
                 <w14:ligatures w14:val="none"/>
               </w:rPr>
             </w:pPr>
+            <w:proofErr w:type="spellStart"/>
             <w:r>
               <w:rPr>
                 <w:rFonts w:ascii="Times New Roman" w:eastAsia="Times New Roman" w:hAnsi="Times New Roman" w:cs="Times New Roman"/>
@@ -4740,6 +5147,7 @@
               </w:rPr>
               <w:t>coolset</w:t>
             </w:r>
+            <w:proofErr w:type="spellEnd"/>
           </w:p>
         </w:tc>
         <w:tc>
@@ -4817,6 +5225,7 @@
                 <w14:ligatures w14:val="none"/>
               </w:rPr>
             </w:pPr>
+            <w:proofErr w:type="spellStart"/>
             <w:r>
               <w:rPr>
                 <w:rFonts w:ascii="Times New Roman" w:eastAsia="Times New Roman" w:hAnsi="Times New Roman" w:cs="Times New Roman"/>
@@ -4826,6 +5235,7 @@
               </w:rPr>
               <w:t>progen</w:t>
             </w:r>
+            <w:proofErr w:type="spellEnd"/>
           </w:p>
         </w:tc>
         <w:tc>
@@ -4903,6 +5313,7 @@
                 <w14:ligatures w14:val="none"/>
               </w:rPr>
             </w:pPr>
+            <w:proofErr w:type="spellStart"/>
             <w:r>
               <w:rPr>
                 <w:rFonts w:ascii="Times New Roman" w:eastAsia="Times New Roman" w:hAnsi="Times New Roman" w:cs="Times New Roman"/>
@@ -4912,6 +5323,7 @@
               </w:rPr>
               <w:t>ovrdtime</w:t>
             </w:r>
+            <w:proofErr w:type="spellEnd"/>
           </w:p>
         </w:tc>
         <w:tc>
@@ -4989,6 +5401,7 @@
                 <w14:ligatures w14:val="none"/>
               </w:rPr>
             </w:pPr>
+            <w:proofErr w:type="spellStart"/>
             <w:r>
               <w:rPr>
                 <w:rFonts w:ascii="Times New Roman" w:eastAsia="Times New Roman" w:hAnsi="Times New Roman" w:cs="Times New Roman"/>
@@ -4998,6 +5411,7 @@
               </w:rPr>
               <w:t>autoofftime</w:t>
             </w:r>
+            <w:proofErr w:type="spellEnd"/>
           </w:p>
         </w:tc>
         <w:tc>
@@ -5075,6 +5489,14 @@
           <w14:ligatures w14:val="none"/>
         </w:rPr>
       </w:pPr>
+      <w:r>
+        <w:rPr>
+          <w:rFonts w:ascii="Times New Roman" w:eastAsia="Times New Roman" w:hAnsi="Times New Roman" w:cs="Times New Roman"/>
+          <w:noProof/>
+          <w:kern w:val="0"/>
+          <w:lang w:eastAsia="en-GB"/>
+        </w:rPr>
+      </w:r>
       <w:r>
         <w:rPr>
           <w:rFonts w:ascii="Times New Roman" w:eastAsia="Times New Roman" w:hAnsi="Times New Roman" w:cs="Times New Roman"/>
@@ -5222,6 +5644,7 @@
                 <w14:ligatures w14:val="none"/>
               </w:rPr>
             </w:pPr>
+            <w:proofErr w:type="spellStart"/>
             <w:r>
               <w:rPr>
                 <w:rFonts w:ascii="Times New Roman" w:eastAsia="Times New Roman" w:hAnsi="Times New Roman" w:cs="Times New Roman"/>
@@ -5231,6 +5654,7 @@
               </w:rPr>
               <w:t>dis_sys_temp</w:t>
             </w:r>
+            <w:proofErr w:type="spellEnd"/>
           </w:p>
         </w:tc>
         <w:tc>
@@ -5281,6 +5705,7 @@
                 <w14:ligatures w14:val="none"/>
               </w:rPr>
             </w:pPr>
+            <w:proofErr w:type="spellStart"/>
             <w:r>
               <w:rPr>
                 <w:rFonts w:ascii="Times New Roman" w:eastAsia="Times New Roman" w:hAnsi="Times New Roman" w:cs="Times New Roman"/>
@@ -5290,6 +5715,7 @@
               </w:rPr>
               <w:t>dis_room_temp</w:t>
             </w:r>
+            <w:proofErr w:type="spellEnd"/>
           </w:p>
         </w:tc>
         <w:tc>
@@ -5340,6 +5766,7 @@
                 <w14:ligatures w14:val="none"/>
               </w:rPr>
             </w:pPr>
+            <w:proofErr w:type="spellStart"/>
             <w:r>
               <w:rPr>
                 <w:rFonts w:ascii="Times New Roman" w:eastAsia="Times New Roman" w:hAnsi="Times New Roman" w:cs="Times New Roman"/>
@@ -5349,6 +5776,7 @@
               </w:rPr>
               <w:t>dis_room_humi</w:t>
             </w:r>
+            <w:proofErr w:type="spellEnd"/>
           </w:p>
         </w:tc>
         <w:tc>
@@ -5399,6 +5827,7 @@
                 <w14:ligatures w14:val="none"/>
               </w:rPr>
             </w:pPr>
+            <w:proofErr w:type="spellStart"/>
             <w:r>
               <w:rPr>
                 <w:rFonts w:ascii="Times New Roman" w:eastAsia="Times New Roman" w:hAnsi="Times New Roman" w:cs="Times New Roman"/>
@@ -5408,6 +5837,7 @@
               </w:rPr>
               <w:t>fan_status</w:t>
             </w:r>
+            <w:proofErr w:type="spellEnd"/>
           </w:p>
         </w:tc>
         <w:tc>
@@ -5458,6 +5888,7 @@
                 <w14:ligatures w14:val="none"/>
               </w:rPr>
             </w:pPr>
+            <w:proofErr w:type="spellStart"/>
             <w:r>
               <w:rPr>
                 <w:rFonts w:ascii="Times New Roman" w:eastAsia="Times New Roman" w:hAnsi="Times New Roman" w:cs="Times New Roman"/>
@@ -5467,6 +5898,7 @@
               </w:rPr>
               <w:t>heat_status</w:t>
             </w:r>
+            <w:proofErr w:type="spellEnd"/>
           </w:p>
         </w:tc>
         <w:tc>
@@ -5517,6 +5949,7 @@
                 <w14:ligatures w14:val="none"/>
               </w:rPr>
             </w:pPr>
+            <w:proofErr w:type="spellStart"/>
             <w:r>
               <w:rPr>
                 <w:rFonts w:ascii="Times New Roman" w:eastAsia="Times New Roman" w:hAnsi="Times New Roman" w:cs="Times New Roman"/>
@@ -5526,6 +5959,7 @@
               </w:rPr>
               <w:t>cool_status</w:t>
             </w:r>
+            <w:proofErr w:type="spellEnd"/>
           </w:p>
         </w:tc>
         <w:tc>
@@ -5573,9 +6007,16 @@
           <w:kern w:val="0"/>
           <w:lang w:eastAsia="en-GB"/>
         </w:rPr>
-        <w:lastRenderedPageBreak/>
+      </w:r>
+      <w:r>
+        <w:rPr>
+          <w:rFonts w:ascii="Times New Roman" w:eastAsia="Times New Roman" w:hAnsi="Times New Roman" w:cs="Times New Roman"/>
+          <w:noProof/>
+          <w:kern w:val="0"/>
+          <w:lang w:eastAsia="en-GB"/>
+        </w:rPr>
         <w:pict w14:anchorId="1614BA71">
-          <v:rect id="_x0000_i1033" alt="" style="width:451.3pt;height:.05pt;mso-width-percent:0;mso-height-percent:0;mso-width-percent:0;mso-height-percent:0" o:hralign="center" o:hrstd="t" o:hr="t" fillcolor="#a0a0a0" stroked="f"/>
+          <v:rect id="_x0000_i1035" alt="" style="width:451.3pt;height:.05pt;mso-width-percent:0;mso-height-percent:0;mso-width-percent:0;mso-height-percent:0" o:hralign="center" o:hrstd="t" o:hr="t" fillcolor="#a0a0a0" stroked="f"/>
         </w:pict>
       </w:r>
     </w:p>
@@ -5605,6 +6046,7 @@
           <w:lang w:eastAsia="en-GB"/>
           <w14:ligatures w14:val="none"/>
         </w:rPr>
+        <w:lastRenderedPageBreak/>
         <w:t>10. Cloud Acknowledgements</w:t>
       </w:r>
     </w:p>
@@ -5708,7 +6150,31 @@
           <w:lang w:eastAsia="en-GB"/>
           <w14:ligatures w14:val="none"/>
         </w:rPr>
-        <w:t>{"result":"ok"}</w:t>
+        <w:t>{"</w:t>
+      </w:r>
+      <w:proofErr w:type="spellStart"/>
+      <w:r>
+        <w:rPr>
+          <w:rFonts w:ascii="Courier New" w:eastAsia="Times New Roman" w:hAnsi="Courier New" w:cs="Courier New"/>
+          <w:kern w:val="0"/>
+          <w:sz w:val="20"/>
+          <w:szCs w:val="20"/>
+          <w:lang w:eastAsia="en-GB"/>
+          <w14:ligatures w14:val="none"/>
+        </w:rPr>
+        <w:t>result":"ok</w:t>
+      </w:r>
+      <w:proofErr w:type="spellEnd"/>
+      <w:r>
+        <w:rPr>
+          <w:rFonts w:ascii="Courier New" w:eastAsia="Times New Roman" w:hAnsi="Courier New" w:cs="Courier New"/>
+          <w:kern w:val="0"/>
+          <w:sz w:val="20"/>
+          <w:szCs w:val="20"/>
+          <w:lang w:eastAsia="en-GB"/>
+          <w14:ligatures w14:val="none"/>
+        </w:rPr>
+        <w:t>"}</w:t>
       </w:r>
     </w:p>
     <w:p>
@@ -5747,8 +6213,16 @@
           <w:kern w:val="0"/>
           <w:lang w:eastAsia="en-GB"/>
         </w:rPr>
+      </w:r>
+      <w:r>
+        <w:rPr>
+          <w:rFonts w:ascii="Times New Roman" w:eastAsia="Times New Roman" w:hAnsi="Times New Roman" w:cs="Times New Roman"/>
+          <w:noProof/>
+          <w:kern w:val="0"/>
+          <w:lang w:eastAsia="en-GB"/>
+        </w:rPr>
         <w:pict w14:anchorId="0D2F955B">
-          <v:rect id="_x0000_i1032" alt="" style="width:451.3pt;height:.05pt;mso-width-percent:0;mso-height-percent:0;mso-width-percent:0;mso-height-percent:0" o:hralign="center" o:hrstd="t" o:hr="t" fillcolor="#a0a0a0" stroked="f"/>
+          <v:rect id="_x0000_i1036" alt="" style="width:451.3pt;height:.05pt;mso-width-percent:0;mso-height-percent:0;mso-width-percent:0;mso-height-percent:0" o:hralign="center" o:hrstd="t" o:hr="t" fillcolor="#a0a0a0" stroked="f"/>
         </w:pict>
       </w:r>
     </w:p>
@@ -5791,29 +6265,7 @@
           <w:lang w:eastAsia="en-GB"/>
           <w14:ligatures w14:val="none"/>
         </w:rPr>
-        <w:t>. The "Golden Handshake" (Time Sync)</w:t>
-      </w:r>
-    </w:p>
-    <w:p>
-      <w:pPr>
-        <w:spacing w:before="100" w:beforeAutospacing="1" w:after="100" w:afterAutospacing="1"/>
-        <w:rPr>
-          <w:rFonts w:ascii="Times New Roman" w:eastAsia="Times New Roman" w:hAnsi="Times New Roman" w:cs="Times New Roman"/>
-          <w:color w:val="000000"/>
-          <w:kern w:val="0"/>
-          <w:lang w:eastAsia="en-GB"/>
-          <w14:ligatures w14:val="none"/>
-        </w:rPr>
-      </w:pPr>
-      <w:r>
-        <w:rPr>
-          <w:rFonts w:ascii="Times New Roman" w:eastAsia="Times New Roman" w:hAnsi="Times New Roman" w:cs="Times New Roman"/>
-          <w:color w:val="000000"/>
-          <w:kern w:val="0"/>
-          <w:lang w:eastAsia="en-GB"/>
-          <w14:ligatures w14:val="none"/>
-        </w:rPr>
-        <w:t>The most critical part of the protocol. If the response is malformed or lacks the specific hour offset, the device enters a "fail-state" and polls every 3 seconds.</w:t>
+        <w:t>. Time Sync</w:t>
       </w:r>
     </w:p>
     <w:p>
@@ -5863,7 +6315,33 @@
           <w:lang w:eastAsia="en-GB"/>
           <w14:ligatures w14:val="none"/>
         </w:rPr>
-        <w:t>{"cmd": "time"}</w:t>
+        <w:t>{"</w:t>
+      </w:r>
+      <w:proofErr w:type="spellStart"/>
+      <w:r>
+        <w:rPr>
+          <w:rFonts w:ascii="Courier New" w:eastAsia="Times New Roman" w:hAnsi="Courier New" w:cs="Courier New"/>
+          <w:color w:val="000000"/>
+          <w:kern w:val="0"/>
+          <w:sz w:val="20"/>
+          <w:szCs w:val="20"/>
+          <w:lang w:eastAsia="en-GB"/>
+          <w14:ligatures w14:val="none"/>
+        </w:rPr>
+        <w:t>cmd</w:t>
+      </w:r>
+      <w:proofErr w:type="spellEnd"/>
+      <w:r>
+        <w:rPr>
+          <w:rFonts w:ascii="Courier New" w:eastAsia="Times New Roman" w:hAnsi="Courier New" w:cs="Courier New"/>
+          <w:color w:val="000000"/>
+          <w:kern w:val="0"/>
+          <w:sz w:val="20"/>
+          <w:szCs w:val="20"/>
+          <w:lang w:eastAsia="en-GB"/>
+          <w14:ligatures w14:val="none"/>
+        </w:rPr>
+        <w:t>": "time"}</w:t>
       </w:r>
       <w:r>
         <w:rPr>
@@ -5901,7 +6379,7 @@
           <w:lang w:eastAsia="en-GB"/>
           <w14:ligatures w14:val="none"/>
         </w:rPr>
-        <w:t>Correct Server Response:</w:t>
+        <w:t>Response:</w:t>
       </w:r>
       <w:r>
         <w:rPr>
@@ -5923,228 +6401,63 @@
           <w:lang w:eastAsia="en-GB"/>
           <w14:ligatures w14:val="none"/>
         </w:rPr>
-        <w:t>{"local_time":"YYYYMMDDHHMM","MsgID":"YYYYMMDDHHMMSS"}</w:t>
-      </w:r>
-    </w:p>
-    <w:p>
-      <w:pPr>
-        <w:numPr>
-          <w:ilvl w:val="0"/>
-          <w:numId w:val="18"/>
-        </w:numPr>
+        <w:t>{"local_time":"YYYYMMDDHHMM","</w:t>
+      </w:r>
+      <w:proofErr w:type="spellStart"/>
+      <w:r>
+        <w:rPr>
+          <w:rFonts w:ascii="Courier New" w:eastAsia="Times New Roman" w:hAnsi="Courier New" w:cs="Courier New"/>
+          <w:color w:val="000000"/>
+          <w:kern w:val="0"/>
+          <w:sz w:val="20"/>
+          <w:szCs w:val="20"/>
+          <w:lang w:eastAsia="en-GB"/>
+          <w14:ligatures w14:val="none"/>
+        </w:rPr>
+        <w:t>MsgID</w:t>
+      </w:r>
+      <w:proofErr w:type="spellEnd"/>
+      <w:r>
+        <w:rPr>
+          <w:rFonts w:ascii="Courier New" w:eastAsia="Times New Roman" w:hAnsi="Courier New" w:cs="Courier New"/>
+          <w:color w:val="000000"/>
+          <w:kern w:val="0"/>
+          <w:sz w:val="20"/>
+          <w:szCs w:val="20"/>
+          <w:lang w:eastAsia="en-GB"/>
+          <w14:ligatures w14:val="none"/>
+        </w:rPr>
+        <w:t>":"YYYYMMDDHHMMSS"}</w:t>
+      </w:r>
+    </w:p>
+    <w:p>
+      <w:pPr>
         <w:spacing w:before="100" w:beforeAutospacing="1" w:after="100" w:afterAutospacing="1"/>
-        <w:rPr>
-          <w:rFonts w:ascii="Times New Roman" w:eastAsia="Times New Roman" w:hAnsi="Times New Roman" w:cs="Times New Roman"/>
-          <w:color w:val="000000"/>
-          <w:kern w:val="0"/>
-          <w:lang w:eastAsia="en-GB"/>
-          <w14:ligatures w14:val="none"/>
-        </w:rPr>
-      </w:pPr>
-      <w:r>
+        <w:outlineLvl w:val="1"/>
         <w:rPr>
           <w:rFonts w:ascii="Times New Roman" w:eastAsia="Times New Roman" w:hAnsi="Times New Roman" w:cs="Times New Roman"/>
           <w:b/>
           <w:bCs/>
-          <w:color w:val="000000"/>
-          <w:kern w:val="0"/>
-          <w:lang w:eastAsia="en-GB"/>
-          <w14:ligatures w14:val="none"/>
-        </w:rPr>
-        <w:t>Crucial Rule:</w:t>
-      </w:r>
-      <w:r>
-        <w:rPr>
-          <w:rFonts w:ascii="Times New Roman" w:eastAsia="Times New Roman" w:hAnsi="Times New Roman" w:cs="Times New Roman"/>
-          <w:color w:val="000000"/>
-          <w:kern w:val="0"/>
-          <w:lang w:eastAsia="en-GB"/>
-          <w14:ligatures w14:val="none"/>
-        </w:rPr>
-        <w:t> </w:t>
-      </w:r>
-      <w:r>
-        <w:rPr>
-          <w:rFonts w:ascii="Courier New" w:eastAsia="Times New Roman" w:hAnsi="Courier New" w:cs="Courier New"/>
-          <w:color w:val="000000"/>
-          <w:kern w:val="0"/>
-          <w:sz w:val="20"/>
-          <w:szCs w:val="20"/>
-          <w:lang w:eastAsia="en-GB"/>
-          <w14:ligatures w14:val="none"/>
-        </w:rPr>
-        <w:t>MsgID</w:t>
-      </w:r>
-      <w:r>
-        <w:rPr>
-          <w:rFonts w:ascii="Times New Roman" w:eastAsia="Times New Roman" w:hAnsi="Times New Roman" w:cs="Times New Roman"/>
-          <w:color w:val="000000"/>
-          <w:kern w:val="0"/>
-          <w:lang w:eastAsia="en-GB"/>
-          <w14:ligatures w14:val="none"/>
-        </w:rPr>
-        <w:t> must be </w:t>
-      </w:r>
+          <w:kern w:val="0"/>
+          <w:sz w:val="36"/>
+          <w:szCs w:val="36"/>
+          <w:lang w:eastAsia="en-GB"/>
+          <w14:ligatures w14:val="none"/>
+        </w:rPr>
+      </w:pPr>
       <w:r>
         <w:rPr>
           <w:rFonts w:ascii="Times New Roman" w:eastAsia="Times New Roman" w:hAnsi="Times New Roman" w:cs="Times New Roman"/>
           <w:b/>
           <w:bCs/>
-          <w:color w:val="000000"/>
-          <w:kern w:val="0"/>
-          <w:lang w:eastAsia="en-GB"/>
-          <w14:ligatures w14:val="none"/>
-        </w:rPr>
-        <w:t>exactly 1 hour ahead</w:t>
-      </w:r>
-      <w:r>
-        <w:rPr>
-          <w:rFonts w:ascii="Times New Roman" w:eastAsia="Times New Roman" w:hAnsi="Times New Roman" w:cs="Times New Roman"/>
-          <w:color w:val="000000"/>
-          <w:kern w:val="0"/>
-          <w:lang w:eastAsia="en-GB"/>
-          <w14:ligatures w14:val="none"/>
-        </w:rPr>
-        <w:t> of </w:t>
-      </w:r>
-      <w:r>
-        <w:rPr>
-          <w:rFonts w:ascii="Courier New" w:eastAsia="Times New Roman" w:hAnsi="Courier New" w:cs="Courier New"/>
-          <w:color w:val="000000"/>
-          <w:kern w:val="0"/>
-          <w:sz w:val="20"/>
-          <w:szCs w:val="20"/>
-          <w:lang w:eastAsia="en-GB"/>
-          <w14:ligatures w14:val="none"/>
-        </w:rPr>
-        <w:t>local_time</w:t>
-      </w:r>
-      <w:r>
-        <w:rPr>
-          <w:rFonts w:ascii="Times New Roman" w:eastAsia="Times New Roman" w:hAnsi="Times New Roman" w:cs="Times New Roman"/>
-          <w:color w:val="000000"/>
-          <w:kern w:val="0"/>
-          <w:lang w:eastAsia="en-GB"/>
-          <w14:ligatures w14:val="none"/>
-        </w:rPr>
-        <w:t> (likely a legacy artifact of the original Melbourne-based cloud server's UTC/DST handling).</w:t>
-      </w:r>
-    </w:p>
-    <w:p>
-      <w:pPr>
-        <w:numPr>
-          <w:ilvl w:val="0"/>
-          <w:numId w:val="18"/>
-        </w:numPr>
-        <w:spacing w:before="100" w:beforeAutospacing="1" w:after="100" w:afterAutospacing="1"/>
-        <w:rPr>
-          <w:rFonts w:ascii="Times New Roman" w:eastAsia="Times New Roman" w:hAnsi="Times New Roman" w:cs="Times New Roman"/>
-          <w:color w:val="000000"/>
-          <w:kern w:val="0"/>
-          <w:lang w:eastAsia="en-GB"/>
-          <w14:ligatures w14:val="none"/>
-        </w:rPr>
-      </w:pPr>
-      <w:r>
-        <w:rPr>
-          <w:rFonts w:ascii="Times New Roman" w:eastAsia="Times New Roman" w:hAnsi="Times New Roman" w:cs="Times New Roman"/>
-          <w:b/>
-          <w:bCs/>
-          <w:color w:val="000000"/>
-          <w:kern w:val="0"/>
-          <w:lang w:eastAsia="en-GB"/>
-          <w14:ligatures w14:val="none"/>
-        </w:rPr>
-        <w:t>Formatting:</w:t>
-      </w:r>
-      <w:r>
-        <w:rPr>
-          <w:rFonts w:ascii="Times New Roman" w:eastAsia="Times New Roman" w:hAnsi="Times New Roman" w:cs="Times New Roman"/>
-          <w:color w:val="000000"/>
-          <w:kern w:val="0"/>
-          <w:lang w:eastAsia="en-GB"/>
-          <w14:ligatures w14:val="none"/>
-        </w:rPr>
-        <w:t> No spaces, no newlines. Use </w:t>
-      </w:r>
-      <w:r>
-        <w:rPr>
-          <w:rFonts w:ascii="Courier New" w:eastAsia="Times New Roman" w:hAnsi="Courier New" w:cs="Courier New"/>
-          <w:color w:val="000000"/>
-          <w:kern w:val="0"/>
-          <w:sz w:val="20"/>
-          <w:szCs w:val="20"/>
-          <w:lang w:eastAsia="en-GB"/>
-          <w14:ligatures w14:val="none"/>
-        </w:rPr>
-        <w:t>separators=(',', ':')</w:t>
-      </w:r>
-      <w:r>
-        <w:rPr>
-          <w:rFonts w:ascii="Times New Roman" w:eastAsia="Times New Roman" w:hAnsi="Times New Roman" w:cs="Times New Roman"/>
-          <w:color w:val="000000"/>
-          <w:kern w:val="0"/>
-          <w:lang w:eastAsia="en-GB"/>
-          <w14:ligatures w14:val="none"/>
-        </w:rPr>
-        <w:t>.</w:t>
-      </w:r>
-    </w:p>
-    <w:p>
-      <w:pPr>
-        <w:spacing w:before="100" w:beforeAutospacing="1" w:after="100" w:afterAutospacing="1"/>
-        <w:outlineLvl w:val="1"/>
-        <w:rPr>
-          <w:rFonts w:ascii="Times New Roman" w:eastAsia="Times New Roman" w:hAnsi="Times New Roman" w:cs="Times New Roman"/>
-          <w:b/>
-          <w:bCs/>
           <w:kern w:val="0"/>
           <w:sz w:val="36"/>
           <w:szCs w:val="36"/>
           <w:lang w:eastAsia="en-GB"/>
           <w14:ligatures w14:val="none"/>
         </w:rPr>
-      </w:pPr>
-    </w:p>
-    <w:p>
-      <w:pPr>
-        <w:spacing w:before="100" w:beforeAutospacing="1" w:after="100" w:afterAutospacing="1"/>
-        <w:outlineLvl w:val="1"/>
-        <w:rPr>
-          <w:rFonts w:ascii="Times New Roman" w:eastAsia="Times New Roman" w:hAnsi="Times New Roman" w:cs="Times New Roman"/>
-          <w:b/>
-          <w:bCs/>
-          <w:kern w:val="0"/>
-          <w:sz w:val="36"/>
-          <w:szCs w:val="36"/>
-          <w:lang w:eastAsia="en-GB"/>
-          <w14:ligatures w14:val="none"/>
-        </w:rPr>
-      </w:pPr>
-      <w:r>
-        <w:rPr>
-          <w:rFonts w:ascii="Times New Roman" w:eastAsia="Times New Roman" w:hAnsi="Times New Roman" w:cs="Times New Roman"/>
-          <w:b/>
-          <w:bCs/>
-          <w:kern w:val="0"/>
-          <w:sz w:val="36"/>
-          <w:szCs w:val="36"/>
-          <w:lang w:eastAsia="en-GB"/>
-          <w14:ligatures w14:val="none"/>
-        </w:rPr>
         <w:t>11. Weather Command (Observed, Optional)</w:t>
       </w:r>
-    </w:p>
-    <w:p>
-      <w:pPr>
-        <w:spacing w:before="100" w:beforeAutospacing="1" w:after="100" w:afterAutospacing="1"/>
-        <w:rPr>
-          <w:rFonts w:ascii="Times New Roman" w:eastAsia="Times New Roman" w:hAnsi="Times New Roman" w:cs="Times New Roman"/>
-          <w:kern w:val="0"/>
-          <w:lang w:eastAsia="en-GB"/>
-          <w14:ligatures w14:val="none"/>
-        </w:rPr>
-      </w:pPr>
     </w:p>
     <w:p>
       <w:pPr>
@@ -6297,7 +6610,31 @@
           <w:lang w:eastAsia="en-GB"/>
           <w14:ligatures w14:val="none"/>
         </w:rPr>
-        <w:t xml:space="preserve">  "cmd": "weather"</w:t>
+        <w:t xml:space="preserve">  "</w:t>
+      </w:r>
+      <w:proofErr w:type="spellStart"/>
+      <w:r>
+        <w:rPr>
+          <w:rFonts w:ascii="Courier New" w:eastAsia="Times New Roman" w:hAnsi="Courier New" w:cs="Courier New"/>
+          <w:kern w:val="0"/>
+          <w:sz w:val="20"/>
+          <w:szCs w:val="20"/>
+          <w:lang w:eastAsia="en-GB"/>
+          <w14:ligatures w14:val="none"/>
+        </w:rPr>
+        <w:t>cmd</w:t>
+      </w:r>
+      <w:proofErr w:type="spellEnd"/>
+      <w:r>
+        <w:rPr>
+          <w:rFonts w:ascii="Courier New" w:eastAsia="Times New Roman" w:hAnsi="Courier New" w:cs="Courier New"/>
+          <w:kern w:val="0"/>
+          <w:sz w:val="20"/>
+          <w:szCs w:val="20"/>
+          <w:lang w:eastAsia="en-GB"/>
+          <w14:ligatures w14:val="none"/>
+        </w:rPr>
+        <w:t>": "weather"</w:t>
       </w:r>
     </w:p>
     <w:p>
@@ -6344,6 +6681,7 @@
     <w:p>
       <w:pPr>
         <w:spacing w:before="100" w:beforeAutospacing="1" w:after="100" w:afterAutospacing="1"/>
+        <w:ind w:left="360"/>
         <w:rPr>
           <w:rFonts w:ascii="Times New Roman" w:eastAsia="Times New Roman" w:hAnsi="Times New Roman" w:cs="Times New Roman"/>
           <w:kern w:val="0"/>
@@ -6360,64 +6698,42 @@
           <w:lang w:eastAsia="en-GB"/>
           <w14:ligatures w14:val="none"/>
         </w:rPr>
-        <w:t>Notes</w:t>
-      </w:r>
-      <w:r>
-        <w:rPr>
-          <w:rFonts w:ascii="Times New Roman" w:eastAsia="Times New Roman" w:hAnsi="Times New Roman" w:cs="Times New Roman"/>
-          <w:kern w:val="0"/>
-          <w:lang w:eastAsia="en-GB"/>
-          <w14:ligatures w14:val="none"/>
-        </w:rPr>
-        <w:t>:</w:t>
-      </w:r>
-    </w:p>
-    <w:p>
-      <w:pPr>
-        <w:numPr>
-          <w:ilvl w:val="0"/>
-          <w:numId w:val="8"/>
-        </w:numPr>
-        <w:spacing w:before="100" w:beforeAutospacing="1" w:after="100" w:afterAutospacing="1"/>
-        <w:rPr>
-          <w:rFonts w:ascii="Times New Roman" w:eastAsia="Times New Roman" w:hAnsi="Times New Roman" w:cs="Times New Roman"/>
-          <w:kern w:val="0"/>
-          <w:lang w:eastAsia="en-GB"/>
-          <w14:ligatures w14:val="none"/>
-        </w:rPr>
-      </w:pPr>
-      <w:r>
-        <w:rPr>
-          <w:rFonts w:ascii="Times New Roman" w:eastAsia="Times New Roman" w:hAnsi="Times New Roman" w:cs="Times New Roman"/>
-          <w:kern w:val="0"/>
-          <w:lang w:eastAsia="en-GB"/>
-          <w14:ligatures w14:val="none"/>
-        </w:rPr>
-        <w:t>Not required for core operation</w:t>
-      </w:r>
-    </w:p>
-    <w:p>
-      <w:pPr>
-        <w:numPr>
-          <w:ilvl w:val="0"/>
-          <w:numId w:val="8"/>
-        </w:numPr>
-        <w:spacing w:before="100" w:beforeAutospacing="1" w:after="100" w:afterAutospacing="1"/>
-        <w:rPr>
-          <w:rFonts w:ascii="Times New Roman" w:eastAsia="Times New Roman" w:hAnsi="Times New Roman" w:cs="Times New Roman"/>
-          <w:kern w:val="0"/>
-          <w:lang w:eastAsia="en-GB"/>
-          <w14:ligatures w14:val="none"/>
-        </w:rPr>
-      </w:pPr>
-      <w:r>
-        <w:rPr>
-          <w:rFonts w:ascii="Times New Roman" w:eastAsia="Times New Roman" w:hAnsi="Times New Roman" w:cs="Times New Roman"/>
-          <w:kern w:val="0"/>
-          <w:lang w:eastAsia="en-GB"/>
-          <w14:ligatures w14:val="none"/>
-        </w:rPr>
-        <w:t>Safe to suppress in local proxy</w:t>
+        <w:t xml:space="preserve">As the server never responded to this command, other than </w:t>
+      </w:r>
+      <w:r>
+        <w:rPr>
+          <w:rFonts w:ascii="Times New Roman" w:eastAsia="Times New Roman" w:hAnsi="Times New Roman" w:cs="Times New Roman"/>
+          <w:b/>
+          <w:bCs/>
+          <w:kern w:val="0"/>
+          <w:lang w:eastAsia="en-GB"/>
+          <w14:ligatures w14:val="none"/>
+        </w:rPr>
+        <w:t xml:space="preserve">“result: ok”, this </w:t>
+      </w:r>
+      <w:proofErr w:type="spellStart"/>
+      <w:r>
+        <w:rPr>
+          <w:rFonts w:ascii="Times New Roman" w:eastAsia="Times New Roman" w:hAnsi="Times New Roman" w:cs="Times New Roman"/>
+          <w:b/>
+          <w:bCs/>
+          <w:kern w:val="0"/>
+          <w:lang w:eastAsia="en-GB"/>
+          <w14:ligatures w14:val="none"/>
+        </w:rPr>
+        <w:t>coud</w:t>
+      </w:r>
+      <w:proofErr w:type="spellEnd"/>
+      <w:r>
+        <w:rPr>
+          <w:rFonts w:ascii="Times New Roman" w:eastAsia="Times New Roman" w:hAnsi="Times New Roman" w:cs="Times New Roman"/>
+          <w:b/>
+          <w:bCs/>
+          <w:kern w:val="0"/>
+          <w:lang w:eastAsia="en-GB"/>
+          <w14:ligatures w14:val="none"/>
+        </w:rPr>
+        <w:t xml:space="preserve"> not be implemented</w:t>
       </w:r>
     </w:p>
     <w:p>
@@ -6436,8 +6752,16 @@
           <w:kern w:val="0"/>
           <w:lang w:eastAsia="en-GB"/>
         </w:rPr>
+      </w:r>
+      <w:r>
+        <w:rPr>
+          <w:rFonts w:ascii="Times New Roman" w:eastAsia="Times New Roman" w:hAnsi="Times New Roman" w:cs="Times New Roman"/>
+          <w:noProof/>
+          <w:kern w:val="0"/>
+          <w:lang w:eastAsia="en-GB"/>
+        </w:rPr>
         <w:pict w14:anchorId="456E2CCC">
-          <v:rect id="_x0000_i1031" alt="" style="width:451.3pt;height:.05pt;mso-width-percent:0;mso-height-percent:0;mso-width-percent:0;mso-height-percent:0" o:hralign="center" o:hrstd="t" o:hr="t" fillcolor="#a0a0a0" stroked="f"/>
+          <v:rect id="_x0000_i1037" alt="" style="width:451.3pt;height:.05pt;mso-width-percent:0;mso-height-percent:0;mso-width-percent:0;mso-height-percent:0" o:hralign="center" o:hrstd="t" o:hr="t" fillcolor="#a0a0a0" stroked="f"/>
         </w:pict>
       </w:r>
     </w:p>
@@ -6491,7 +6815,6 @@
           <w:lang w:eastAsia="en-GB"/>
           <w14:ligatures w14:val="none"/>
         </w:rPr>
-        <w:lastRenderedPageBreak/>
         <w:t>❌</w:t>
       </w:r>
       <w:r>
@@ -6721,17 +7044,6 @@
           <w14:ligatures w14:val="none"/>
         </w:rPr>
       </w:pPr>
-      <w:r>
-        <w:rPr>
-          <w:rFonts w:ascii="Times New Roman" w:eastAsia="Times New Roman" w:hAnsi="Times New Roman" w:cs="Times New Roman"/>
-          <w:noProof/>
-          <w:kern w:val="0"/>
-          <w:lang w:eastAsia="en-GB"/>
-        </w:rPr>
-        <w:pict w14:anchorId="631F7BA6">
-          <v:rect id="_x0000_i1030" alt="" style="width:451.3pt;height:.05pt;mso-width-percent:0;mso-height-percent:0;mso-width-percent:0;mso-height-percent:0" o:hralign="center" o:hrstd="t" o:hr="t" fillcolor="#a0a0a0" stroked="f"/>
-        </w:pict>
-      </w:r>
     </w:p>
     <w:p>
       <w:pPr>
@@ -6759,151 +7071,9 @@
           <w:lang w:eastAsia="en-GB"/>
           <w14:ligatures w14:val="none"/>
         </w:rPr>
-        <w:t>13. Implications for Home Assistant Integration</w:t>
-      </w:r>
-    </w:p>
-    <w:p>
-      <w:pPr>
-        <w:numPr>
-          <w:ilvl w:val="0"/>
-          <w:numId w:val="10"/>
-        </w:numPr>
-        <w:spacing w:before="100" w:beforeAutospacing="1" w:after="100" w:afterAutospacing="1"/>
-        <w:rPr>
-          <w:rFonts w:ascii="Times New Roman" w:eastAsia="Times New Roman" w:hAnsi="Times New Roman" w:cs="Times New Roman"/>
-          <w:kern w:val="0"/>
-          <w:lang w:eastAsia="en-GB"/>
-          <w14:ligatures w14:val="none"/>
-        </w:rPr>
-      </w:pPr>
-      <w:r>
-        <w:rPr>
-          <w:rFonts w:ascii="Times New Roman" w:eastAsia="Times New Roman" w:hAnsi="Times New Roman" w:cs="Times New Roman"/>
-          <w:kern w:val="0"/>
-          <w:lang w:eastAsia="en-GB"/>
-          <w14:ligatures w14:val="none"/>
-        </w:rPr>
-        <w:t>Local proxy can fully replace cloud</w:t>
-      </w:r>
-    </w:p>
-    <w:p>
-      <w:pPr>
-        <w:numPr>
-          <w:ilvl w:val="0"/>
-          <w:numId w:val="10"/>
-        </w:numPr>
-        <w:spacing w:before="100" w:beforeAutospacing="1" w:after="100" w:afterAutospacing="1"/>
-        <w:rPr>
-          <w:rFonts w:ascii="Times New Roman" w:eastAsia="Times New Roman" w:hAnsi="Times New Roman" w:cs="Times New Roman"/>
-          <w:kern w:val="0"/>
-          <w:lang w:eastAsia="en-GB"/>
-          <w14:ligatures w14:val="none"/>
-        </w:rPr>
-      </w:pPr>
-      <w:r>
-        <w:rPr>
-          <w:rFonts w:ascii="Times New Roman" w:eastAsia="Times New Roman" w:hAnsi="Times New Roman" w:cs="Times New Roman"/>
-          <w:kern w:val="0"/>
-          <w:lang w:eastAsia="en-GB"/>
-          <w14:ligatures w14:val="none"/>
-        </w:rPr>
-        <w:t>Commands can be injected safely</w:t>
-      </w:r>
-    </w:p>
-    <w:p>
-      <w:pPr>
-        <w:numPr>
-          <w:ilvl w:val="0"/>
-          <w:numId w:val="10"/>
-        </w:numPr>
-        <w:spacing w:before="100" w:beforeAutospacing="1" w:after="100" w:afterAutospacing="1"/>
-        <w:rPr>
-          <w:rFonts w:ascii="Times New Roman" w:eastAsia="Times New Roman" w:hAnsi="Times New Roman" w:cs="Times New Roman"/>
-          <w:kern w:val="0"/>
-          <w:lang w:eastAsia="en-GB"/>
-          <w14:ligatures w14:val="none"/>
-        </w:rPr>
-      </w:pPr>
-      <w:r>
-        <w:rPr>
-          <w:rFonts w:ascii="Times New Roman" w:eastAsia="Times New Roman" w:hAnsi="Times New Roman" w:cs="Times New Roman"/>
-          <w:kern w:val="0"/>
-          <w:lang w:eastAsia="en-GB"/>
-          <w14:ligatures w14:val="none"/>
-        </w:rPr>
-        <w:t>One HA entity per system + per zone</w:t>
-      </w:r>
-    </w:p>
-    <w:p>
-      <w:pPr>
-        <w:numPr>
-          <w:ilvl w:val="0"/>
-          <w:numId w:val="10"/>
-        </w:numPr>
-        <w:spacing w:before="100" w:beforeAutospacing="1" w:after="100" w:afterAutospacing="1"/>
-        <w:rPr>
-          <w:rFonts w:ascii="Times New Roman" w:eastAsia="Times New Roman" w:hAnsi="Times New Roman" w:cs="Times New Roman"/>
-          <w:kern w:val="0"/>
-          <w:lang w:eastAsia="en-GB"/>
-          <w14:ligatures w14:val="none"/>
-        </w:rPr>
-      </w:pPr>
-      <w:r>
-        <w:rPr>
-          <w:rFonts w:ascii="Times New Roman" w:eastAsia="Times New Roman" w:hAnsi="Times New Roman" w:cs="Times New Roman"/>
-          <w:kern w:val="0"/>
-          <w:lang w:eastAsia="en-GB"/>
-          <w14:ligatures w14:val="none"/>
-        </w:rPr>
-        <w:t>State model is fully observable</w:t>
-      </w:r>
-    </w:p>
-    <w:p>
-      <w:pPr>
-        <w:rPr>
-          <w:rFonts w:ascii="Times New Roman" w:eastAsia="Times New Roman" w:hAnsi="Times New Roman" w:cs="Times New Roman"/>
-          <w:kern w:val="0"/>
-          <w:lang w:eastAsia="en-GB"/>
-          <w14:ligatures w14:val="none"/>
-        </w:rPr>
-      </w:pPr>
-      <w:r>
-        <w:rPr>
-          <w:rFonts w:ascii="Times New Roman" w:eastAsia="Times New Roman" w:hAnsi="Times New Roman" w:cs="Times New Roman"/>
-          <w:noProof/>
-          <w:kern w:val="0"/>
-          <w:lang w:eastAsia="en-GB"/>
-        </w:rPr>
-        <w:pict w14:anchorId="17D9AFB8">
-          <v:rect id="_x0000_i1029" alt="" style="width:451.3pt;height:.05pt;mso-width-percent:0;mso-height-percent:0;mso-width-percent:0;mso-height-percent:0" o:hralign="center" o:hrstd="t" o:hr="t" fillcolor="#a0a0a0" stroked="f"/>
-        </w:pict>
-      </w:r>
-    </w:p>
-    <w:p>
-      <w:pPr>
-        <w:rPr>
-          <w:rFonts w:ascii="Times New Roman" w:eastAsia="Times New Roman" w:hAnsi="Times New Roman" w:cs="Times New Roman"/>
-          <w:kern w:val="0"/>
-          <w:lang w:eastAsia="en-GB"/>
-          <w14:ligatures w14:val="none"/>
-        </w:rPr>
-      </w:pPr>
-      <w:r>
-        <w:rPr>
-          <w:rFonts w:ascii="Times New Roman" w:eastAsia="Times New Roman" w:hAnsi="Times New Roman" w:cs="Times New Roman"/>
-          <w:noProof/>
-          <w:kern w:val="0"/>
-          <w:lang w:eastAsia="en-GB"/>
-        </w:rPr>
-        <w:pict w14:anchorId="4A1313C4">
-          <v:rect id="_x0000_i1028" alt="" style="width:451.3pt;height:.05pt;mso-width-percent:0;mso-height-percent:0;mso-width-percent:0;mso-height-percent:0" o:hralign="center" o:hrstd="t" o:hr="t" fillcolor="#a0a0a0" stroked="f"/>
-        </w:pict>
-      </w:r>
-    </w:p>
-    <w:p>
-      <w:pPr>
-        <w:spacing w:before="100" w:beforeAutospacing="1" w:after="100" w:afterAutospacing="1"/>
-        <w:outlineLvl w:val="1"/>
+        <w:t>P</w:t>
+      </w:r>
+      <w:r>
         <w:rPr>
           <w:rFonts w:ascii="Times New Roman" w:eastAsia="Times New Roman" w:hAnsi="Times New Roman" w:cs="Times New Roman"/>
           <w:b/>
@@ -6914,752 +7084,7 @@
           <w:lang w:eastAsia="en-GB"/>
           <w14:ligatures w14:val="none"/>
         </w:rPr>
-      </w:pPr>
-      <w:r>
-        <w:rPr>
-          <w:rFonts w:ascii="Times New Roman" w:eastAsia="Times New Roman" w:hAnsi="Times New Roman" w:cs="Times New Roman"/>
-          <w:b/>
-          <w:bCs/>
-          <w:kern w:val="0"/>
-          <w:sz w:val="36"/>
-          <w:szCs w:val="36"/>
-          <w:lang w:eastAsia="en-GB"/>
-          <w14:ligatures w14:val="none"/>
-        </w:rPr>
-        <w:t>Appendix A – Captured Startup Traces (Reference)</w:t>
-      </w:r>
-    </w:p>
-    <w:p>
-      <w:pPr>
-        <w:spacing w:before="100" w:beforeAutospacing="1" w:after="100" w:afterAutospacing="1"/>
-        <w:rPr>
-          <w:rFonts w:ascii="Times New Roman" w:eastAsia="Times New Roman" w:hAnsi="Times New Roman" w:cs="Times New Roman"/>
-          <w:kern w:val="0"/>
-          <w:lang w:eastAsia="en-GB"/>
-          <w14:ligatures w14:val="none"/>
-        </w:rPr>
-      </w:pPr>
-    </w:p>
-    <w:p>
-      <w:pPr>
-        <w:spacing w:before="100" w:beforeAutospacing="1" w:after="100" w:afterAutospacing="1"/>
-        <w:rPr>
-          <w:rFonts w:ascii="Times New Roman" w:eastAsia="Times New Roman" w:hAnsi="Times New Roman" w:cs="Times New Roman"/>
-          <w:kern w:val="0"/>
-          <w:lang w:eastAsia="en-GB"/>
-          <w14:ligatures w14:val="none"/>
-        </w:rPr>
-      </w:pPr>
-      <w:r>
-        <w:rPr>
-          <w:rFonts w:ascii="Times New Roman" w:eastAsia="Times New Roman" w:hAnsi="Times New Roman" w:cs="Times New Roman"/>
-          <w:kern w:val="0"/>
-          <w:lang w:eastAsia="en-GB"/>
-          <w14:ligatures w14:val="none"/>
-        </w:rPr>
-        <w:t>This appendix summarises two full startup/state traces captured via the local TCP proxy. These traces serve as the canonical reference for protocol behaviour and schema validation.</w:t>
-      </w:r>
-    </w:p>
-    <w:p>
-      <w:pPr>
-        <w:spacing w:before="100" w:beforeAutospacing="1" w:after="100" w:afterAutospacing="1"/>
-        <w:outlineLvl w:val="2"/>
-        <w:rPr>
-          <w:rFonts w:ascii="Times New Roman" w:eastAsia="Times New Roman" w:hAnsi="Times New Roman" w:cs="Times New Roman"/>
-          <w:b/>
-          <w:bCs/>
-          <w:kern w:val="0"/>
-          <w:sz w:val="27"/>
-          <w:szCs w:val="27"/>
-          <w:lang w:eastAsia="en-GB"/>
-          <w14:ligatures w14:val="none"/>
-        </w:rPr>
-      </w:pPr>
-      <w:r>
-        <w:rPr>
-          <w:rFonts w:ascii="Times New Roman" w:eastAsia="Times New Roman" w:hAnsi="Times New Roman" w:cs="Times New Roman"/>
-          <w:b/>
-          <w:bCs/>
-          <w:kern w:val="0"/>
-          <w:sz w:val="27"/>
-          <w:szCs w:val="27"/>
-          <w:lang w:eastAsia="en-GB"/>
-          <w14:ligatures w14:val="none"/>
-        </w:rPr>
-        <w:t>A.1 Lounge Controller (Multi-zone)</w:t>
-      </w:r>
-    </w:p>
-    <w:p>
-      <w:pPr>
-        <w:spacing w:before="100" w:beforeAutospacing="1" w:after="100" w:afterAutospacing="1"/>
-        <w:rPr>
-          <w:rFonts w:ascii="Times New Roman" w:eastAsia="Times New Roman" w:hAnsi="Times New Roman" w:cs="Times New Roman"/>
-          <w:kern w:val="0"/>
-          <w:lang w:eastAsia="en-GB"/>
-          <w14:ligatures w14:val="none"/>
-        </w:rPr>
-      </w:pPr>
-      <w:r>
-        <w:rPr>
-          <w:rFonts w:ascii="Times New Roman" w:eastAsia="Times New Roman" w:hAnsi="Times New Roman" w:cs="Times New Roman"/>
-          <w:b/>
-          <w:bCs/>
-          <w:kern w:val="0"/>
-          <w:lang w:eastAsia="en-GB"/>
-          <w14:ligatures w14:val="none"/>
-        </w:rPr>
-        <w:t>Characteristics</w:t>
-      </w:r>
-    </w:p>
-    <w:p>
-      <w:pPr>
-        <w:numPr>
-          <w:ilvl w:val="0"/>
-          <w:numId w:val="12"/>
-        </w:numPr>
-        <w:spacing w:before="100" w:beforeAutospacing="1" w:after="100" w:afterAutospacing="1"/>
-        <w:rPr>
-          <w:rFonts w:ascii="Times New Roman" w:eastAsia="Times New Roman" w:hAnsi="Times New Roman" w:cs="Times New Roman"/>
-          <w:kern w:val="0"/>
-          <w:lang w:eastAsia="en-GB"/>
-          <w14:ligatures w14:val="none"/>
-        </w:rPr>
-      </w:pPr>
-      <w:r>
-        <w:rPr>
-          <w:rFonts w:ascii="Times New Roman" w:eastAsia="Times New Roman" w:hAnsi="Times New Roman" w:cs="Times New Roman"/>
-          <w:kern w:val="0"/>
-          <w:lang w:eastAsia="en-GB"/>
-          <w14:ligatures w14:val="none"/>
-        </w:rPr>
-        <w:t>zone_no = 2</w:t>
-      </w:r>
-    </w:p>
-    <w:p>
-      <w:pPr>
-        <w:numPr>
-          <w:ilvl w:val="0"/>
-          <w:numId w:val="12"/>
-        </w:numPr>
-        <w:spacing w:before="100" w:beforeAutospacing="1" w:after="100" w:afterAutospacing="1"/>
-        <w:rPr>
-          <w:rFonts w:ascii="Times New Roman" w:eastAsia="Times New Roman" w:hAnsi="Times New Roman" w:cs="Times New Roman"/>
-          <w:kern w:val="0"/>
-          <w:lang w:eastAsia="en-GB"/>
-          <w14:ligatures w14:val="none"/>
-        </w:rPr>
-      </w:pPr>
-      <w:r>
-        <w:rPr>
-          <w:rFonts w:ascii="Times New Roman" w:eastAsia="Times New Roman" w:hAnsi="Times New Roman" w:cs="Times New Roman"/>
-          <w:kern w:val="0"/>
-          <w:lang w:eastAsia="en-GB"/>
-          <w14:ligatures w14:val="none"/>
-        </w:rPr>
-        <w:t>Explicit zone1 and zone2 objects present</w:t>
-      </w:r>
-    </w:p>
-    <w:p>
-      <w:pPr>
-        <w:numPr>
-          <w:ilvl w:val="0"/>
-          <w:numId w:val="12"/>
-        </w:numPr>
-        <w:spacing w:before="100" w:beforeAutospacing="1" w:after="100" w:afterAutospacing="1"/>
-        <w:rPr>
-          <w:rFonts w:ascii="Times New Roman" w:eastAsia="Times New Roman" w:hAnsi="Times New Roman" w:cs="Times New Roman"/>
-          <w:kern w:val="0"/>
-          <w:lang w:eastAsia="en-GB"/>
-          <w14:ligatures w14:val="none"/>
-        </w:rPr>
-      </w:pPr>
-      <w:r>
-        <w:rPr>
-          <w:rFonts w:ascii="Times New Roman" w:eastAsia="Times New Roman" w:hAnsi="Times New Roman" w:cs="Times New Roman"/>
-          <w:kern w:val="0"/>
-          <w:lang w:eastAsia="en-GB"/>
-          <w14:ligatures w14:val="none"/>
-        </w:rPr>
-        <w:t>zone*_name fields populated</w:t>
-      </w:r>
-    </w:p>
-    <w:p>
-      <w:pPr>
-        <w:numPr>
-          <w:ilvl w:val="0"/>
-          <w:numId w:val="12"/>
-        </w:numPr>
-        <w:spacing w:before="100" w:beforeAutospacing="1" w:after="100" w:afterAutospacing="1"/>
-        <w:rPr>
-          <w:rFonts w:ascii="Times New Roman" w:eastAsia="Times New Roman" w:hAnsi="Times New Roman" w:cs="Times New Roman"/>
-          <w:kern w:val="0"/>
-          <w:lang w:eastAsia="en-GB"/>
-          <w14:ligatures w14:val="none"/>
-        </w:rPr>
-      </w:pPr>
-      <w:r>
-        <w:rPr>
-          <w:rFonts w:ascii="Times New Roman" w:eastAsia="Times New Roman" w:hAnsi="Times New Roman" w:cs="Times New Roman"/>
-          <w:kern w:val="0"/>
-          <w:lang w:eastAsia="en-GB"/>
-          <w14:ligatures w14:val="none"/>
-        </w:rPr>
-        <w:t>dis_zone_temp array length = number of zones</w:t>
-      </w:r>
-    </w:p>
-    <w:p>
-      <w:pPr>
-        <w:numPr>
-          <w:ilvl w:val="0"/>
-          <w:numId w:val="12"/>
-        </w:numPr>
-        <w:spacing w:before="100" w:beforeAutospacing="1" w:after="100" w:afterAutospacing="1"/>
-        <w:rPr>
-          <w:rFonts w:ascii="Times New Roman" w:eastAsia="Times New Roman" w:hAnsi="Times New Roman" w:cs="Times New Roman"/>
-          <w:kern w:val="0"/>
-          <w:lang w:eastAsia="en-GB"/>
-          <w14:ligatures w14:val="none"/>
-        </w:rPr>
-      </w:pPr>
-      <w:r>
-        <w:rPr>
-          <w:rFonts w:ascii="Times New Roman" w:eastAsia="Times New Roman" w:hAnsi="Times New Roman" w:cs="Times New Roman"/>
-          <w:kern w:val="0"/>
-          <w:lang w:eastAsia="en-GB"/>
-          <w14:ligatures w14:val="none"/>
-        </w:rPr>
-        <w:t>zone*_schedule objects present</w:t>
-      </w:r>
-    </w:p>
-    <w:p>
-      <w:pPr>
-        <w:spacing w:before="100" w:beforeAutospacing="1" w:after="100" w:afterAutospacing="1"/>
-        <w:rPr>
-          <w:rFonts w:ascii="Times New Roman" w:eastAsia="Times New Roman" w:hAnsi="Times New Roman" w:cs="Times New Roman"/>
-          <w:kern w:val="0"/>
-          <w:lang w:eastAsia="en-GB"/>
-          <w14:ligatures w14:val="none"/>
-        </w:rPr>
-      </w:pPr>
-      <w:r>
-        <w:rPr>
-          <w:rFonts w:ascii="Times New Roman" w:eastAsia="Times New Roman" w:hAnsi="Times New Roman" w:cs="Times New Roman"/>
-          <w:b/>
-          <w:bCs/>
-          <w:kern w:val="0"/>
-          <w:lang w:eastAsia="en-GB"/>
-          <w14:ligatures w14:val="none"/>
-        </w:rPr>
-        <w:t>Notable fields</w:t>
-      </w:r>
-    </w:p>
-    <w:p>
-      <w:pPr>
-        <w:numPr>
-          <w:ilvl w:val="0"/>
-          <w:numId w:val="13"/>
-        </w:numPr>
-        <w:spacing w:before="100" w:beforeAutospacing="1" w:after="100" w:afterAutospacing="1"/>
-        <w:rPr>
-          <w:rFonts w:ascii="Times New Roman" w:eastAsia="Times New Roman" w:hAnsi="Times New Roman" w:cs="Times New Roman"/>
-          <w:kern w:val="0"/>
-          <w:lang w:eastAsia="en-GB"/>
-          <w14:ligatures w14:val="none"/>
-        </w:rPr>
-      </w:pPr>
-      <w:r>
-        <w:rPr>
-          <w:rFonts w:ascii="Times New Roman" w:eastAsia="Times New Roman" w:hAnsi="Times New Roman" w:cs="Times New Roman"/>
-          <w:kern w:val="0"/>
-          <w:lang w:eastAsia="en-GB"/>
-          <w14:ligatures w14:val="none"/>
-        </w:rPr>
-        <w:t>zone_type = 2 (multi-zone controller)</w:t>
-      </w:r>
-    </w:p>
-    <w:p>
-      <w:pPr>
-        <w:numPr>
-          <w:ilvl w:val="0"/>
-          <w:numId w:val="13"/>
-        </w:numPr>
-        <w:spacing w:before="100" w:beforeAutospacing="1" w:after="100" w:afterAutospacing="1"/>
-        <w:rPr>
-          <w:rFonts w:ascii="Times New Roman" w:eastAsia="Times New Roman" w:hAnsi="Times New Roman" w:cs="Times New Roman"/>
-          <w:kern w:val="0"/>
-          <w:lang w:eastAsia="en-GB"/>
-          <w14:ligatures w14:val="none"/>
-        </w:rPr>
-      </w:pPr>
-      <w:r>
-        <w:rPr>
-          <w:rFonts w:ascii="Times New Roman" w:eastAsia="Times New Roman" w:hAnsi="Times New Roman" w:cs="Times New Roman"/>
-          <w:kern w:val="0"/>
-          <w:lang w:eastAsia="en-GB"/>
-          <w14:ligatures w14:val="none"/>
-        </w:rPr>
-        <w:t>zone1_sen = 1, zone2_sen = 2 (sensor mapping)</w:t>
-      </w:r>
-    </w:p>
-    <w:p>
-      <w:pPr>
-        <w:numPr>
-          <w:ilvl w:val="0"/>
-          <w:numId w:val="13"/>
-        </w:numPr>
-        <w:spacing w:before="100" w:beforeAutospacing="1" w:after="100" w:afterAutospacing="1"/>
-        <w:rPr>
-          <w:rFonts w:ascii="Times New Roman" w:eastAsia="Times New Roman" w:hAnsi="Times New Roman" w:cs="Times New Roman"/>
-          <w:kern w:val="0"/>
-          <w:lang w:eastAsia="en-GB"/>
-          <w14:ligatures w14:val="none"/>
-        </w:rPr>
-      </w:pPr>
-      <w:r>
-        <w:rPr>
-          <w:rFonts w:ascii="Times New Roman" w:eastAsia="Times New Roman" w:hAnsi="Times New Roman" w:cs="Times New Roman"/>
-          <w:kern w:val="0"/>
-          <w:lang w:eastAsia="en-GB"/>
-          <w14:ligatures w14:val="none"/>
-        </w:rPr>
-        <w:t>dis_room_temp and dis_room_humi arrays indexed by sensor</w:t>
-      </w:r>
-    </w:p>
-    <w:p>
-      <w:pPr>
-        <w:numPr>
-          <w:ilvl w:val="0"/>
-          <w:numId w:val="13"/>
-        </w:numPr>
-        <w:spacing w:before="100" w:beforeAutospacing="1" w:after="100" w:afterAutospacing="1"/>
-        <w:rPr>
-          <w:rFonts w:ascii="Times New Roman" w:eastAsia="Times New Roman" w:hAnsi="Times New Roman" w:cs="Times New Roman"/>
-          <w:kern w:val="0"/>
-          <w:lang w:eastAsia="en-GB"/>
-          <w14:ligatures w14:val="none"/>
-        </w:rPr>
-      </w:pPr>
-      <w:r>
-        <w:rPr>
-          <w:rFonts w:ascii="Times New Roman" w:eastAsia="Times New Roman" w:hAnsi="Times New Roman" w:cs="Times New Roman"/>
-          <w:kern w:val="0"/>
-          <w:lang w:eastAsia="en-GB"/>
-          <w14:ligatures w14:val="none"/>
-        </w:rPr>
-        <w:t>Full weekly schedules transmitted for each zone</w:t>
-      </w:r>
-    </w:p>
-    <w:p>
-      <w:pPr>
-        <w:spacing w:before="100" w:beforeAutospacing="1" w:after="100" w:afterAutospacing="1"/>
-        <w:rPr>
-          <w:rFonts w:ascii="Times New Roman" w:eastAsia="Times New Roman" w:hAnsi="Times New Roman" w:cs="Times New Roman"/>
-          <w:kern w:val="0"/>
-          <w:lang w:eastAsia="en-GB"/>
-          <w14:ligatures w14:val="none"/>
-        </w:rPr>
-      </w:pPr>
-      <w:r>
-        <w:rPr>
-          <w:rFonts w:ascii="Times New Roman" w:eastAsia="Times New Roman" w:hAnsi="Times New Roman" w:cs="Times New Roman"/>
-          <w:b/>
-          <w:bCs/>
-          <w:kern w:val="0"/>
-          <w:lang w:eastAsia="en-GB"/>
-          <w14:ligatures w14:val="none"/>
-        </w:rPr>
-        <w:t>Conclusion</w:t>
-      </w:r>
-    </w:p>
-    <w:p>
-      <w:pPr>
-        <w:spacing w:before="100" w:beforeAutospacing="1" w:after="100" w:afterAutospacing="1"/>
-        <w:rPr>
-          <w:rFonts w:ascii="Times New Roman" w:eastAsia="Times New Roman" w:hAnsi="Times New Roman" w:cs="Times New Roman"/>
-          <w:kern w:val="0"/>
-          <w:lang w:eastAsia="en-GB"/>
-          <w14:ligatures w14:val="none"/>
-        </w:rPr>
-      </w:pPr>
-      <w:r>
-        <w:rPr>
-          <w:rFonts w:ascii="Times New Roman" w:eastAsia="Times New Roman" w:hAnsi="Times New Roman" w:cs="Times New Roman"/>
-          <w:kern w:val="0"/>
-          <w:lang w:eastAsia="en-GB"/>
-          <w14:ligatures w14:val="none"/>
-        </w:rPr>
-        <w:t xml:space="preserve">The lounge controller acts as the </w:t>
-      </w:r>
-      <w:r>
-        <w:rPr>
-          <w:rFonts w:ascii="Times New Roman" w:eastAsia="Times New Roman" w:hAnsi="Times New Roman" w:cs="Times New Roman"/>
-          <w:i/>
-          <w:iCs/>
-          <w:kern w:val="0"/>
-          <w:lang w:eastAsia="en-GB"/>
-          <w14:ligatures w14:val="none"/>
-        </w:rPr>
-        <w:t>superset schema</w:t>
-      </w:r>
-      <w:r>
-        <w:rPr>
-          <w:rFonts w:ascii="Times New Roman" w:eastAsia="Times New Roman" w:hAnsi="Times New Roman" w:cs="Times New Roman"/>
-          <w:kern w:val="0"/>
-          <w:lang w:eastAsia="en-GB"/>
-          <w14:ligatures w14:val="none"/>
-        </w:rPr>
-        <w:t xml:space="preserve"> and should be treated as the authoritative reference when designing integrations.</w:t>
-      </w:r>
-    </w:p>
-    <w:p>
-      <w:pPr>
-        <w:rPr>
-          <w:rFonts w:ascii="Times New Roman" w:eastAsia="Times New Roman" w:hAnsi="Times New Roman" w:cs="Times New Roman"/>
-          <w:kern w:val="0"/>
-          <w:lang w:eastAsia="en-GB"/>
-          <w14:ligatures w14:val="none"/>
-        </w:rPr>
-      </w:pPr>
-      <w:r>
-        <w:rPr>
-          <w:rFonts w:ascii="Times New Roman" w:eastAsia="Times New Roman" w:hAnsi="Times New Roman" w:cs="Times New Roman"/>
-          <w:noProof/>
-          <w:kern w:val="0"/>
-          <w:lang w:eastAsia="en-GB"/>
-        </w:rPr>
-        <w:lastRenderedPageBreak/>
-        <w:pict w14:anchorId="57351A35">
-          <v:rect id="_x0000_i1027" alt="" style="width:451.3pt;height:.05pt;mso-width-percent:0;mso-height-percent:0;mso-width-percent:0;mso-height-percent:0" o:hralign="center" o:hrstd="t" o:hr="t" fillcolor="#a0a0a0" stroked="f"/>
-        </w:pict>
-      </w:r>
-    </w:p>
-    <w:p>
-      <w:pPr>
-        <w:spacing w:before="100" w:beforeAutospacing="1" w:after="100" w:afterAutospacing="1"/>
-        <w:outlineLvl w:val="2"/>
-        <w:rPr>
-          <w:rFonts w:ascii="Times New Roman" w:eastAsia="Times New Roman" w:hAnsi="Times New Roman" w:cs="Times New Roman"/>
-          <w:b/>
-          <w:bCs/>
-          <w:kern w:val="0"/>
-          <w:sz w:val="27"/>
-          <w:szCs w:val="27"/>
-          <w:lang w:eastAsia="en-GB"/>
-          <w14:ligatures w14:val="none"/>
-        </w:rPr>
-      </w:pPr>
-      <w:r>
-        <w:rPr>
-          <w:rFonts w:ascii="Times New Roman" w:eastAsia="Times New Roman" w:hAnsi="Times New Roman" w:cs="Times New Roman"/>
-          <w:b/>
-          <w:bCs/>
-          <w:kern w:val="0"/>
-          <w:sz w:val="27"/>
-          <w:szCs w:val="27"/>
-          <w:lang w:eastAsia="en-GB"/>
-          <w14:ligatures w14:val="none"/>
-        </w:rPr>
-        <w:t>A.2 Guest Controller (Single-zone)</w:t>
-      </w:r>
-    </w:p>
-    <w:p>
-      <w:pPr>
-        <w:spacing w:before="100" w:beforeAutospacing="1" w:after="100" w:afterAutospacing="1"/>
-        <w:rPr>
-          <w:rFonts w:ascii="Times New Roman" w:eastAsia="Times New Roman" w:hAnsi="Times New Roman" w:cs="Times New Roman"/>
-          <w:kern w:val="0"/>
-          <w:lang w:eastAsia="en-GB"/>
-          <w14:ligatures w14:val="none"/>
-        </w:rPr>
-      </w:pPr>
-      <w:r>
-        <w:rPr>
-          <w:rFonts w:ascii="Times New Roman" w:eastAsia="Times New Roman" w:hAnsi="Times New Roman" w:cs="Times New Roman"/>
-          <w:b/>
-          <w:bCs/>
-          <w:kern w:val="0"/>
-          <w:lang w:eastAsia="en-GB"/>
-          <w14:ligatures w14:val="none"/>
-        </w:rPr>
-        <w:t>Characteristics</w:t>
-      </w:r>
-    </w:p>
-    <w:p>
-      <w:pPr>
-        <w:numPr>
-          <w:ilvl w:val="0"/>
-          <w:numId w:val="14"/>
-        </w:numPr>
-        <w:spacing w:before="100" w:beforeAutospacing="1" w:after="100" w:afterAutospacing="1"/>
-        <w:rPr>
-          <w:rFonts w:ascii="Times New Roman" w:eastAsia="Times New Roman" w:hAnsi="Times New Roman" w:cs="Times New Roman"/>
-          <w:kern w:val="0"/>
-          <w:lang w:eastAsia="en-GB"/>
-          <w14:ligatures w14:val="none"/>
-        </w:rPr>
-      </w:pPr>
-      <w:r>
-        <w:rPr>
-          <w:rFonts w:ascii="Times New Roman" w:eastAsia="Times New Roman" w:hAnsi="Times New Roman" w:cs="Times New Roman"/>
-          <w:kern w:val="0"/>
-          <w:lang w:eastAsia="en-GB"/>
-          <w14:ligatures w14:val="none"/>
-        </w:rPr>
-        <w:t>zone_no = 0</w:t>
-      </w:r>
-    </w:p>
-    <w:p>
-      <w:pPr>
-        <w:numPr>
-          <w:ilvl w:val="0"/>
-          <w:numId w:val="14"/>
-        </w:numPr>
-        <w:spacing w:before="100" w:beforeAutospacing="1" w:after="100" w:afterAutospacing="1"/>
-        <w:rPr>
-          <w:rFonts w:ascii="Times New Roman" w:eastAsia="Times New Roman" w:hAnsi="Times New Roman" w:cs="Times New Roman"/>
-          <w:kern w:val="0"/>
-          <w:lang w:eastAsia="en-GB"/>
-          <w14:ligatures w14:val="none"/>
-        </w:rPr>
-      </w:pPr>
-      <w:r>
-        <w:rPr>
-          <w:rFonts w:ascii="Times New Roman" w:eastAsia="Times New Roman" w:hAnsi="Times New Roman" w:cs="Times New Roman"/>
-          <w:kern w:val="0"/>
-          <w:lang w:eastAsia="en-GB"/>
-          <w14:ligatures w14:val="none"/>
-        </w:rPr>
-        <w:t>No zone*_name fields</w:t>
-      </w:r>
-    </w:p>
-    <w:p>
-      <w:pPr>
-        <w:numPr>
-          <w:ilvl w:val="0"/>
-          <w:numId w:val="14"/>
-        </w:numPr>
-        <w:spacing w:before="100" w:beforeAutospacing="1" w:after="100" w:afterAutospacing="1"/>
-        <w:rPr>
-          <w:rFonts w:ascii="Times New Roman" w:eastAsia="Times New Roman" w:hAnsi="Times New Roman" w:cs="Times New Roman"/>
-          <w:kern w:val="0"/>
-          <w:lang w:eastAsia="en-GB"/>
-          <w14:ligatures w14:val="none"/>
-        </w:rPr>
-      </w:pPr>
-      <w:r>
-        <w:rPr>
-          <w:rFonts w:ascii="Times New Roman" w:eastAsia="Times New Roman" w:hAnsi="Times New Roman" w:cs="Times New Roman"/>
-          <w:kern w:val="0"/>
-          <w:lang w:eastAsia="en-GB"/>
-          <w14:ligatures w14:val="none"/>
-        </w:rPr>
-        <w:t>No zone*_schedule objects</w:t>
-      </w:r>
-    </w:p>
-    <w:p>
-      <w:pPr>
-        <w:numPr>
-          <w:ilvl w:val="0"/>
-          <w:numId w:val="14"/>
-        </w:numPr>
-        <w:spacing w:before="100" w:beforeAutospacing="1" w:after="100" w:afterAutospacing="1"/>
-        <w:rPr>
-          <w:rFonts w:ascii="Times New Roman" w:eastAsia="Times New Roman" w:hAnsi="Times New Roman" w:cs="Times New Roman"/>
-          <w:kern w:val="0"/>
-          <w:lang w:eastAsia="en-GB"/>
-          <w14:ligatures w14:val="none"/>
-        </w:rPr>
-      </w:pPr>
-      <w:r>
-        <w:rPr>
-          <w:rFonts w:ascii="Times New Roman" w:eastAsia="Times New Roman" w:hAnsi="Times New Roman" w:cs="Times New Roman"/>
-          <w:kern w:val="0"/>
-          <w:lang w:eastAsia="en-GB"/>
-          <w14:ligatures w14:val="none"/>
-        </w:rPr>
-        <w:t>dis_zone_temp empty or omitted</w:t>
-      </w:r>
-    </w:p>
-    <w:p>
-      <w:pPr>
-        <w:spacing w:before="100" w:beforeAutospacing="1" w:after="100" w:afterAutospacing="1"/>
-        <w:rPr>
-          <w:rFonts w:ascii="Times New Roman" w:eastAsia="Times New Roman" w:hAnsi="Times New Roman" w:cs="Times New Roman"/>
-          <w:kern w:val="0"/>
-          <w:lang w:eastAsia="en-GB"/>
-          <w14:ligatures w14:val="none"/>
-        </w:rPr>
-      </w:pPr>
-      <w:r>
-        <w:rPr>
-          <w:rFonts w:ascii="Times New Roman" w:eastAsia="Times New Roman" w:hAnsi="Times New Roman" w:cs="Times New Roman"/>
-          <w:b/>
-          <w:bCs/>
-          <w:kern w:val="0"/>
-          <w:lang w:eastAsia="en-GB"/>
-          <w14:ligatures w14:val="none"/>
-        </w:rPr>
-        <w:t>Notable fields</w:t>
-      </w:r>
-    </w:p>
-    <w:p>
-      <w:pPr>
-        <w:numPr>
-          <w:ilvl w:val="0"/>
-          <w:numId w:val="15"/>
-        </w:numPr>
-        <w:spacing w:before="100" w:beforeAutospacing="1" w:after="100" w:afterAutospacing="1"/>
-        <w:rPr>
-          <w:rFonts w:ascii="Times New Roman" w:eastAsia="Times New Roman" w:hAnsi="Times New Roman" w:cs="Times New Roman"/>
-          <w:kern w:val="0"/>
-          <w:lang w:eastAsia="en-GB"/>
-          <w14:ligatures w14:val="none"/>
-        </w:rPr>
-      </w:pPr>
-      <w:r>
-        <w:rPr>
-          <w:rFonts w:ascii="Times New Roman" w:eastAsia="Times New Roman" w:hAnsi="Times New Roman" w:cs="Times New Roman"/>
-          <w:kern w:val="0"/>
-          <w:lang w:eastAsia="en-GB"/>
-          <w14:ligatures w14:val="none"/>
-        </w:rPr>
-        <w:t>System-level fields (equip_mode, fan_mode, temperatures) still present</w:t>
-      </w:r>
-    </w:p>
-    <w:p>
-      <w:pPr>
-        <w:numPr>
-          <w:ilvl w:val="0"/>
-          <w:numId w:val="15"/>
-        </w:numPr>
-        <w:spacing w:before="100" w:beforeAutospacing="1" w:after="100" w:afterAutospacing="1"/>
-        <w:rPr>
-          <w:rFonts w:ascii="Times New Roman" w:eastAsia="Times New Roman" w:hAnsi="Times New Roman" w:cs="Times New Roman"/>
-          <w:kern w:val="0"/>
-          <w:lang w:eastAsia="en-GB"/>
-          <w14:ligatures w14:val="none"/>
-        </w:rPr>
-      </w:pPr>
-      <w:r>
-        <w:rPr>
-          <w:rFonts w:ascii="Times New Roman" w:eastAsia="Times New Roman" w:hAnsi="Times New Roman" w:cs="Times New Roman"/>
-          <w:kern w:val="0"/>
-          <w:lang w:eastAsia="en-GB"/>
-          <w14:ligatures w14:val="none"/>
-        </w:rPr>
-        <w:t>Zone-specific command payloads are ignored unless zone_no &gt; 0</w:t>
-      </w:r>
-    </w:p>
-    <w:p>
-      <w:pPr>
-        <w:spacing w:before="100" w:beforeAutospacing="1" w:after="100" w:afterAutospacing="1"/>
-        <w:rPr>
-          <w:rFonts w:ascii="Times New Roman" w:eastAsia="Times New Roman" w:hAnsi="Times New Roman" w:cs="Times New Roman"/>
-          <w:kern w:val="0"/>
-          <w:lang w:eastAsia="en-GB"/>
-          <w14:ligatures w14:val="none"/>
-        </w:rPr>
-      </w:pPr>
-      <w:r>
-        <w:rPr>
-          <w:rFonts w:ascii="Times New Roman" w:eastAsia="Times New Roman" w:hAnsi="Times New Roman" w:cs="Times New Roman"/>
-          <w:b/>
-          <w:bCs/>
-          <w:kern w:val="0"/>
-          <w:lang w:eastAsia="en-GB"/>
-          <w14:ligatures w14:val="none"/>
-        </w:rPr>
-        <w:t>Conclusion</w:t>
-      </w:r>
-    </w:p>
-    <w:p>
-      <w:pPr>
-        <w:spacing w:before="100" w:beforeAutospacing="1" w:after="100" w:afterAutospacing="1"/>
-        <w:rPr>
-          <w:rFonts w:ascii="Times New Roman" w:eastAsia="Times New Roman" w:hAnsi="Times New Roman" w:cs="Times New Roman"/>
-          <w:kern w:val="0"/>
-          <w:lang w:eastAsia="en-GB"/>
-          <w14:ligatures w14:val="none"/>
-        </w:rPr>
-      </w:pPr>
-      <w:r>
-        <w:rPr>
-          <w:rFonts w:ascii="Times New Roman" w:eastAsia="Times New Roman" w:hAnsi="Times New Roman" w:cs="Times New Roman"/>
-          <w:kern w:val="0"/>
-          <w:lang w:eastAsia="en-GB"/>
-          <w14:ligatures w14:val="none"/>
-        </w:rPr>
-        <w:t xml:space="preserve">Single-zone controllers implement a </w:t>
-      </w:r>
-      <w:r>
-        <w:rPr>
-          <w:rFonts w:ascii="Times New Roman" w:eastAsia="Times New Roman" w:hAnsi="Times New Roman" w:cs="Times New Roman"/>
-          <w:i/>
-          <w:iCs/>
-          <w:kern w:val="0"/>
-          <w:lang w:eastAsia="en-GB"/>
-          <w14:ligatures w14:val="none"/>
-        </w:rPr>
-        <w:t>strict subset</w:t>
-      </w:r>
-      <w:r>
-        <w:rPr>
-          <w:rFonts w:ascii="Times New Roman" w:eastAsia="Times New Roman" w:hAnsi="Times New Roman" w:cs="Times New Roman"/>
-          <w:kern w:val="0"/>
-          <w:lang w:eastAsia="en-GB"/>
-          <w14:ligatures w14:val="none"/>
-        </w:rPr>
-        <w:t xml:space="preserve"> of the multi-zone schema. Client implementations must treat all zone objects as optional.</w:t>
-      </w:r>
-    </w:p>
-    <w:p>
-      <w:pPr>
-        <w:rPr>
-          <w:rFonts w:ascii="Times New Roman" w:eastAsia="Times New Roman" w:hAnsi="Times New Roman" w:cs="Times New Roman"/>
-          <w:kern w:val="0"/>
-          <w:lang w:eastAsia="en-GB"/>
-          <w14:ligatures w14:val="none"/>
-        </w:rPr>
-      </w:pPr>
-      <w:r>
-        <w:rPr>
-          <w:rFonts w:ascii="Times New Roman" w:eastAsia="Times New Roman" w:hAnsi="Times New Roman" w:cs="Times New Roman"/>
-          <w:noProof/>
-          <w:kern w:val="0"/>
-          <w:lang w:eastAsia="en-GB"/>
-        </w:rPr>
-        <w:pict w14:anchorId="71DED138">
-          <v:rect id="_x0000_i1026" alt="" style="width:451.3pt;height:.05pt;mso-width-percent:0;mso-height-percent:0;mso-width-percent:0;mso-height-percent:0" o:hralign="center" o:hrstd="t" o:hr="t" fillcolor="#a0a0a0" stroked="f"/>
-        </w:pict>
-      </w:r>
-    </w:p>
-    <w:p>
-      <w:pPr>
-        <w:spacing w:before="100" w:beforeAutospacing="1" w:after="100" w:afterAutospacing="1"/>
-        <w:outlineLvl w:val="1"/>
-        <w:rPr>
-          <w:rFonts w:ascii="Times New Roman" w:eastAsia="Times New Roman" w:hAnsi="Times New Roman" w:cs="Times New Roman"/>
-          <w:b/>
-          <w:bCs/>
-          <w:kern w:val="0"/>
-          <w:sz w:val="36"/>
-          <w:szCs w:val="36"/>
-          <w:lang w:eastAsia="en-GB"/>
-          <w14:ligatures w14:val="none"/>
-        </w:rPr>
-      </w:pPr>
-      <w:r>
-        <w:rPr>
-          <w:rFonts w:ascii="Times New Roman" w:eastAsia="Times New Roman" w:hAnsi="Times New Roman" w:cs="Times New Roman"/>
-          <w:b/>
-          <w:bCs/>
-          <w:kern w:val="0"/>
-          <w:sz w:val="36"/>
-          <w:szCs w:val="36"/>
-          <w:lang w:eastAsia="en-GB"/>
-          <w14:ligatures w14:val="none"/>
-        </w:rPr>
-        <w:t>Protocol Design Rules Derived from Traces</w:t>
+        <w:t>rotocol Design Rules Derived from Traces</w:t>
       </w:r>
     </w:p>
     <w:p>
@@ -7706,7 +7131,28 @@
           <w:lang w:eastAsia="en-GB"/>
           <w14:ligatures w14:val="none"/>
         </w:rPr>
-        <w:t>Clients must dynamically adapt to zone_no and presence/absence of fields.</w:t>
+        <w:lastRenderedPageBreak/>
+        <w:t xml:space="preserve">Clients must dynamically adapt to </w:t>
+      </w:r>
+      <w:proofErr w:type="spellStart"/>
+      <w:r>
+        <w:rPr>
+          <w:rFonts w:ascii="Times New Roman" w:eastAsia="Times New Roman" w:hAnsi="Times New Roman" w:cs="Times New Roman"/>
+          <w:kern w:val="0"/>
+          <w:lang w:eastAsia="en-GB"/>
+          <w14:ligatures w14:val="none"/>
+        </w:rPr>
+        <w:t>zone_no</w:t>
+      </w:r>
+      <w:proofErr w:type="spellEnd"/>
+      <w:r>
+        <w:rPr>
+          <w:rFonts w:ascii="Times New Roman" w:eastAsia="Times New Roman" w:hAnsi="Times New Roman" w:cs="Times New Roman"/>
+          <w:kern w:val="0"/>
+          <w:lang w:eastAsia="en-GB"/>
+          <w14:ligatures w14:val="none"/>
+        </w:rPr>
+        <w:t xml:space="preserve"> and presence/absence of fields.</w:t>
       </w:r>
     </w:p>
     <w:p>
@@ -7913,8 +7359,16 @@
           <w:kern w:val="0"/>
           <w:lang w:eastAsia="en-GB"/>
         </w:rPr>
+      </w:r>
+      <w:r>
+        <w:rPr>
+          <w:rFonts w:ascii="Times New Roman" w:eastAsia="Times New Roman" w:hAnsi="Times New Roman" w:cs="Times New Roman"/>
+          <w:noProof/>
+          <w:kern w:val="0"/>
+          <w:lang w:eastAsia="en-GB"/>
+        </w:rPr>
         <w:pict w14:anchorId="4ED4A631">
-          <v:rect id="_x0000_i1025" alt="" style="width:451.3pt;height:.05pt;mso-width-percent:0;mso-height-percent:0;mso-width-percent:0;mso-height-percent:0" o:hralign="center" o:hrstd="t" o:hr="t" fillcolor="#a0a0a0" stroked="f"/>
+          <v:rect id="_x0000_i1043" alt="" style="width:451.3pt;height:.05pt;mso-width-percent:0;mso-height-percent:0;mso-width-percent:0;mso-height-percent:0" o:hralign="center" o:hrstd="t" o:hr="t" fillcolor="#a0a0a0" stroked="f"/>
         </w:pict>
       </w:r>
     </w:p>

</xml_diff>